<commit_message>
Detail internship journal with first-person narrative and verified examples
</commit_message>
<xml_diff>
--- a/apps/nutrition-app/docs/staj_defteri/OpenNutri_Staj_Defteri_30_Gun.docx
+++ b/apps/nutrition-app/docs/staj_defteri/OpenNutri_Staj_Defteri_30_Gun.docx
@@ -1052,7 +1052,7 @@
           <w:sz w:val="21"/>
           <w:lang w:val="tr-TR"/>
         </w:rPr>
-        <w:t>Gün numaraları, kaynak kod ve teknik kayıtlardan oluşturulmuş önerilen anlatım sırasıdır; çalışma tarihini veya kişisel katkıyı kanıtlamaz. Öğrenci, gerçek günleri ve kendi katkısını doğrulamalı; inceleme, entegrasyon ve geliştirme ayrımını buna göre düzeltmelidir. Teknik metin yapay zekâ desteğiyle taslaklaştırılmıştır. Tarih, kurum, kişisel bilgiler ve imzalar uydurulmamıştır.</w:t>
+        <w:t>Birinci tekil şahısla yazılan günlükler, öğrenci tarafından doğrulanacak anlatım önerileridir. Yapılan işi açıklayan kod ve testler, o işi öğrencinin yaptığını veya belirtilen sırada çalıştığını tek başına kanıtlamaz. Öğrenci, geliştirme, entegrasyon, test ve inceleme ifadelerini gerçek katkısına göre düzeltmeli; tarihleri doğrulamalıdır. Sayısal örnekler kodu açıklayan kontrollü verilerdir. Metin yapay zekâ desteğiyle hazırlanmış; kurum bilgileri ve imzalar boş bırakılmıştır.</w:t>
       </w:r>
     </w:p>
     <w:p>
@@ -1142,7 +1142,7 @@
           <w:sz w:val="24"/>
           <w:lang w:val="tr-TR"/>
         </w:rPr>
-        <w:t>İlk çalışma başlığında, günlük beslenme kayıtlarını kolaylaştıran bir mobil uygulamanın ihtiyaçları ele alındı. Kullanıcının tükettiği besinleri tek tek araması ve her kayıt için uzun formlar doldurması, kullanım süresini artıran bir sorun olarak değerlendirildi. OpenNutri uygulamasında temel amaç; besinleri arayarak veya sesle kaydetmek, günlük toplamları görmek ve yanlış kayıtları kolayca düzeltebilmek olarak belirlendi. Tasarımın yalnızca ilk kayıt işlemini değil, daha sonra yapılacak kontrol ve düzenlemeyi de kapsaması gerektiği üzerinde duruldu.</w:t>
+        <w:t>Bugün OpenNutri mobil uygulamasının çözmek istediği problemi ve temel kullanım akışını ele aldım. Beslenme günlüğü tutan bir kişinin aynı öğündeki besinleri ayrı ayrı araması, miktar girmesi ve her adımı onaylaması gerektiğinde kayıt işlemi uzuyor. Bu nedenle çalışmanın merkezine, besini hızlı kaydetme ve yanlış kaydı sonradan kolayca düzeltme ihtiyacını koydum. Uygulamanın yalnızca kalori gösteren bir ekran değil, günlük kullanımı sürdürülebilir kılan bir araç olmasını hedefledim.</w:t>
       </w:r>
     </w:p>
     <w:p>
@@ -1159,7 +1159,7 @@
           <w:sz w:val="24"/>
           <w:lang w:val="tr-TR"/>
         </w:rPr>
-        <w:t>Gereksinimler; besin arama, porsiyon seçimi, öğün günlüğü, besin ögesi raporu ve kişisel hedefler şeklinde ayrıldı. Sesli kayıt, ana ekran araç takımı ve kişiselleştirilmiş öneriler bu temel akışı tamamlayan özellikler olarak ele alındı. Yapay zekânın besin adını anlamak için kullanılmasına karşılık, kaydedilen besin değerlerinin mevcut veri servisinden alınması benimsendi. Böylece öneri üretme ile sayısal beslenme hesabının sorumlulukları birbirinden ayrıldı.</w:t>
+        <w:t>İşlevleri besin arama, porsiyon belirleme, öğün günlüğü, günlük toplamlar ve kişisel hedefler şeklinde ayırdım. Sesli kayıt ve ana ekran mikrofonu, aynı günlük kayıt sistemine ulaşan kısa yollar olarak planlandı. Koç ve Oracle ise kaydedilmiş bilgilerden yararlanan öneri ekranlarıdır. Böylece her özellik için ayrı bir besin listesi veya farklı bir hesaplama yöntemi oluşturmak yerine, ortak veri modelini kullanacak bir yapı ortaya çıktı.</w:t>
       </w:r>
     </w:p>
     <w:p>
@@ -1176,7 +1176,24 @@
           <w:sz w:val="24"/>
           <w:lang w:val="tr-TR"/>
         </w:rPr>
-        <w:t>Çalışmanın kapsamı Android öncelikli mobil uygulama ile sınırlandırıldı. Besin verilerinin hazırlanması, bilimsel yayınların toplanması ve farklı kullanıcıların etiketleme işlemleri bu uygulama geliştirme çalışmasına dahil edilmedi. Kullanıcı yolculuğu; uygulamayı açma, besin seçme, miktarı belirtme, kaydetme ve sonucu kontrol etme adımlarıyla düzenlendi. Bu yaklaşım, sonraki sayfalarda anlatılacak geliştirmeler için anlaşılır bir başlangıç oluşturdu.</w:t>
+        <w:t>Örnek kullanıcı akışını “besini bul, miktarı gir, kaydet, toplamı gör, gerekirse düzelt” şeklinde kurdum. Başarı ölçütünü yalnızca kaydın ekranda görünmesiyle sınırlamadım; uygulama yeniden açıldığında korunması, yanlış güne yazılmaması ve düzenleme iptal edildiğinde kaybolmaması da gerekliydi. Sesli kayıtta miktar tahmini yapılırsa bunun kullanıcıya gösterilmesini, eşleşmeyen bir besinin ise sessizce doğru kabul edilmemesini benimsedim.</w:t>
+      </w:r>
+    </w:p>
+    <w:p>
+      <w:pPr>
+        <w:widowControl/>
+        <w:spacing w:after="260" w:before="0" w:line="293" w:lineRule="auto"/>
+        <w:jc w:val="both"/>
+      </w:pPr>
+      <w:r>
+        <w:rPr>
+          <w:rFonts w:ascii="Arial" w:hAnsi="Arial"/>
+          <w:b w:val="0"/>
+          <w:color w:val="000000"/>
+          <w:sz w:val="24"/>
+          <w:lang w:val="tr-TR"/>
+        </w:rPr>
+        <w:t>Bu çalışma sırasında yapay zekânın göreviyle besin verisinin kaynağını özellikle ayırdım. Yapay zekâ ifadeyi anlamaya yardımcı olurken sayısal değerler mevcut Core servisinden alınmaktadır. Gün sonunda uygulamanın kapsamını Android öncelikli mobil geliştirme olarak netleştirdim; veri seti üretimi ve araştırma sistemlerini bu çalışmaya dahil etmedim. Kullanıcı ihtiyacını somut kabul koşullarına dönüştürmenin, sonraki geliştirmeleri değerlendirmeyi kolaylaştırdığını öğrendim.</w:t>
       </w:r>
     </w:p>
     <w:p>
@@ -1229,7 +1246,7 @@
           <w:sz w:val="24"/>
           <w:lang w:val="tr-TR"/>
         </w:rPr>
-        <w:t>Bu çalışma gününde mobil uygulamanın geliştirme ortamı ve kullanılan araçlar incelendi. Arayüzün Flutter ile, uygulama mantığının Dart diliyle oluşturulduğu proje yapısı ele alındı. Android tarafındaki derleme ve cihaz özelliklerinin Android SDK ile Gradle üzerinden yönetildiği görüldü. Geliştirme ortamının doğru çalışmasının yalnızca editörün açılmasıyla değil, bağımlılıkların çözülmesi ve örnek bir derlemenin tamamlanmasıyla anlaşılabileceği değerlendirildi.</w:t>
+        <w:t>Bugün projenin geliştirme araçlarını ve dosya düzenini çalıştım. Flutter'ın arayüzü bileşenlerden oluşturduğunu, Dart'ın ise bu bileşenlerin davranışını ve veri işlemlerini tanımladığını öğrendim. Android SDK ve Gradle, yazılan kodun telefona kurulabilir pakete dönüştürülmesinde kullanılmaktadır. Bu ayrımı yapmak, bir hata çıktığında sorunun Dart kodunda mı, kullanılan pakette mi yoksa Android derleme ayarlarında mı olduğunu araştırmamı kolaylaştırdı.</w:t>
       </w:r>
     </w:p>
     <w:p>
@@ -1246,7 +1263,7 @@
           <w:sz w:val="24"/>
           <w:lang w:val="tr-TR"/>
         </w:rPr>
-        <w:t>Projenin pubspec.yaml dosyasında uygulama adı, sürümü ve paket bağımlılıkları incelendi. Ağ istekleri için http, yerel kayıtlar için shared_preferences, mikrofon kaydı için record ve geçici dosya konumu için path_provider paketlerinin kullanıldığı belirlendi. Kimlik doğrulama bağlantısı ayrı bir paket üzerinden sağlandı. Hazır paketlerin bütün uygulamayı oluşturmadığı; bunların uygulamanın veri modeli, ekranları ve hata yönetimiyle birleştirilmesi gerektiği üzerinde duruldu.</w:t>
+        <w:t>Öncelikle pubspec.yaml dosyasındaki bağımlılıkları görevlerine göre ayırdım. http ağ istekleri, shared_preferences yerel saklama, record mikrofon kaydı, path_provider ise geçici dosya dizini için kullanılıyor. Kimlik doğrulama için Supabase bağlantısı bulunuyor. Bir paketi projeye eklemenin tek başına özelliği tamamlamadığını gördüm; paketin hata durumlarını yakalamak, sonuçlarını uygulamanın modellerine çevirmek ve ekran kapanırken kaynaklarını bırakmak da gerekiyor.</w:t>
       </w:r>
     </w:p>
     <w:p>
@@ -1263,7 +1280,24 @@
           <w:sz w:val="24"/>
           <w:lang w:val="tr-TR"/>
         </w:rPr>
-        <w:t>Flutter komutlarının görevleri ayrıştırıldı. Bağımlılıkları hazırlama, statik kod analizi, otomatik test ve Android kurulum paketi üretme işlemleri ayrı doğrulama adımları olarak ele alındı. Kaynak kod ile derleme sırasında üretilen dosyaların aynı amaçla kullanılmadığı not edildi. Git sürüm kontrolü sayesinde bir değişikliğin hangi dosyalara etki ettiğinin izlenmesi ve çalışan sürümlerin korunması, geliştirme sürecinin temel bir parçası olarak değerlendirildi.</w:t>
+        <w:t>Komutların hangi aşamayı doğruladığını not ettim. flutter pub get bağımlılıkları hazırlar; flutter analyze kaynak kodu statik olarak denetler; flutter test beklenen davranışları sınar. flutter build apk --release ise Android kurulum paketini üretir. Analizin temiz çıkmasıyla telefondaki bütün etkileşimlerin doğrulanmasının aynı şey olmadığını özellikle ayırdım. Derleme çıktısını kaynak kod yerine düzenlememek ve kalıcı değişiklikleri lib ile android altındaki ilgili dosyalarda yapmak gerektiğini öğrendim.</w:t>
+      </w:r>
+    </w:p>
+    <w:p>
+      <w:pPr>
+        <w:widowControl/>
+        <w:spacing w:after="260" w:before="0" w:line="293" w:lineRule="auto"/>
+        <w:jc w:val="both"/>
+      </w:pPr>
+      <w:r>
+        <w:rPr>
+          <w:rFonts w:ascii="Arial" w:hAnsi="Arial"/>
+          <w:b w:val="0"/>
+          <w:color w:val="000000"/>
+          <w:sz w:val="24"/>
+          <w:lang w:val="tr-TR"/>
+        </w:rPr>
+        <w:t>Son olarak yapılandırma değerlerinin --dart-define üzerinden aktarılmasını inceledim. Uygulamadaki herkese açık istemci anahtarı ile sunucuda tutulması gereken Gemini veya yönetici anahtarları aynı yetkiye sahip değildir. Gizli anahtarları kaynak dosyalara yazmadan çalışmak, Git değişikliklerini kontrol etmek ve doğrulanmış sürümleri korumak geliştirme düzeninin bir parçası oldu. Gün sonunda araçların görevlerini ve projenin hangi bölümüne ne zaman müdahale edeceğimi daha iyi anladım.</w:t>
       </w:r>
     </w:p>
     <w:p>
@@ -1316,7 +1350,7 @@
           <w:sz w:val="24"/>
           <w:lang w:val="tr-TR"/>
         </w:rPr>
-        <w:t>Bugünkü çalışmanın odağı, uygulama kodunun sorumluluklara göre düzenlenmesiydi. Tüm işlemlerin tek bir ekran dosyasında bulunması durumunda, arayüz değişikliklerinin veri kaydı veya ağ istekleriyle iç içe geçebileceği değerlendirildi. Bu nedenle proje; veri modelleri, servisler, durum yönetimi, ekranlar ve ortak arayüz bileşenleri üzerinden incelendi. Her bölümün tek bir temel sorumluluğa odaklanması amaçlandı.</w:t>
+        <w:t>Bugün ekran kodu ile veri işlemlerinin birbirine karışmasını önleyen uygulama yapısı üzerinde çalıştım. Besin adı, miktarı ve günlük kayıt bilgileri model sınıflarında; ağ bağlantısı ve yerel saklama servislerde tutuluyor. AppController ise seçilen gün, öğünler, hedefler ve kayıt değişiklikleri gibi ortak durumu yönetiyor. Bu düzen sayesinde bir düğmenin görünümünü değiştirirken kayıt biçimini de değiştirmek zorunda kalmıyorum.</w:t>
       </w:r>
     </w:p>
     <w:p>
@@ -1333,7 +1367,7 @@
           <w:sz w:val="24"/>
           <w:lang w:val="tr-TR"/>
         </w:rPr>
-        <w:t>Model sınıflarının besin, porsiyon ve günlük kayıt bilgilerini temsil ettiği; servislerin dış sistemlerle iletişim ve yerel saklama işlerini yürüttüğü görüldü. AppController sınıfı, seçilen tarih ve kayıt listesi gibi ortak uygulama durumunu yönetirken ekranlar bu durumu kullanıcıya sunmaktadır. Örneğin bir öğün kaydedildiğinde ekran doğrudan depolama ayrıntılarıyla uğraşmamakta, işlemi denetleyiciye iletmektedir. Bu ayrım, kayıt davranışının arayüz açılmadan test edilebilmesine de yardımcı olmaktadır.</w:t>
+        <w:t>Bir besin ekleme işlemini adım adım takip ettim. Ekran bir DiaryEntry üretip denetleyiciye iletiyor; denetleyici listeyi güncelliyor, notifyListeners ile dinleyen ekranları haberdar ediyor ve LocalStore üzerinden saklıyor. Günlük toplamlarını gösteren ekranın ayrıca bağımsız bir kayıt listesi tutmaması önemliydi. Aynı verinin iki yerde ayrı ayrı değiştirilmesi, bir ekranda güncel diğerinde eski toplam görünmesine neden olabilirdi.</w:t>
       </w:r>
     </w:p>
     <w:p>
@@ -1350,7 +1384,24 @@
           <w:sz w:val="24"/>
           <w:lang w:val="tr-TR"/>
         </w:rPr>
-        <w:t>Uygulamanın başlangıç akışı da ele alındı. Yerel kayıtların yüklenmesi ile uzaktaki kimlik doğrulama hazırlığının farklı ihtiyaçlar olduğu belirlendi. Kullanıcı daha önce kaydettiği günlüğü görmek için yapay zekâ servisini beklememelidir. Servis istemcilerinin gerektiğinde test nesneleriyle değiştirilebilmesi sayesinde, gerçek ağ bağlantısı gerektirmeyen senaryolar hazırlanabildiği görüldü. Günün sonunda katmanlı yapının bakım, hata ayıklama ve test kolaylığına katkısı netleştirildi.</w:t>
+        <w:t>Başlangıçta main.dart içinde Flutter bağlamının hazırlanması, yerel kayıtların yüklenmesi ve uygulamanın açılması sırasını inceledim. Supabase hazırlığı beklenmeden başlatılıyor; günlük arayüzü uzak kimlik doğrulama servisini beklemiyor. Yerel denetleyicinin hazırlanması ise runApp öncesinde tamamlanıyor. Böylece daha önce kaydedilmiş öğünlerin gösterilmesiyle yapay zekâ bağlantısının hazır olması birbirinden ayrılmış oluyor.</w:t>
+      </w:r>
+    </w:p>
+    <w:p>
+      <w:pPr>
+        <w:widowControl/>
+        <w:spacing w:after="260" w:before="0" w:line="293" w:lineRule="auto"/>
+        <w:jc w:val="both"/>
+      </w:pPr>
+      <w:r>
+        <w:rPr>
+          <w:rFonts w:ascii="Arial" w:hAnsi="Arial"/>
+          <w:b w:val="0"/>
+          <w:color w:val="000000"/>
+          <w:sz w:val="24"/>
+          <w:lang w:val="tr-TR"/>
+        </w:rPr>
+        <w:t>Testlerde gerçek depolama veya ağ istemcisi yerine kontrollü nesneler verilebilmesini de kullandım. Örneğin LocalStore yerine kaydetmeyi bekleten bir test nesnesi, normal kullanımda yakalanması zor yazma sırası sorunlarını görünür kılıyor. Gün sonunda katmanlı yapının yalnızca dosyaları klasörlere ayırmak olmadığını; her bileşenin girdisini, çıktısını ve sorumluluğunu belirlemek anlamına geldiğini öğrendim.</w:t>
       </w:r>
     </w:p>
     <w:p>
@@ -1599,7 +1650,7 @@
           <w:sz w:val="24"/>
           <w:lang w:val="tr-TR"/>
         </w:rPr>
-        <w:t>Bu çalışma gününde uygulamanın ana gezinme yapısı ve ortak görsel dili üzerinde duruldu. Kullanıcının en sık yapacağı işlemlerin günlük kayıt ekranında kolayca bulunması hedeflendi. Günlük özet, öğün listeleri, sesle kayıt ve besin arama girişleri aynı kullanıcı akışının parçaları olarak ele alındı. Renklerin ve metin büyüklüklerinin bütün ekranlarda tutarlı kullanılması için ortak tema yapısından yararlanıldı.</w:t>
+        <w:t>Bugün uygulamanın ana ekranını ve sayfalar arasındaki geçişleri düzenledim. HomeShell içerisinde günlük, besin ögeleri, koç, Oracle ve ayarlar olmak üzere beş ana bölüm bulunuyor. Kullanıcının en sık ihtiyaç duyduğu besin arama ve sesle kayıt işlemlerini günlük ekranından erişilebilir tuttum. Diyet seçimini ayrı bir ekran olarak bağlayarak ana gezinme çubuğuna gereğinden fazla seçenek eklememeye dikkat ettim.</w:t>
       </w:r>
     </w:p>
     <w:p>
@@ -1616,7 +1667,7 @@
           <w:sz w:val="24"/>
           <w:lang w:val="tr-TR"/>
         </w:rPr>
-        <w:t>Ana gezinme içinde günlük, besin ögesi raporu, koç, Oracle ve ayarlar ekranlarının ilişkisi incelendi. Flutter bileşenleri kullanılarak kart, düğme ve liste gibi tekrar eden arayüz parçaları ortaklaştırıldı. Bir ekranın yalnızca başlık ve renklerden oluşmadığı; boş içerik, yüklenme ve hata durumlarının da tasarımın parçası olduğu görüldü. Henüz hiç kayıt yapılmamış bir gün için kullanıcıyı ilk işlemine yönlendiren açıklamaların önemi değerlendirildi.</w:t>
+        <w:t>Arayüzde ortak tema, kartlar, düğmeler ve öğün bölümlerini kullandım. Günlük özet ve öğün listelerinin aynı tarih üzerinden hesaplanması için AppController'ın seçilen gün bilgisini esas aldım. Tarih ileri veya geri alındığında başlıkla birlikte kayıtların ve toplamların da değişmesi gerekiyor. Yalnızca tarih metnini değiştirmek, kullanıcıya başka güne ait beslenme bilgisi gösterilmesine yol açacağından yeterli değildir.</w:t>
       </w:r>
     </w:p>
     <w:p>
@@ -1633,7 +1684,24 @@
           <w:sz w:val="24"/>
           <w:lang w:val="tr-TR"/>
         </w:rPr>
-        <w:t>Ekranlar arası geçişte seçilen günün ve uygulama durumunun korunması ele alındı. Kullanıcının geçmiş bir günü incelerken yanlışlıkla bugünün toplamlarını görmemesi gerektiği belirtildi. İçerik genişliğinin sınırlandırılması ve kaydırılabilir alanlar kullanılması, farklı ekran ölçülerinde okunabilirliği destekledi. Bu çalışmalar sonucunda görsel düzen ile uygulama davranışının birlikte tasarlanması gerektiği anlaşıldı; yalnızca güzel görünen değil, işlem sırası anlaşılır bir ana yapı oluşturuldu.</w:t>
+        <w:t>Boş bir gün, kayıt bulunan bir gün ve veri beklenen ekranlar için farklı görünüm durumlarını ele aldım. Boş ekranda kullanıcının ilk kaydı nasıl yapacağını anlaması; kayıt bulunan ekranda ise toplamlarla öğünlere kolay ulaşması amaçlandı. Kaydırılabilir alanlar ve içerik genişliği sınırı, uzun besin adlarının ve farklı ekran ölçülerinin düzeni bozmasını azaltıyor. Renk ve simgelerin yanında açıklayıcı metin kullanarak işlemlerin anlaşılır kalmasını sağladım.</w:t>
+      </w:r>
+    </w:p>
+    <w:p>
+      <w:pPr>
+        <w:widowControl/>
+        <w:spacing w:after="260" w:before="0" w:line="293" w:lineRule="auto"/>
+        <w:jc w:val="both"/>
+      </w:pPr>
+      <w:r>
+        <w:rPr>
+          <w:rFonts w:ascii="Arial" w:hAnsi="Arial"/>
+          <w:b w:val="0"/>
+          <w:color w:val="000000"/>
+          <w:sz w:val="24"/>
+          <w:lang w:val="tr-TR"/>
+        </w:rPr>
+        <w:t>Ana ekranın kayıt davranışını home_shell_test.dart içindeki senaryoyla değerlendirdim. Depolama tamamlanmadan yeni besinin görünmesi, arayüzün gereksiz beklemediğini gösteriyor; kalıcı kaydın sonucu ise denetleyicide ayrıca takip ediliyor. Bu çalışma sayesinde görsel tasarımla veri akışını birlikte düşünmeyi öğrendim. Güzel görünen bir ekranın, yanlış gün veya eski veri göstermesi durumunda işlevsel açıdan doğru sayılamayacağını gördüm.</w:t>
       </w:r>
     </w:p>
     <w:p>
@@ -1686,7 +1754,7 @@
           <w:sz w:val="24"/>
           <w:lang w:val="tr-TR"/>
         </w:rPr>
-        <w:t>Bugün uygulamanın taşıdığı verilerin Dart sınıflarıyla nasıl temsil edildiği incelendi. Besin arama sonucunda görülen kısa bilgi ile seçilen besinin ayrıntıları aynı veri yapısında değerlendirilmedi. Besin kimliği, adı, porsiyon seçenekleri ve besin ögeleri gibi alanlar tanımlandı. Böylece kullanıcıya gösterilen metin ile kaydın hangi kaynak besine ait olduğunu belirleyen kimlik birbirinden ayrıldı.</w:t>
+        <w:t>Bugün besin arama sonuçları ile günlüğe kaydedilen öğünlerin veri modellerini çalıştım. Arama listesinde yalnızca seçim için gereken kısa bilgiler bulunurken FoodDetail sınıfı porsiyonları, kaynak bilgilerini ve besin ögelerini taşıyor. DiaryEntry ise kullanıcının belirli bir gün ve öğünde tükettiği miktarı temsil ediyor. Aynı besin farklı günlerde yenebildiğinden, kaynak besinin kimliğiyle günlük kaydın kimliğini ayrı tuttum.</w:t>
       </w:r>
     </w:p>
     <w:p>
@@ -1703,7 +1771,7 @@
           <w:sz w:val="24"/>
           <w:lang w:val="tr-TR"/>
         </w:rPr>
-        <w:t>Günlük kayıt için DiaryEntry modeli ele alındı. Bir kayıt; tarih, öğün türü, besin kimliği, miktar ve hesaplanmış besin değerleriyle birlikte tutulmaktadır. Kahvaltı, öğle yemeği, akşam yemeği ve ara öğün seçenekleri sınırlı bir tür üzerinden temsil edildi. Sesle oluşturulma ve daha sonra gözden geçirilme gereksinimi de ayrı işaretlerle saklandı. Bu işaretlerin kaydın kaynağı ve güven düzeyi hakkında bilgi verdiği, sayısal besin değerlerinin yerine geçmediği açıklandı.</w:t>
+        <w:t>Kayıtta foodId, foodName, dateKey, meal, grams ve nutrients gibi alanları kullandım. inputGrams kullanıcının girdiği ağırlığı, grams hesaplamaya esas yenilebilir ağırlığı tutuyor. weightBasis bu iki değerin neden farklı olabileceğini açıklıyor. loggedByVoice kaydın sesle oluştuğunu, needsReview ise sonradan gözden geçirilmesi gerektiğini belirtiyor. Bu işaretler sayesinde tahmini bir kayıt, normal kayıtlarla aynı günlükte bulunurken belirsizliği görünür kalıyor.</w:t>
       </w:r>
     </w:p>
     <w:p>
@@ -1720,7 +1788,24 @@
           <w:sz w:val="24"/>
           <w:lang w:val="tr-TR"/>
         </w:rPr>
-        <w:t>Verilerin JSON biçimine dönüştürülmesi ve tekrar nesne olarak okunması incelendi. Önceki uygulama sürümlerinden gelen kayıtlarda yeni alanların bulunmayabileceği dikkate alındı. Uygun varsayılan değerlerle geriye dönük okunabilirlik desteklendi. Günlükte yalnızca uzak besinin kimliğini saklamak yerine, kayıt anındaki besin değerlerinin de tutulmasının eski kayıtların tutarlılığını koruduğu görüldü. Veri modelinin arayüzden önce netleştirilmesi, sonraki hesaplama ve saklama işlemlerini kolaylaştırdı.</w:t>
+        <w:t>DiaryEntry.fromFood içinde yalnızca yüz gram yenilebilir kısım temeline sahip besin değerlerini miktara göre ölçekledim. Yoğunluk gibi fiziksel özellikler aynı şekilde tüketilen besin miktarı olarak toplanmamalıdır. Kayda hesaplanmış değerlerin anlık kopyasını eklemek de önemliydi: eski öğünün değerlerini her açılışta uzak servisten yeniden üretmek, kaynak değiştiğinde günlüğün geçmişini değiştirebilirdi.</w:t>
+      </w:r>
+    </w:p>
+    <w:p>
+      <w:pPr>
+        <w:widowControl/>
+        <w:spacing w:after="260" w:before="0" w:line="293" w:lineRule="auto"/>
+        <w:jc w:val="both"/>
+      </w:pPr>
+      <w:r>
+        <w:rPr>
+          <w:rFonts w:ascii="Arial" w:hAnsi="Arial"/>
+          <w:b w:val="0"/>
+          <w:color w:val="000000"/>
+          <w:sz w:val="24"/>
+          <w:lang w:val="tr-TR"/>
+        </w:rPr>
+        <w:t>toJson ve fromJson dönüşümlerinde tarih, kimlik, miktar ve besin listesinin korunmasını kontrol ettim. Eski kayıtlarda inputGrams yoksa grams değerinin kullanılması, yeni alanların varsayılanlarla okunabilmesine örnektir. JSON dönüşüm testinde 125 gramlık kaydın geri okunduğunda aynı kimliği ve kaloriyi taşıması bekleniyor. Gün sonunda veri modelini tasarlarken yalnızca bugünkü ekranı değil, sonraki sürümlerde eski kayıtların okunmasını da düşünmek gerektiğini öğrendim.</w:t>
       </w:r>
     </w:p>
     <w:p>
@@ -1773,7 +1858,7 @@
           <w:sz w:val="24"/>
           <w:lang w:val="tr-TR"/>
         </w:rPr>
-        <w:t>Bu çalışma gününde mevcut besin servisine HTTP üzerinden erişim ele alındı. Mobil uygulamanın doğrudan veritabanı tablolarına bağlanması yerine, tanımlı servis uç noktalarıyla iletişim kurması benimsendi. CoreApiClient sınıfı üzerinden arama, besin ayrıntısı ve servis durumu işlemleri ayrıştırıldı. Bu çalışma hazır servisin mobil uygulamaya entegrasyonunu kapsamaktadır; besin veritabanının oluşturulması bu kapsamda değerlendirilmemiştir.</w:t>
+        <w:t>Bugün mobil uygulamanın mevcut besin servisiyle iletişimini sağlayan CoreApiClient üzerinde çalıştım. Arama için GET /v1/foods/search, seçilen besinin ayrıntıları için GET /v1/foods/{foodId} uç noktaları kullanılıyor. Uygulamayı doğrudan veritabanı tablolarına bağlamak yerine bu HTTP sözleşmesini esas aldım. Böylece verinin sunucuda nasıl saklandığını bilmeden, uygulamanın hangi isteği göndereceği ve hangi alanları okuyacağı açık hâle geldi.</w:t>
       </w:r>
     </w:p>
     <w:p>
@@ -1790,7 +1875,7 @@
           <w:sz w:val="24"/>
           <w:lang w:val="tr-TR"/>
         </w:rPr>
-        <w:t>Arama metninin başındaki ve sonundaki boşluklar temizlenerek istek hazırlanması incelendi. Boş bir metin için gereksiz ağ isteği gönderilmemesi sağlandı. Servisten gelen JSON yanıtı uygulamanın beklediği model sınıflarına dönüştürüldü. Başarısız HTTP durumları ile geçersiz yanıt biçimlerinin aynı şey olmadığı görüldü. Hata durumunda boş sonuç varmış gibi davranmak yerine kullanıcıya uygun geri bildirim verilmesi gerektiği değerlendirildi.</w:t>
+        <w:t>searchFoods içinde arama metninin başındaki ve sonundaki boşlukları temizledim. Metin boşsa ağ isteği oluşturmadan boş sonuç dönülüyor. Dolu sorguda q ve limit parametreleri URI üzerinden hazırlanıyor; varsayılan sonuç sınırı 30. Yanıtın JSON içeriği FoodSearchResults modeline çevriliyor. Yanıt kodu başarılı aralıkta değilse hata üretilmesi, bağlantı sorununun yanlışlıkla “besin bulunamadı” diye yorumlanmasını engelliyor.</w:t>
       </w:r>
     </w:p>
     <w:p>
@@ -1807,7 +1892,24 @@
           <w:sz w:val="24"/>
           <w:lang w:val="tr-TR"/>
         </w:rPr>
-        <w:t>Besin ayrıntıları için bellekte tutulan küçük bir önbellek kullanımı ele alındı. Aynı besin kısa süre içinde tekrar açıldığında, daha önce alınan ayrıntının yeniden kullanılmasının gereksiz istekleri azaltabileceği görüldü. Bu önbelleğin kalıcı ve tam çevrimdışı bir besin veritabanı olmadığı özellikle ayrıştırıldı. Servis adresinin derleme ayarıyla değiştirilebilmesi, geliştirme ve kullanım ortamlarının birbirinden ayrılmasını kolaylaştırdı. Günün sonunda arayüzden bağımsız, yeniden kullanılabilir bir servis istemcisi yapısı incelendi.</w:t>
+        <w:t>Arama sonuçlarından seçim yapıldığında önce besinin ayrıntısını yükleyip ardından porsiyon penceresini açan akışı bağladım. Kullanıcı porsiyonu onaylarsa bu pencere DiaryEntry döndürüyor; iptal ederse kayıt oluşmuyor. Ayrıntıları besin kimliğine göre bellekte saklayan önbellek, aynı besin tekrar açıldığında gereksiz ağ çağrılarını azaltıyor. Bu önbelleğin uygulama kapanınca bütün besinleri koruyan çevrimdışı bir veritabanı olmadığını ayırdım.</w:t>
+      </w:r>
+    </w:p>
+    <w:p>
+      <w:pPr>
+        <w:widowControl/>
+        <w:spacing w:after="260" w:before="0" w:line="293" w:lineRule="auto"/>
+        <w:jc w:val="both"/>
+      </w:pPr>
+      <w:r>
+        <w:rPr>
+          <w:rFonts w:ascii="Arial" w:hAnsi="Arial"/>
+          <w:b w:val="0"/>
+          <w:color w:val="000000"/>
+          <w:sz w:val="24"/>
+          <w:lang w:val="tr-TR"/>
+        </w:rPr>
+        <w:t>İsteklere 30 saniyelik zaman aşımı uygulanmasını ve hatanın arayüzde yakalanmasını inceledim. Beklenen akışı “sorgu → kısa sonuç → ayrıntı → porsiyon → günlük kaydı” şeklinde takip ederek veri dönüşümlerini netleştirdim. Bu çalışma, API entegrasyonunun yalnızca adres çağırmak olmadığını gösterdi; boş girdi, başarısız yanıt ve kullanıcının işlemi iptal etmesi de akışın parçalarıdır. Besin servisinin geliştirilmesini değil, hazır servisin mobil uygulamaya bağlanmasını üstlenen katman üzerinde çalıştım.</w:t>
       </w:r>
     </w:p>
     <w:p>
@@ -1860,7 +1962,7 @@
           <w:sz w:val="24"/>
           <w:lang w:val="tr-TR"/>
         </w:rPr>
-        <w:t>Bugünkü çalışmada arama ekranında aynı anda devam edebilen isteklerin oluşturduğu sorun ele alındı. Kullanıcı ilk kelimeyi yazdıktan hemen sonra arama metnini değiştirebilir. İlk isteğin yanıtı daha geç geldiğinde, yeni aramaya ait sonuçların üzerine eski sonuçların yazılması mümkündür. Bu durumun yalnızca ağ hızına bağlı bir görüntü sorunu olmadığı, yanlış besinin seçilmesine de yol açabileceği değerlendirildi.</w:t>
+        <w:t>Bugün arama ekranında hızlı yazı yazıldığında ortaya çıkabilen eski sonuç sorununu ele aldım. Kullanıcı “apple” sorgusundan hemen sonra “chicken” yazarsa ilk isteğin daha geç tamamlanması mümkündür. Yanıtları geliş sırasına göre doğrudan ekrana koymak, arama kutusunda chicken yazarken elma sonuçlarının görünmesine neden olabilir. Bu sorunun yalnızca görünümle ilgili olmadığını, yanlış besinin seçilmesine de yol açabileceğini gördüm.</w:t>
       </w:r>
     </w:p>
     <w:p>
@@ -1877,7 +1979,7 @@
           <w:sz w:val="24"/>
           <w:lang w:val="tr-TR"/>
         </w:rPr>
-        <w:t>Arama işlemleri için güncellik kontrolü sağlayan bir istek sırası kullanımı incelendi. Yeni bir arama başladığında önceki yanıtların artık geçerli olmadığının anlaşılması sağlandı. Kullanıcı arama alanını tamamen temizlediğinde, o sırada devam eden bir isteğin listeyi tekrar doldurmaması gerektiği dikkate alındı. Aynı yaklaşım, standart arama ile gönderilmiş metnin anlamsal çözümlenmesinden dönen sonuçların birlikte yönetilmesinde de uygulandı.</w:t>
+        <w:t>Öncelikle her tuş vuruşunda istek göndermemek için 350 milisaniyelik gecikmeli aramayı kullandım. Yeni bir değişiklik olduğunda önceki zamanlayıcı iptal ediliyor ve yeni süre başlıyor. Ancak bu yöntem, daha önce gönderilmiş bir isteği tek başına geçersiz kılmıyor. Bu nedenle her değişiklikte istek numarasını artırıp, dönen yanıtın numarasını güncel numarayla karşılaştırdım. Yalnızca son aramaya ait yanıt ekran durumunu güncelliyor.</w:t>
       </w:r>
     </w:p>
     <w:p>
@@ -1894,7 +1996,24 @@
           <w:sz w:val="24"/>
           <w:lang w:val="tr-TR"/>
         </w:rPr>
-        <w:t>Yükleniyor, sonuç bulunamadı ve bağlantı hatası durumları ayrı arayüz davranışları olarak ele alındı. Asenkron işlemlerde ekran kapandıktan sonra arayüzü güncellemeye çalışmamak için yaşam döngüsü kontrollerinin önemi görüldü. Geciktirilmiş test yanıtlarıyla, arama temizlendikten sonra eski sonucun görünmemesi senaryosu doğrulama kapsamına alındı. Bu çalışma, kullanıcı etkileşimi hızlı olduğunda bile ekrandaki verinin son talebi temsil etmesi gerektiğini gösterdi.</w:t>
+        <w:t>Arama alanı temizlendiğinde de numaranın artırılması gerekiyordu. Aksi hâlde liste boşaltıldıktan sonra yoldaki eski yanıt gelip sonuçları tekrar doldurabilirdi. Normal aramayla gönderilmiş metnin yapay zekâ çözümlemesini ayrı sayaçlarla takip ettim. Ekran kapanmışsa güncelleme yapılmaması için mounted kontrolünü ekledim; zamanlayıcı ve metin dinleyicileri de dispose sırasında bırakılıyor.</w:t>
+      </w:r>
+    </w:p>
+    <w:p>
+      <w:pPr>
+        <w:widowControl/>
+        <w:spacing w:after="260" w:before="0" w:line="293" w:lineRule="auto"/>
+        <w:jc w:val="both"/>
+      </w:pPr>
+      <w:r>
+        <w:rPr>
+          <w:rFonts w:ascii="Arial" w:hAnsi="Arial"/>
+          <w:b w:val="0"/>
+          <w:color w:val="000000"/>
+          <w:sz w:val="24"/>
+          <w:lang w:val="tr-TR"/>
+        </w:rPr>
+        <w:t>Regresyon testinde isteğin yanıtını Completer ile bekletip arama alanını temizleyen senaryoyu kullandım. Sonradan tamamlanan yanıtın ekranda besin göstermemesi bekleniyor. Böylece yalnızca hızlı internet üzerinde düzgün görünen bir ekranı değil, yanıt sırası değiştiğinde de doğru davranan akışı değerlendirdim. Gün sonunda asenkron programlamada en son tamamlanan işlemin her zaman kullanıcının en son isteği olmadığını öğrendim.</w:t>
       </w:r>
     </w:p>
     <w:p>
@@ -1947,7 +2066,7 @@
           <w:sz w:val="24"/>
           <w:lang w:val="tr-TR"/>
         </w:rPr>
-        <w:t>Bu çalışma gününde arama listesinden seçilen besinin ayrıntılarının sunulması üzerinde duruldu. Benzer adlara sahip besinlerin hazırlanma biçimi veya veri kaynağı farklı olabileceği için, yalnızca besin adının gösterilmesinin yeterli olmadığı görüldü. Ayrıntı ekranında porsiyon seçenekleri, mevcut besin ögeleri ve kaynak bilgisi birlikte değerlendirildi. Kullanıcının kaydı oluşturmadan önce hangi besini seçtiğini anlayabilmesi amaçlandı.</w:t>
+        <w:t>Bugün kayıtlı besinin ayrıntılarını gösteren pencere üzerinde çalıştım. Benzer adlara sahip besinler; çiğ veya pişmiş olma, kaynak veri seti ve porsiyon seçenekleri bakımından farklı olabilir. Bu nedenle yalnızca besin adını göstermekle yetinmedim. Kullanıcının seçiminin neye dayandığını anlayabilmesi için kaynak bilgilerini, miktarı ve kaydedilmiş besin değerlerini aynı ayrıntı akışında ele aldım.</w:t>
       </w:r>
     </w:p>
     <w:p>
@@ -1964,7 +2083,7 @@
           <w:sz w:val="24"/>
           <w:lang w:val="tr-TR"/>
         </w:rPr>
-        <w:t>Besin değerlerinin hangi miktar esas alınarak verildiği açıklandı. Uygulamada kullanılan uygun kaynak değerler, yüz gram yenilebilir kısım üzerinden hesaplanmaktadır. Kullanıcının seçtiği miktar değiştiğinde bu değerlerin nasıl ölçeklendiğinin anlaşılır olması hedeflendi. Kaynak ve hesaplama bilgilerine erişim sunulması, ekranda görülen sonucun izlenebilirliğini artırdı. Yapay zekâ tarafından önerilen bir adın tek başına doğrulanmış bir besin kaydı olmadığı özellikle ayrıştırıldı.</w:t>
+        <w:t>EntryDetailSheet açılırken foodId üzerinden kaynak ayrıntısı isteniyor. Günlükte tüketilmiş miktara ait değerler ise kaydın kendi nutrients listesinden gösteriliyor. Bu ayrımı korudum; uzak kaynaktaki yüz gramlık değerle kullanıcının gerçekten kaydettiği miktarın değeri birbirine karışmamalı. Besin ögelerini isimlerine göre sıralamak ve uzun içerik için kaydırılabilir pencere kullanmak, listeyi daha rahat okunabilir hâle getiriyor.</w:t>
       </w:r>
     </w:p>
     <w:p>
@@ -1981,7 +2100,24 @@
           <w:sz w:val="24"/>
           <w:lang w:val="tr-TR"/>
         </w:rPr>
-        <w:t>Kaydedilmiş bir besinin ayrıntılarında miktar düzenleme ve besin eşleşmesini değiştirme seçenekleri incelendi. Yanlış besin seçilmişse yalnızca gram değerini düzeltmenin yeterli olmayacağı görüldü. Değiştirme işlemi tekrar arama ve porsiyon seçimine yönlendirilerek mevcut kaydın kimliği korunmaktadır. Bu yaklaşım, kullanıcıya kaydı silip baştan oluşturmak zorunda kalmadan düzeltme imkânı sundu. Günün sonunda veri kaynağını göstermek ile düzenleme kolaylığı sağlamak aynı kalite yaklaşımının parçaları olarak değerlendirildi.</w:t>
+        <w:t>Düzenleme işlemini iki farklı ihtiyaca ayırdım. Miktar veya öğün yanlışsa mevcut kaydın porsiyonu değiştiriliyor; besinin kendisi yanlışsa Replace food üzerinden yeniden arama açılıyor. Besin değiştirme sırasında yeni seçimin değerlerini alırken eski kaydın kimliğini ve tarihini korudum. Böylece düzeltme, yanlışlıkla yeni bir öğün eklemek veya eski günü değiştirmek anlamına gelmiyor. Kullanıcı seçimden vazgeçerse özgün kayıt korunuyor.</w:t>
+      </w:r>
+    </w:p>
+    <w:p>
+      <w:pPr>
+        <w:widowControl/>
+        <w:spacing w:after="260" w:before="0" w:line="293" w:lineRule="auto"/>
+        <w:jc w:val="both"/>
+      </w:pPr>
+      <w:r>
+        <w:rPr>
+          <w:rFonts w:ascii="Arial" w:hAnsi="Arial"/>
+          <w:b w:val="0"/>
+          <w:color w:val="000000"/>
+          <w:sz w:val="24"/>
+          <w:lang w:val="tr-TR"/>
+        </w:rPr>
+        <w:t>needsReview işaretli kayıtta Quick estimate açıklamasını göstererek tahmini miktarın fark edilmesini sağladım. entry_detail_test.dart içindeki besin değiştirme senaryosu, yeni besin seçildiğinde eski kayıt kimliğinin korunmasını denetliyor. Bu çalışma bana kaynak bilgisini göstermenin yalnızca ayrıntı eklemek olmadığını öğretti: kullanıcı hangi besini kaydettiğini anlayabiliyor ve hatanın miktarda mı, eşleşmede mi olduğunu ayırt ederek doğru düzeltmeyi yapabiliyor.</w:t>
       </w:r>
     </w:p>
     <w:p>
@@ -2034,7 +2170,7 @@
           <w:sz w:val="24"/>
           <w:lang w:val="tr-TR"/>
         </w:rPr>
-        <w:t>Bugünkü çalışma, seçilen miktarın besin değerlerine doğru yansıtılması üzerine yapıldı. Kaynakta yüz gram için verilen bir değerin, kullanıcının tükettiği yenilebilir gram miktarıyla orantılı hesaplanması ele alındı. Örneğin yalnızca hesaplama mantığını açıklamak için kullanılan yüz gramlık bir değerin, yüz elli gramda bir buçuk katsayısıyla çarpılması gerektiği gösterildi. Bu örneğin gerçek bir besinin ölçülmüş değeri yerine genel hesap kuralını temsil ettiği belirtildi.</w:t>
+        <w:t>Bugün besin değerlerinin tüketilen miktara göre hesaplanmasını ve yenilebilir ağırlık dönüşümünü çalıştım. Kaynak değerler yüz gram yenilebilir kısım üzerinden verildiğinden temel katsayı grams / 100 şeklindedir. DiaryEntry.fromFood bu katsayıyı uygun besin ögelerine uygular. Hesabı ekranın farklı yerlerinde yeniden yazmak yerine modelde tutmak, elle arama ve sesli kayıt yollarının aynı sonucu üretmesini sağlıyor.</w:t>
       </w:r>
     </w:p>
     <w:p>
@@ -2051,7 +2187,7 @@
           <w:sz w:val="24"/>
           <w:lang w:val="tr-TR"/>
         </w:rPr>
-        <w:t>Satın alınan ağırlık ile yenilen ağırlığın her zaman aynı olmadığı değerlendirildi. Kabuk veya kemik gibi yenmeyen kısımlar bulunabileceğinden, uygulamada bu iki miktar ayrı alanlarda tutulmaktadır. Dönüşüm ancak seçilen besine doğrudan bağlı ve kullanılabilir bir katsayı varsa yapılmaktadır. Benzer isimli başka bir besinin katsayısını kullanmanın hatalı sonuç oluşturabileceği görüldü. Uygun katsayı bulunmadığında belirsizliğin sessizce tahmin edilmesi yerine kullanıcı düzeltmesi istenmektedir.</w:t>
+        <w:t>diary_test.dart dosyasındaki kontrollü elma örneğini kullandım. Test verisinde yüz gram için 52 kcal bulunuyor; 182 gram kaydedildiğinde işlem 52 × 182 / 100 = 94,64 kcal oluyor. Protein için 0,26 × 1,82 = 0,4732 gram bekleniyor. Bu rakamlar testin hesaplama verileridir. Ondalıklı işlemlerde küçük kayan nokta farklarını karşılamak için eşitliği uygun toleransla karşılaştırmanın neden gerekli olduğunu öğrendim.</w:t>
       </w:r>
     </w:p>
     <w:p>
@@ -2068,7 +2204,24 @@
           <w:sz w:val="24"/>
           <w:lang w:val="tr-TR"/>
         </w:rPr>
-        <w:t>Miktar girişinde sıfır, negatif ve sonlu olmayan değerlerin kabul edilmemesi ele alındı. Ondalık virgül kullanan girişlerin işlenmesi, Türkçe kullanım alışkanlıkları bakımından değerlendirildi. Porsiyon düzenlendiğinde mevcut besin değerlerinin aynı oranla güncellenmesi ve eski kaydın kimliğinin korunması incelendi. Böylece hesaplamanın, kullanıcıya sunulan ağırlık türüyle tutarlı yürütülmesinin önemi ortaya konuldu.</w:t>
+        <w:t>Kemik veya kabuk içeren besinlerde satın alınan miktarla yenilen miktarı ayırdım. Testteki 500 gramlık tavuk örneğinde, besine bağlı kullanılabilir katsayı 0,67 olduğu için yenilebilir miktar 335 gramdır. Yüz gramda 161 kcal verisiyle toplam 539,35 kcal hesaplanır. inputGrams alanında 500, grams alanında 335 tutulması, hem kullanıcının girişini hem hesabın dayanağını koruyor. Benzer isimli başka bir besinin katsayısı kullanılmıyor.</w:t>
+      </w:r>
+    </w:p>
+    <w:p>
+      <w:pPr>
+        <w:widowControl/>
+        <w:spacing w:after="260" w:before="0" w:line="293" w:lineRule="auto"/>
+        <w:jc w:val="both"/>
+      </w:pPr>
+      <w:r>
+        <w:rPr>
+          <w:rFonts w:ascii="Arial" w:hAnsi="Arial"/>
+          <w:b w:val="0"/>
+          <w:color w:val="000000"/>
+          <w:sz w:val="24"/>
+          <w:lang w:val="tr-TR"/>
+        </w:rPr>
+        <w:t>Miktar düzenlemede sonlu, sıfırdan büyük ve en fazla 10.000 gram değer kabul edilmesini inceledim. Virgüllü ondalık girişin noktaya çevrilmesi, Türkçe kullanım için önemlidir. Satın alınan ağırlık seçilmiş ancak uygun katsayı bulunamamışsa kayıt düzeltme gerektiriyor. Gün sonunda doğru formül kadar, formüle verilen ağırlığın neyi temsil ettiğinin de önemli olduğunu gördüm; yanlış ağırlık temeliyle yapılan aritmetik, teknik olarak düzgün görünse bile yanlış sonuç verir.</w:t>
       </w:r>
     </w:p>
     <w:p>
@@ -2121,7 +2274,7 @@
           <w:sz w:val="24"/>
           <w:lang w:val="tr-TR"/>
         </w:rPr>
-        <w:t>Bu çalışma gününde besin günlüğünün uygulama kapatıldıktan sonra korunması ele alındı. Yerel saklama katmanında SharedPreferences üzerinden JSON kayıtlarının kullanıldığı görüldü. Günlük girişleri, hedefler, kişisel profil ve bazı kullanım tercihleri ayrı anahtarlar altında tutulmaktadır. Verilerin tek bir karmaşık metin yerine tanımlı modeller üzerinden dönüştürülmesi, okuma ve yazma işlemlerinin anlaşılmasını kolaylaştırdı.</w:t>
+        <w:t>Bugün günlüğün uygulama kapatıldıktan sonra korunmasını sağlayan LocalStore üzerinde çalıştım. SharedPreferences içinde kayıt listesi JSON metni olarak saklanıyor. Günlük, hedefler, kişisel profil, izin tercihleri ve günlük öneri için ayrı anahtarlar bulunuyor. Örneğin opennutri.diary.entries.v1 anahtarı öğün listesini temsil ediyor. Anahtarları ayrı tutmak, bir ayarı değiştirirken bütün kullanıcı verisini yeniden biçimlendirme ihtiyacını azaltıyor.</w:t>
       </w:r>
     </w:p>
     <w:p>
@@ -2138,7 +2291,7 @@
           <w:sz w:val="24"/>
           <w:lang w:val="tr-TR"/>
         </w:rPr>
-        <w:t>Kayıtların saklanmasında besin adı ve kimliğine ek olarak miktar, öğün, tarih ve besin değerlerinin tutulması incelendi. Uygulama yeniden açıldığında bu bilgilerden aynı günlük nesnelerinin oluşturulması sağlanmaktadır. JSON dönüşümünün test edilmesi, verinin yalnızca bellekte doğru görünmesinin yeterli olmadığını gösterdi. Alan adlarının ve varsayılan değerlerin korunması, eski kayıtların yeni sürümlerde okunabilmesi bakımından değerlendirildi.</w:t>
+        <w:t>Kaydetme sırasında her DiaryEntry nesnesi toJson ile alanlarına ayrılıyor; oluşan liste jsonEncode ile metne dönüştürülüyor. Açılışta getString ile okunan içerik jsonDecode ve fromJson üzerinden tekrar nesnelere çevriliyor. Henüz kayıt yoksa boş liste dönülüyor. Yalnızca foodId saklamak yerine miktar, tarih ve hesaplanmış besin değerlerini birlikte tutmak, geçmiş öğünlerin kaynak servisine yeniden bağlanmadan gösterilmesini sağlıyor.</w:t>
       </w:r>
     </w:p>
     <w:p>
@@ -2155,7 +2308,24 @@
           <w:sz w:val="24"/>
           <w:lang w:val="tr-TR"/>
         </w:rPr>
-        <w:t>Kullanılan yöntemin sınırları da ele alındı. Yerel kayıt, bulut eşitlemesi veya kullanıcıya sunulan bir yedekleme sistemi anlamına gelmemektedir. Mevcut sürümde dışa aktarma ve geri yükleme arayüzü bulunmadığı not edildi. Depolama hatası durumunda uygulamanın başarı göstermemesi gerektiği üzerinde duruldu. Günün sonunda mobil uygulamalarda kalıcılığın yalnızca bir kaydetme komutu yazmak değil; veri biçimini, hata durumunu ve sonraki açılıştaki davranışı birlikte yönetmek olduğu değerlendirildi.</w:t>
+        <w:t>saveEntries içindeki setString sonucunu kontrol ettim. Depolama işlemi false dönerse StateError üretiliyor; böylece çağıran ekran başarısız yazmayı tamamlanmış gibi kabul etmiyor. Testlerde gerçek kişisel günlük yerine bellek içi saklama nesneleri ve SharedPreferences test başlangıç değerleri kullanılıyor. JSON dönüşüm senaryosu kimlik, öğün, gram ve kalori bilgisinin geri okunduğunda korunmasını sınayarak veri kaybına karşı somut kontrol sağlıyor.</w:t>
+      </w:r>
+    </w:p>
+    <w:p>
+      <w:pPr>
+        <w:widowControl/>
+        <w:spacing w:after="260" w:before="0" w:line="293" w:lineRule="auto"/>
+        <w:jc w:val="both"/>
+      </w:pPr>
+      <w:r>
+        <w:rPr>
+          <w:rFonts w:ascii="Arial" w:hAnsi="Arial"/>
+          <w:b w:val="0"/>
+          <w:color w:val="000000"/>
+          <w:sz w:val="24"/>
+          <w:lang w:val="tr-TR"/>
+        </w:rPr>
+        <w:t>Bu yöntemin sınırlarını da not ettim. Yerel saklama, bulut eşitleme veya yedekleme anlamına gelmiyor; mevcut uygulamada dışa aktarma ve geri yükleme arayüzü bulunmuyor. Büyük günlükler, bozuk JSON ve uygulamanın beklenmedik kapanması için daha kapsamlı dayanıklılık çalışmaları yapılabilir. Gün sonunda kalıcılığın yalnızca bir kaydetme komutu olmadığını; veri biçimi, hata sonucu ve yeniden açılıştaki okuma davranışının birlikte tasarlanması gerektiğini öğrendim.</w:t>
       </w:r>
     </w:p>
     <w:p>
@@ -2208,7 +2378,7 @@
           <w:sz w:val="24"/>
           <w:lang w:val="tr-TR"/>
         </w:rPr>
-        <w:t>Bugünkü çalışmada günlük kayıt işlemlerinin ortak bir denetleyici üzerinden yönetilmesi incelendi. Kullanıcı yeni bir besin eklediğinde, listenin ve günlük toplamların hemen güncellenmesi hedeflendi. AppController yapısı, kayıt değişikliklerini ekranlara bildirmekte ve yerel saklama işlemlerini yönetmektedir. Böylece farklı ekranların ayrı ayrı güncel veri tutmaya çalışmasından kaynaklanabilecek tutarsızlıklar azaltıldı.</w:t>
+        <w:t>Bugün yeni besinin hemen görünmesiyle verinin güvenilir biçimde saklanmasını birlikte ele aldım. AppController kayıt listesini önce bellekte güncelliyor ve ekranlara bildirim gönderiyor. Kullanıcı böylece depolama işleminin bitmesini beklemeden öğününü görebiliyor. Ancak bu iyimser gösterimin, kalıcı yazmanın tamamlandığı anlamına gelmediğini ayırdım. Özellikle hızlı ekleme, düzeltme ve Geri al işlemleri arka arkaya geldiğinde yazma sırası korunmalıdır.</w:t>
       </w:r>
     </w:p>
     <w:p>
@@ -2225,7 +2395,7 @@
           <w:sz w:val="24"/>
           <w:lang w:val="tr-TR"/>
         </w:rPr>
-        <w:t>Arayüzün hızlı tepki vermesi için kayıt önce bellekte görünür hâle getirilmektedir. Ancak depolama işlemi tamamlanmadan kalıcılığın kesinleştiği varsayılmamaktadır. Birbirini takip eden yazma işlemlerinin sıraya alınması, daha eski bir kayıt listesinin daha yeni listenin üzerine yazılmasını engelleyen önemli bir ayrıntı olarak değerlendirildi. Hata durumlarında görünümün kayıt sonucuyla uyumlu kalması için geri dönüş davranışları incelendi.</w:t>
+        <w:t>Sorunu somutlaştırmak için önce 100 gramlık kaydın eklendiği, hemen ardından 200 grama düzeltildiği senaryoyu takip ettim. İki yazma bağımsız başlatılırsa eski 100 gramlık liste daha geç tamamlanıp yenisinin üstüne yazılabilir. _entryWriteTail ile her yazmayı öncekinin arkasına bağlayan Future zincirini kullandım. _persistedEntries ise son başarıyla saklanan listeyi tutuyor. Hatalı yazma hâlâ güncel görünümü temsil ediyorsa arayüz bu son başarılı duruma geri dönüyor.</w:t>
       </w:r>
     </w:p>
     <w:p>
@@ -2242,7 +2412,24 @@
           <w:sz w:val="24"/>
           <w:lang w:val="tr-TR"/>
         </w:rPr>
-        <w:t>Yanlış eklenen bir işlemin Geri al seçeneğiyle kolayca düzeltilmesi ele alındı. Aynı sesli yanıtın yeniden işlenmesi durumunda çift kayıt oluşmaması için kimlik denetimleri kullanıldığı görüldü. Tekrar kullanılan bir besinin yeni gün için kopyalanması sırasında ise yeni kayıt kimliği oluşturulmaktadır. Bu fark, gerçek bir yeni işlem ile aynı işlemin yanlışlıkla tekrar edilmesini ayırmaktadır. Çalışma sonucunda hızlı arayüz ile güvenilir veri yönetiminin birlikte tasarlanması gerektiği anlaşıldı.</w:t>
+        <w:t>addEntries içinde mevcut kimlikleri bir kümede toplayarak aynı kaydın ikinci kez eklenmesini önledim. Sesli isteğin tekrar işlenmesiyle aynı besinin başka gün yeniden yenmesi farklı durumlardır; ikinci durumda yeni kayıt kimliği üretiliyor. Toplu ekleme ve removeEntries ile Geri al işlemi, bütün öğünü tek liste güncellemesi üzerinden yönetiyor. Sayaçlı test nesnesi, iki besinlik grubun tek saklama çağrısıyla yazıldığını kontrol ediyor.</w:t>
+      </w:r>
+    </w:p>
+    <w:p>
+      <w:pPr>
+        <w:widowControl/>
+        <w:spacing w:after="260" w:before="0" w:line="293" w:lineRule="auto"/>
+        <w:jc w:val="both"/>
+      </w:pPr>
+      <w:r>
+        <w:rPr>
+          <w:rFonts w:ascii="Arial" w:hAnsi="Arial"/>
+          <w:b w:val="0"/>
+          <w:color w:val="000000"/>
+          <w:sz w:val="24"/>
+          <w:lang w:val="tr-TR"/>
+        </w:rPr>
+        <w:t>Regresyon testinde ilk yazmayı bekletip düzeltmeyi sıraya aldım; ikinci yazmaya “disk full” hatası verilince kaydın son saklanan 100 grama dönmesi bekleniyor. Bu kontrollü hata, normal bir denemede kolayca görünmeyen yarış durumunu anlamamı sağladı. Gün sonunda hızlı tepki veren arayüzün arkasında işlem sırası, kimlik denetimi ve başarısızlık davranışının birlikte kurulması gerektiğini öğrendim.</w:t>
       </w:r>
     </w:p>
     <w:p>
@@ -2295,7 +2482,7 @@
           <w:sz w:val="24"/>
           <w:lang w:val="tr-TR"/>
         </w:rPr>
-        <w:t>Bu çalışma gününde kayıt düzenleme sırasında veri kaybını önleyen akış ele alındı. Bir öğünü düzenlemek için mevcut kayıtları önce silmek, kullanıcının geri dönmesi veya işlemi iptal etmesi durumunda yemeğin kaybolmasına neden olabilmektedir. Bu nedenle özgün kayıtların düzenleme tamamlanıncaya kadar korunması gerektiği değerlendirildi. Değişikliklerin ancak Kaydet işlemi başarılı olduğunda mevcut kayıtların yerine geçirilmesi benimsendi.</w:t>
+        <w:t>Bugün kaydedilmiş bir öğünü düzenlerken özgün verinin kaybolmaması üzerine çalıştım. Özellikle sesli kaydın ardından Edit batch açıldığında mevcut besinleri önce silmek risklidir. Kullanıcı yalnızca kontrol etmek için pencereyi açıp geri dönebilir. Düzenleme ekranının açılmasını veri değişikliği saymak yerine, değişiklikleri ancak Save changes başarıyla tamamlandığında uygulayan akışı kullandım.</w:t>
       </w:r>
     </w:p>
     <w:p>
@@ -2312,7 +2499,7 @@
           <w:sz w:val="24"/>
           <w:lang w:val="tr-TR"/>
         </w:rPr>
-        <w:t>Tek bir besinin miktarını değiştirme, öğününü düzenleme ve yanlış besin eşleşmesini değiştirme işlemleri incelendi. Miktar değişiminde kaydın tarihi ve kimliği korunarak besin değerleri yeni orana göre hesaplanmaktadır. Besin değiştirildiğinde ise yeni kaynak kaydının ayrıntıları kullanılmaktadır. Böylece kullanıcının bir düzeltme yaparken yanlışlıkla ikinci bir yemek kaydı oluşturması önlenmektedir. Toplu düzenlemede de bütün değişikliklerin aynı kayıt işlemi içinde ele alınması üzerinde duruldu.</w:t>
+        <w:t>Toplu düzenlemede updateEntries, mevcut listedeki kayıtları kimliklerine göre yeni değerlerle değiştiriyor. Editör açılırken veya iptal edilirken silme yapılmıyor. Ayrıca listeden daha önce kaldırılmış bir kaydı, eski bir editörden dönen sonuçla yeniden eklememek için yalnızca mevcut kimlikler güncelleniyor. Böylece “düzenle” ile “yeni kayıt oluştur” işlemleri arasında net bir ayrım bulunuyor.</w:t>
       </w:r>
     </w:p>
     <w:p>
@@ -2329,7 +2516,24 @@
           <w:sz w:val="24"/>
           <w:lang w:val="tr-TR"/>
         </w:rPr>
-        <w:t>Miktar penceresinin kapatılması sırasında ortaya çıkan yaşam döngüsü sorunu ayrıca değerlendirildi. Metin alanına ait denetleyicinin kapanış animasyonu bitmeden yok edilmesinin hataya yol açabileceği görüldü. Alanın kendi durumunu yönetmesiyle bu sorun giderildi. İptalin kaydı değiştirmemesi, ondalık virgülün kabul edilmesi ve besin değiştirmede kimliğin korunması otomatik testlerle kapsandı. Bu örnek, küçük bir arayüz penceresinin bile veri güvenilirliğini etkileyebildiğini gösterdi.</w:t>
+        <w:t>Tek besinin miktarını değiştiren pencerede withEditedServing yöntemini kullandım. Bu yöntem eski kimliği ve tarihi koruyup besin değerlerini yeni miktarın eski miktara oranıyla ölçekliyor. Örneğin kontrollü testte 100 gramlık, 52 kcal içeren tahmini kayıt 150 grama düzeltildiğinde 78 kcal oluyor. Öğün kahvaltı olarak değiştirilebiliyor ve düzeltme sonrası needsReview işareti kaldırılıyor. Kullanıcının virgüllü girişini kabul etmek için ondalık ayracını da normalleştirdim.</w:t>
+      </w:r>
+    </w:p>
+    <w:p>
+      <w:pPr>
+        <w:widowControl/>
+        <w:spacing w:after="260" w:before="0" w:line="293" w:lineRule="auto"/>
+        <w:jc w:val="both"/>
+      </w:pPr>
+      <w:r>
+        <w:rPr>
+          <w:rFonts w:ascii="Arial" w:hAnsi="Arial"/>
+          <w:b w:val="0"/>
+          <w:color w:val="000000"/>
+          <w:sz w:val="24"/>
+          <w:lang w:val="tr-TR"/>
+        </w:rPr>
+        <w:t>entry_detail_test.dart içindeki iptal, ondalıklı miktar ve besin değiştirme senaryolarıyla işlemleri değerlendirdim. Sesli toplu düzenlemeden çıkma testi de özgün besinlerin günlükte kaldığını kontrol ediyor. Miktar penceresinde metin alanının kapanış animasyonu boyunca geçerli kalmasına dikkat ettim; erken bırakılan denetleyici arayüz hatası oluşturabilir. Bu çalışma, düzenleme başarısını yalnızca Kaydet düğmesine basmakla değil, kullanıcının vazgeçtiği bütün çıkış yollarıyla birlikte değerlendirmeyi öğretti.</w:t>
       </w:r>
     </w:p>
     <w:p>
@@ -2382,7 +2586,7 @@
           <w:sz w:val="24"/>
           <w:lang w:val="tr-TR"/>
         </w:rPr>
-        <w:t>Bugünkü çalışmada birden fazla besinin günlük toplamlarının hesaplanması ele alındı. Protein, karbonhidrat ve yağ miktarları seçilen güne ait kayıtlar üzerinden birleştirilmektedir. Aynı besin ögesinin farklı kayıtlar içinde bulunması durumunda birim ve kimlik bilgilerinin dikkate alınması gerektiği değerlendirildi. Tarih seçiminin hesaplamanın girişini belirlediği, bütün günlüğün tek toplam altında birleştirilmemesi gerektiği görüldü.</w:t>
+        <w:t>Bugün öğünlerdeki değerlerin günlük özette doğru toplanması üzerinde çalıştım. DailyTotals sınıfı seçilen güne ait kayıtları alıyor ve besin ögelerini birleştiriyor. Toplamın anahtarı yalnızca görünen isim değil, besin ögesi kimliği ve birimidir. Gramla miligramı veya farklı anlamdaki kaynak alanlarını kontrolsüz biçimde toplamak, ekranda düzgün biçimlendirilmiş fakat yanlış bir sonuç üretebilir.</w:t>
       </w:r>
     </w:p>
     <w:p>
@@ -2399,7 +2603,7 @@
           <w:sz w:val="24"/>
           <w:lang w:val="tr-TR"/>
         </w:rPr>
-        <w:t>Enerji hesabında kaynakların farklı alan adları kullanabildiği incelendi. Bazı besinlerde doğrudan enerji alanı, bazılarında ise Atwater yöntemleriyle verilen enerji alanları bulunmaktadır. Yalnızca tek bir alan adını toplamanın bazı besinleri dışarıda bırakabileceği; bütün enerji alanlarını birlikte toplamanın da aynı besini iki kez sayabileceği anlaşıldı. Çözüm olarak her besin için uygun enerji değeri seçildikten sonra günlük toplamın oluşturulması ele alındı.</w:t>
+        <w:t>Enerji hesabında karşılaşılan önemli ayrıntı, USDA kaynaklarının aynı bilgiyi farklı alanlarda taşıyabilmesiydi. Bir besinde Energy, diğerinde Energy (Atwater Specific Factors) bulunabiliyor. Önce bütün alanları topladıktan sonra yalnızca Energy alanını seçmek, diğer besinin kalorisini kaybettiriyordu. Çözümde her DiaryEntry için öncelikle geçerli enerji alanını seçtim; günlük toplamı daha sonra bu tekil kalori değerlerinden oluşturdum.</w:t>
       </w:r>
     </w:p>
     <w:p>
@@ -2416,7 +2620,24 @@
           <w:sz w:val="24"/>
           <w:lang w:val="tr-TR"/>
         </w:rPr>
-        <w:t>Bu davranış, farklı enerji alanlarına sahip örnek kayıtlar üzerinden test kapsamına alındı. Besin ekleme, miktar düzenleme ve silme işlemlerinin toplamları tutarlı biçimde değiştirmesi incelendi. Sayıların kullanıcıya okunabilir biçimde yuvarlanması ile hesaplama sırasında kullanılan değerlerin birbirinden ayrılması gerektiği değerlendirildi. Günün sonunda doğru toplam üretmenin basit bir toplama işleminden daha fazlası olduğu; kaynak alanlarının anlamının ve her kaydın hesaplama temelinin bilinmesi gerektiği görüldü.</w:t>
+        <w:t>Regresyon testindeki sayısal örneği adım adım inceledim. İlk kayıtta Energy 52 kcal; ikinci kayıtta özel Atwater 80 kcal ve genel Atwater 90 kcal bulunuyor. Beklenen sonuç 52 + 80 = 132 kcal'dir. İkinci besinin iki alternatif enerji alanını birlikte saymak 222 kcal üretir; yalnızca düz Energy alanını almak ise 52 kcal bırakır. Bu örnek, hatanın toplama işleminden çok doğru alanın hangi aşamada seçildiğiyle ilgili olduğunu gösteriyor.</w:t>
+      </w:r>
+    </w:p>
+    <w:p>
+      <w:pPr>
+        <w:widowControl/>
+        <w:spacing w:after="260" w:before="0" w:line="293" w:lineRule="auto"/>
+        <w:jc w:val="both"/>
+      </w:pPr>
+      <w:r>
+        <w:rPr>
+          <w:rFonts w:ascii="Arial" w:hAnsi="Arial"/>
+          <w:b w:val="0"/>
+          <w:color w:val="000000"/>
+          <w:sz w:val="24"/>
+          <w:lang w:val="tr-TR"/>
+        </w:rPr>
+        <w:t>Protein, karbonhidrat ve yağ toplamlarını da seçilen güne ait kayıtlar üzerinden hesapladım. Model testi, 100 ve 50 gramlık kontrollü elma kayıtlarının toplam enerjisinin 78 kcal olduğunu doğruluyor. Kullanıcı başka güne geçtiğinde aynı kayıtların yanlışlıkla toplamda kalmaması gerekiyor. Gün sonunda veri kaynaklarının farklı adlandırmalarını dikkate almadan yapılan toplamanın eksik veya çift sayım yaratabileceğini öğrendim; testte beklenen sayıyı elle hesaplamak bu tür hataları görünür kılıyor.</w:t>
       </w:r>
     </w:p>
     <w:p>
@@ -2469,7 +2690,7 @@
           <w:sz w:val="24"/>
           <w:lang w:val="tr-TR"/>
         </w:rPr>
-        <w:t>Bu çalışma gününde günlük kayıtlardan oluşan ayrıntılı besin ögesi raporu incelendi. Kullanıcının yalnızca kalori toplamını değil, kaydedilen besinlerde bulunan diğer bileşenleri de görebilmesi amaçlandı. Besin ögelerinin gruplar hâlinde gösterilmesi ve birimlerinin korunması, uzun bir listenin daha okunabilir olmasını sağladı. Henüz kayıt bulunmayan günlerde boş bir tablo yerine açıklayıcı bir görünüm kullanılması değerlendirildi.</w:t>
+        <w:t>Bugün besin ögesi raporunu ve yapay zekâya gönderilen günlük özeti çalıştım. Enerji ve makro besinlerin yanında vitaminler, mineraller ve lif gibi değerler de gösteriliyor. Burada en önemli konu, kaynakta bulunmayan bir değerle gerçekten sıfır ölçülmüş bir değeri ayırmaktı. Bir besinin D vitamini bilgisi yoksa bunu “D vitamini tüketilmedi” diye yorumlamak doğru değildir.</w:t>
       </w:r>
     </w:p>
     <w:p>
@@ -2486,7 +2707,7 @@
           <w:sz w:val="24"/>
           <w:lang w:val="tr-TR"/>
         </w:rPr>
-        <w:t>Eksik kaynak verisi ile gerçek sıfır değerinin aynı anlama gelmediği üzerinde duruldu. Bir besinin vitamin bilgisi veri kaynağında bulunmuyorsa, bundan o vitaminin hiç alınmadığı sonucu çıkarılamaz. Özellikle yapay zekâya gönderilen günlük bağlamda, eksik ölçümlerin boş değer olarak ve veri kapsamını açıklayan sayılarla temsil edilmesi incelendi. Farklı mikrogram yazımlarının aynı birimi ifade edebileceği de birim normalleştirme konusu olarak ele alındı.</w:t>
+        <w:t>CoachService içindeki _nutrientMetric yönteminde önce her kayıtta ilgili ad ve birime sahip alanı aradım. Alan bulunan kayıt sayısı ayrıca tutuluyor; hiç değer bulunmazsa amount null gönderiliyor. Değer varsa bilinen miktarlar toplanıyor ve toplam kaç besinden kaçında veri bulunduğu bağlama ekleniyor. Böylece model yalnızca miktarı değil, o miktarın eksik kapsama dayanıp dayanmadığını da görebiliyor.</w:t>
       </w:r>
     </w:p>
     <w:p>
@@ -2503,7 +2724,24 @@
           <w:sz w:val="24"/>
           <w:lang w:val="tr-TR"/>
         </w:rPr>
-        <w:t>Günlük hedeflerin ekrandaki toplamlarla karşılaştırılmasının kullanıcıya genel bir fikir verdiği, ancak tıbbi değerlendirme yerine geçmediği belirtildi. Günlüğün eksik doldurulması veya kaynakta bazı değerlerin bulunmaması sonuçların yorumunu sınırlandırmaktadır. Bu nedenle raporun sunduğu bilgi ile sunmadığı kesinlik birbirinden ayrıldı. Çalışma, veri görselleştirmenin yalnızca değerleri listelemek değil, kullanıcının bu değerleri yanlış yorumlamasını önleyecek bağlamı da sağlamak olduğunu gösterdi.</w:t>
+        <w:t>Testte üç günlük kayıt kullanılıyor: birinde 5 mikrogram D vitamini, ikincisinde sıfır, üçüncüsünde ise hiç alan bulunmuyor. Beklenen toplam 5, bilinen kayıt sayısı 2 ve toplam kayıt sayısı 3. Aynı örnekte kalsiyum bilgisi hiç yoksa null kalıyor. Mikrogram için µg, ug ve mcg gibi farklı yazımların aynı birime dönüştürülmesi de kontrol ediliyor. Sıfırın veri olarak korunması, eksik bilgiyle karıştırılmaması açısından önemliydi.</w:t>
+      </w:r>
+    </w:p>
+    <w:p>
+      <w:pPr>
+        <w:widowControl/>
+        <w:spacing w:after="260" w:before="0" w:line="293" w:lineRule="auto"/>
+        <w:jc w:val="both"/>
+      </w:pPr>
+      <w:r>
+        <w:rPr>
+          <w:rFonts w:ascii="Arial" w:hAnsi="Arial"/>
+          <w:b w:val="0"/>
+          <w:color w:val="000000"/>
+          <w:sz w:val="24"/>
+          <w:lang w:val="tr-TR"/>
+        </w:rPr>
+        <w:t>Raporun açıklamalarında mevcut günlük değerlerini kişisel tıbbi tanı gibi sunmamaya dikkat ettim. Uygulamada kullanılan genel referanslarla kişinin elle belirlediği hedefleri ayırdım; düşük görünen bir günlük toplam tek başına beslenme yetersizliği kanıtı değildir. Bu çalışma bana raporlama kalitesinin yalnızca çok sayıda gösterge eklemek olmadığını öğretti. Bilginin kaynağını, birimini ve eksik kalan kısmını açıklamak, sonucun kullanıcı tarafından doğru anlaşılması için gereklidir.</w:t>
       </w:r>
     </w:p>
     <w:p>
@@ -2556,7 +2794,7 @@
           <w:sz w:val="24"/>
           <w:lang w:val="tr-TR"/>
         </w:rPr>
-        <w:t>Bugünkü çalışma, kullanıcının günlük hedeflerini ve uygulama tercihlerini yönetmesi üzerine yapıldı. Kalori, protein, karbonhidrat ve yağ hedeflerinin ayarlar ekranında düzenlenebilmesi incelendi. Form alanlarının geçerli sayısal değerler üretmesi gerektiği üzerinde duruldu. Boş, negatif veya geçersiz girişlerin hesaplamalara aktarılmaması; uygun hata mesajlarının ilgili alanın yanında gösterilmesi hedeflendi.</w:t>
+        <w:t>Bugün kullanıcının enerji, protein, karbonhidrat ve yağ hedeflerini değiştirdiği ayarlar üzerinde çalıştım. NutritionTargets bu değerleri ortak modelde tutuyor; günlüğün ilerleme göstergeleri ve öneri bağlamı aynı hedefleri kullanıyor. Formun yalnızca sayı kabul etmesi yeterli değildi. Sıfır, negatif veya sonlu olmayan değerleri engellemek, hem anlamsız hedefleri hem de oran hesaplamalarında oluşabilecek sorunları önlemek için gerekliydi.</w:t>
       </w:r>
     </w:p>
     <w:p>
@@ -2573,7 +2811,7 @@
           <w:sz w:val="24"/>
           <w:lang w:val="tr-TR"/>
         </w:rPr>
-        <w:t>Hedeflerin yalnızca ekranda tutulması yerine yerel depolamaya kaydedilmesi ele alındı. Böylece uygulama tekrar açıldığında aynı değerlerin kullanılabilmesi sağlanmaktadır. Başka bir ekranda beslenme şablonu uygulandığında ayarlar alanlarının eski sayıları göstermesi sorunu incelendi. Hedefler gerçekten değiştiğinde metin alanlarının güncellenmesi, buna karşılık kullanıcının ilgisiz ve henüz kaydedilmemiş girişlerinin korunması gerektiği görüldü. Bu ayrım, otomatik güncellemenin kullanıcı düzenlemesini ezmemesi açısından önemlidir.</w:t>
+        <w:t>AppController.updateTargets içinde bütün hedefleri doğrulayıp sonrasında ortak durumu güncelledim. Yeni değerlerle birlikte günlük öneri önbelleği de temizleniyor. Eski hedefe göre hazırlanmış bir önerinin, yeni hedef seçildiğinde güncelmiş gibi görünmesini istemedim. Değişikliğin yalnızca bellekte değil yerel saklamada da uygulanması, uygulama yeniden açıldığında eski önerinin geri gelmesini önlüyor.</w:t>
       </w:r>
     </w:p>
     <w:p>
@@ -2590,7 +2828,24 @@
           <w:sz w:val="24"/>
           <w:lang w:val="tr-TR"/>
         </w:rPr>
-        <w:t>Profilde yer alan genel amaçların öneri bağlamına aktarılması da değerlendirildi. Kilo yönetimi veya performans gibi bir hedef seçilmesi, tek başına kişiye özgü enerji ihtiyacının hesaplandığı anlamına gelmemektedir. Mevcut uygulama kullanıcı tarafından belirlenen enerji hedefini temel almaktadır. Günün sonunda hedef yönetiminin; giriş doğrulama, kalıcı saklama ve farklı ekranlar arasında tutarlılık gerektiren ortak bir uygulama özelliği olduğu anlaşıldı.</w:t>
+        <w:t>Ayar formunda daha ince bir eşitleme sorununu ele aldım. Diyet değişirse hedef alanlarının yeni değerleri göstermesi gerekiyor; fakat kullanıcı bir alana henüz kaydetmediği sayı yazarken ilgisiz günlük değişikliği bu metni ezmemeli. Bu nedenle formu her denetleyici bildiriminde baştan doldurmak yerine, ilgili hedef veya profil değişikliğini ayırt eden davranışı kullandım. Kullanıcının yazdığı geçici metinle kaydedilmiş hedef farklı durumlar olarak ele alındı.</w:t>
+      </w:r>
+    </w:p>
+    <w:p>
+      <w:pPr>
+        <w:widowControl/>
+        <w:spacing w:after="260" w:before="0" w:line="293" w:lineRule="auto"/>
+        <w:jc w:val="both"/>
+      </w:pPr>
+      <w:r>
+        <w:rPr>
+          <w:rFonts w:ascii="Arial" w:hAnsi="Arial"/>
+          <w:b w:val="0"/>
+          <w:color w:val="000000"/>
+          <w:sz w:val="24"/>
+          <w:lang w:val="tr-TR"/>
+        </w:rPr>
+        <w:t>Regresyon testi, diyet değişince formun güncellenmesini ve ilgisiz bildirimde kaydedilmemiş metnin korunmasını birlikte denetliyor. Ayrıca kişisel hedef değişiminin günlük öneriyi yeniden yüklenen denetleyicide de geçersiz bırakması sınanıyor. Gün sonunda durum yönetiminin yalnızca ortak değerleri paylaşmak olmadığını gördüm. Bir ekranın geçici kullanıcı girdisini korurken dışarıdan gelen gerçek değişikliklere uyum sağlaması, doğru form davranışının önemli bir parçasıdır.</w:t>
       </w:r>
     </w:p>
     <w:p>
@@ -2643,7 +2898,7 @@
           <w:sz w:val="24"/>
           <w:lang w:val="tr-TR"/>
         </w:rPr>
-        <w:t>Bu çalışma gününde sesle besin kaydı özelliğinin cihaz tarafı incelendi. Kullanıcının birden fazla besini tek cümlede söyleyebilmesi için mikrofon kaydı başlatan bir ekran oluşturuldu. Kayıttan önce uygulama içi bilgilendirme ile Android mikrofon izninin farklı işlemler olduğu değerlendirildi. Kullanıcının izin vermemesi durumunda uygulamanın çökmeden elle arama seçeneğini sunması gerektiği belirtildi.</w:t>
+        <w:t>Bugün sesli besin kaydının telefon tarafındaki başlangıcını geliştirdim. Mikrofon işlemlerini doğrudan ekranın içine yerleştirmek yerine VoiceRecorderSession arayüzü üzerinden yönettim. Bu arayüz başlatma, durdurma, iptal ve geçici dosyayı silme işlemlerini tanımlıyor. OpenNutriVoiceRecorder gerçek mikrofonu kullanırken testlerde aynı arayüzü uygulayan sahte kayıt nesnesi verilebiliyor. Böylece ekran davranışını sınamak için her seferinde gerçek ses kaydetmek gerekmiyor.</w:t>
       </w:r>
     </w:p>
     <w:p>
@@ -2660,7 +2915,7 @@
           <w:sz w:val="24"/>
           <w:lang w:val="tr-TR"/>
         </w:rPr>
-        <w:t>Ses kaydı için record paketi ve geçici dosya konumu için path_provider kullanımı ele alındı. Kayıt, tek kanallı ve 16 kHz örnekleme hızına sahip WAV dosyası olarak hazırlanmıştır. Bu seçim, konuşma çözümleme servisine gönderilecek sesin tutarlı biçimde üretilmesini sağlamaktadır. Kullanıcı kayıt yaparken sesin sürekli olarak sunucuya aktarılmadığı; gönderimin kayıt tamamlandıktan sonra gerçekleştirildiği incelendi. Böylece kayıt alma ile ağ üzerinden çözümleme aşamaları birbirinden ayrıldı.</w:t>
+        <w:t>Kayıt başlamadan önce record paketinin izin kontrolünü kullandım. İzin verilmemişse durum permissionDenied olarak değişiyor ve kullanıcıya mikrofon izni gerektiği açıklanıyor. Bu hata, besin servisinin çalışmamasıyla aynı mesaj altında gösterilmiyor. Kullanıcı sesli kaydı kullanmak istemezse elle aramaya geçebiliyor. İzin reddini, uygulamanın bütün günlük işlevlerini durduran bir durum hâline getirmemeye dikkat ettim.</w:t>
       </w:r>
     </w:p>
     <w:p>
@@ -2677,7 +2932,24 @@
           <w:sz w:val="24"/>
           <w:lang w:val="tr-TR"/>
         </w:rPr>
-        <w:t>Kayıt ekranında boşta, kaydediliyor, durduruldu, izin verilmedi ve hata gibi durumların ayrı temsil edilmesi ele alındı. Düğmelerin bu duruma göre davranması, aynı anda çelişen işlemler başlatılmasını önlemektedir. Kayıt sırasında geçen süre ve ses düzeyinin gösterilmesi kullanıcıya geri bildirim sağlamaktadır. Günün sonunda mikrofon erişiminin yalnızca bir paket çağrısından ibaret olmadığı; izin, dosya yönetimi ve kullanıcı arayüzüyle birlikte tasarlanması gerektiği görüldü.</w:t>
+        <w:t>Ses dosyasını uygulamanın geçici dizininde, zaman bilgisinden üretilmiş bir adla oluşturdum. Kayıt ayarları WAV biçimi, 16.000 Hz örnekleme ve tek kanaldır. Bu seçim, konuşma için sınırlı büyüklükte ve servis tarafından işlenebilir bir dosya hazırlıyor. Ses seviyesini 100 milisaniyede bir dinleyerek kayıt ekranının güncellenmesini sağladım; bu seviye bilgisi bir sonraki aşamadaki sessizlik algılamasında da kullanılıyor.</w:t>
+      </w:r>
+    </w:p>
+    <w:p>
+      <w:pPr>
+        <w:widowControl/>
+        <w:spacing w:after="260" w:before="0" w:line="293" w:lineRule="auto"/>
+        <w:jc w:val="both"/>
+      </w:pPr>
+      <w:r>
+        <w:rPr>
+          <w:rFonts w:ascii="Arial" w:hAnsi="Arial"/>
+          <w:b w:val="0"/>
+          <w:color w:val="000000"/>
+          <w:sz w:val="24"/>
+          <w:lang w:val="tr-TR"/>
+        </w:rPr>
+        <w:t>Kayıt durumlarını boşta, kaydediyor, durdu, izin reddedildi ve hata şeklinde ayırdım. Kayıt başlatılamadığında geçici dosya temizleniyor ve ekran uygun duruma dönüyor. Dosya tamamlandıktan sonra çözümleme isteğine geçiliyor; uygulama sürekli açık mikrofonla arka planda konuşma göndermiyor. Gün sonunda bir cihaz özelliğini eklerken yalnızca başarılı başlatmayı değil, izinleri, ekran durumunu, dosya yaşam döngüsünü ve test edilebilirliği birlikte düşünmem gerektiğini öğrendim.</w:t>
       </w:r>
     </w:p>
     <w:p>
@@ -2730,7 +3002,7 @@
           <w:sz w:val="24"/>
           <w:lang w:val="tr-TR"/>
         </w:rPr>
-        <w:t>Bugünkü çalışmada ses kaydının ne zaman bitirileceği ele alındı. Kullanıcının her kayıt sonunda tekrar düğmeye basmasını azaltmak için sessizlik algılama yaklaşımı incelendi. Ses düzeyi belirli aralıklarla izlenmekte ve konuşma sonrasındaki kesintisiz sessizlik süresi değerlendirilmektedir. Uygulamanın mevcut kayıt ayarında yaklaşık 1,6 saniyelik son sessizlik kaydı durdurabilmektedir. İlk anda oluşan kısa sessizliğin kaydı hemen bitirmemesi için başlangıç payı bulunduğu görüldü.</w:t>
+        <w:t>Bugün kullanıcının konuşmayı bitirdiğinde kaydın otomatik durmasını sağlayan mantık üzerinde çalıştım. Amaç, kişinin her seferinde durdurma düğmesini aramak zorunda kalmamasıydı. SilenceStopDetector ses seviyesini geçen süreyle birlikte değerlendiriyor. Başlangıçtaki kısa duraksamanın kayıt sonu sanılmaması için ilk 800 milisaniyede sessizlik nedeniyle durdurma kararı verilmiyor.</w:t>
       </w:r>
     </w:p>
     <w:p>
@@ -2747,7 +3019,7 @@
           <w:sz w:val="24"/>
           <w:lang w:val="tr-TR"/>
         </w:rPr>
-        <w:t>Sessizlik denetimine ek olarak otuz saniyelik üst kayıt sınırı ele alındı. Bu sınır, kontrolsüz biçimde uzun ses dosyaları oluşmasını önlemeyi amaçlamaktadır. Elle durdurma, zamanlayıcı ve sessizlik algılama aynı anda tetiklenebileceğinden, durdurma işleminin tekrar tekrar çalışmaması için durum koruması kullanıldığı incelendi. Zamanlayıcıların ve ses düzeyi dinleyicilerinin kapatılması da kaynak yönetiminin bir parçası olarak değerlendirildi.</w:t>
+        <w:t>Gerçek kayıt sınıfında eşik -40 dBFS, konuşma sonrasındaki sessizlik süresi 1,6 saniye olarak ayarlanmış. Eşiğin üstünde ses algılandığında sessizliğin başlangıcı sıfırlanıyor; düşük seviye yeterince uzun sürerse stop çağrılıyor. Buna ek olarak 30 saniyelik kesin süre sınırı bulunuyor. Böylece gürültülü ortamda sessizlik algılanmasa bile tek kaydın süresi sınırsız büyümüyor. Bu eşiklerin basit ses seviyesi mantığı olduğunu, kusursuz konuşma tanıma anlamına gelmediğini öğrendim.</w:t>
       </w:r>
     </w:p>
     <w:p>
@@ -2764,7 +3036,24 @@
           <w:sz w:val="24"/>
           <w:lang w:val="tr-TR"/>
         </w:rPr>
-        <w:t>Geçici WAV dosyasının normal başarı, hata veya iptal sonrasında temizlenmesi üzerinde duruldu. Bunun, uygulama sürecinin beklenmedik biçimde sonlandırıldığı her durumda temizliğin kanıtlandığı anlamına gelmediği not edildi. Sessizlik algılayıcısının arayüzden bağımsız bir yapı olarak ele alınması test yazımını kolaylaştırmaktadır. Çalışma sonucunda otomatik durdurmanın kullanım hızını artırırken, yaşam döngüsü ve dosya yönetimi bakımından dikkatli tasarlanması gerektiği anlaşıldı.</w:t>
+        <w:t>Durdurma işleminin hem düğmeden hem zamanlayıcıdan tetiklenebilmesini dikkate aldım. _stopping işareti aynı dosyanın iki kez durdurulmasını sınırlıyor. Kayıt bittiğinde ses seviyesi aboneliği ve zamanlayıcı kapatılıyor; iptal veya işleme sonrasında geçici dosya siliniyor. Kaynakları yalnızca başarılı yolda temizlemek yeterli olmadığından hata ve iptal yollarını da takip ettim. İşletim sistemi süreci aniden sonlandırırsa bu temizliğin garantili olmadığını ayrıca not ettim.</w:t>
+      </w:r>
+    </w:p>
+    <w:p>
+      <w:pPr>
+        <w:widowControl/>
+        <w:spacing w:after="260" w:before="0" w:line="293" w:lineRule="auto"/>
+        <w:jc w:val="both"/>
+      </w:pPr>
+      <w:r>
+        <w:rPr>
+          <w:rFonts w:ascii="Arial" w:hAnsi="Arial"/>
+          <w:b w:val="0"/>
+          <w:color w:val="000000"/>
+          <w:sz w:val="24"/>
+          <w:lang w:val="tr-TR"/>
+        </w:rPr>
+        <w:t>Birim testinde gerçek mikrofon yerine belirli zamanlarda verilen -60 ve -20 dBFS değerleri kullanılıyor. Test, başlangıç fırsatını ve yeniden yükselen sesin sessizlik sayacını sıfırlamasını kontrol ediyor. Test nesnesinin varsayılan son sessizliği 2 saniyedir; gerçek kaydedici bunu 1,6 saniyeye ayarlar. Bu ayrımı görmek, testteki sayıyı doğrudan çalışma ayarı sanmamayı öğretti. Gün sonunda zamanlayıcılarla çalışan bir özellikte süre, eşik ve kaynak temizliğinin birlikte değerlendirilmesi gerektiğini anladım.</w:t>
       </w:r>
     </w:p>
     <w:p>
@@ -2817,7 +3106,7 @@
           <w:sz w:val="24"/>
           <w:lang w:val="tr-TR"/>
         </w:rPr>
-        <w:t>Bu çalışma gününde tamamlanan ses dosyasının uygulamadan çözümleme servisine gönderilmesi incelendi. VoiceApiClient sınıfında ses dosyasının çok parçalı bir HTTP isteğine eklenmesi ele alındı. Sesle birlikte dil ipucu, yerel zaman ve saat dilimi bilgisi de gönderilmektedir. Dil ipucunun desteklenen Türkçe ve İngilizce cihaz ayarlarından seçilmesi, konuşmanın yorumlanmasına yardımcı olan bir bağlam olarak değerlendirildi.</w:t>
+        <w:t>Bugün tamamlanmış ses dosyasını mevcut çözümleme servisine gönderen mobil istemciyi çalıştım. VoiceApiClient, doğrudan Gemini'ye gizli anahtarla bağlanmak yerine uygulamaya ayrılmış kimlik doğrulama oturumunu kullanıyor. Oturum yoksa anonim giriş yapılıyor ve erişim belirteci Authorization: Bearer başlığına ekleniyor. Buradaki anonimliğin ses içeriğinde kişisel bilgi bulunamayacağı anlamına gelmediğini, yalnızca kullanıcıya ayrı bir hesap formu açılmadığını ayırdım.</w:t>
       </w:r>
     </w:p>
     <w:p>
@@ -2834,7 +3123,7 @@
           <w:sz w:val="24"/>
           <w:lang w:val="tr-TR"/>
         </w:rPr>
-        <w:t>Servisin anonim oturum üzerinden alınan erişim belirteciyle çağrılması incelendi. Buradaki anonim oturumun, kullanıcıya zorunlu bir e-posta ve parola formu göstermeden isteklerin kimliğini ve sınırlarını yönetmeye yaradığı görüldü. Genel besin araması ile yetkilendirilmiş yapay zekâ istekleri ayrı tutulmaktadır. Gemini gizli anahtarının mobil uygulamaya yerleştirilmemesi, sunucu tarafındaki gizli bilgilerle istemcide kullanılabilen yapılandırmanın ayrılmasını sağlamaktadır.</w:t>
+        <w:t>POST /v1/voice/resolve isteğini multipart biçiminde hazırladım. Dosya audio alanına meal.wav adı ve audio/wav içerik türüyle ekleniyor. language_hint, local_timestamp ve timezone alanları konuşmanın dili ve zaman bağlamını taşıyor. İngilizce ve Türkçe cihaz yerelleri desteklenen ipuçlarına dönüştürülüyor; diğerlerinde otomatik dil seçimi isteniyor. Dosya 1 MB sınırını aşıyorsa gönderimden önce hata veriliyor.</w:t>
       </w:r>
     </w:p>
     <w:p>
@@ -2851,7 +3140,24 @@
           <w:sz w:val="24"/>
           <w:lang w:val="tr-TR"/>
         </w:rPr>
-        <w:t>İstek gönderilmeden önce dosya boyutunun kontrol edilmesi ve yanıtın tamamının alınmasına süre sınırı uygulanması ele alındı. Yalnızca HTTP başlıklarının gelmesi, yanıt gövdesinin de tamamlandığı anlamına gelmemektedir. Kimlik doğrulama hatası, zaman aşımı ve geçersiz yanıtın farklı durumlar olarak ele alınması gerektiği görüldü. Bu çalışma, ses kaydını ağ isteğine dönüştürürken dosya, bağlam, güvenlik ve süre yönetiminin birlikte düşünülmesini sağladı.</w:t>
+        <w:t>Beklemeyi azaltmak için kayıt başlarken oturum ve servis hazırlığının da başlatılmasını inceledim. warmUp başarısız olursa mikrofon kaydı engellenmiyor; asıl isteğin hata yönetimi daha sonra devreye giriyor. Aynı anda birden fazla oturum isteği oluşmasını önlemek için devam eden belirteç isteği paylaşılabiliyor. Belirteç hazırlığına 10 saniye, gönderilen ses isteğinin yanıtını bütünüyle almaya 30 saniye sınır uygulanıyor.</w:t>
+      </w:r>
+    </w:p>
+    <w:p>
+      <w:pPr>
+        <w:widowControl/>
+        <w:spacing w:after="260" w:before="0" w:line="293" w:lineRule="auto"/>
+        <w:jc w:val="both"/>
+      </w:pPr>
+      <w:r>
+        <w:rPr>
+          <w:rFonts w:ascii="Arial" w:hAnsi="Arial"/>
+          <w:b w:val="0"/>
+          <w:color w:val="000000"/>
+          <w:sz w:val="24"/>
+          <w:lang w:val="tr-TR"/>
+        </w:rPr>
+        <w:t>Yanıttan VoiceResolution modeli üretilmesini ve ağ, zaman aşımı, kimlik doğrulama ile beklenmeyen yanıt hatalarının ayrılmasını ele aldım. Sadece HTTP başlığının gelmesi tamamlanma sayılmıyor; yanıt gövdesinin de alınması gerekiyor. Bu çalışma mevcut servisin mobil entegrasyonudur; sunucu altyapısını sıfırdan geliştirme çalışması değildir. Gün sonunda güvenli API kullanımında anahtarların konumu, dosya boyutu, istek bağlamı ve bekleme sınırlarının birlikte düşünülmesi gerektiğini öğrendim.</w:t>
       </w:r>
     </w:p>
     <w:p>
@@ -2904,7 +3210,7 @@
           <w:sz w:val="24"/>
           <w:lang w:val="tr-TR"/>
         </w:rPr>
-        <w:t>Bugünkü çalışma, ses servisinden dönen bilginin mobil uygulamada kullanılması üzerine yapıldı. Bir konuşmanın yalnızca metne çevrilmesi, günlüğe doğru besin eklemek için yeterli değildir. Metin içinde geçen besin adlarının, miktarların ve hazırlanma bilgilerinin kaynak besinlerle eşleştirilmesi gerektiği değerlendirildi. Mobil tarafta servis yanıtını temsil eden modeller ve aday besinlerin gösterimi incelendi.</w:t>
+        <w:t>Bugün ses servisinin döndürdüğü yanıtı günlükte kullanılabilir besinlere dönüştürdüm. Yanıtta duyulan metin, çözümlenen besinler, aday eşleşmeler, miktar bilgisi ve istek kimliği bulunuyor. Sesin metne doğru çevrilmesiyle doğru besinin seçilmesinin farklı aşamalar olduğunu gördüm. Örneğin bir ifade anlaşılmış olsa bile hazırlanma biçimi veya miktarı belirsiz kalabilir; bu durumda metni kaybetmeden kullanıcıya düzeltme yolu sunmak gerekiyor.</w:t>
       </w:r>
     </w:p>
     <w:p>
@@ -2921,7 +3227,7 @@
           <w:sz w:val="24"/>
           <w:lang w:val="tr-TR"/>
         </w:rPr>
-        <w:t>Servisin döndürdüğü besin kimliği üzerinden mevcut Core ayrıntısının yüklenmesi ele alındı. Besin değerleri bu ayrıntıdan alınmakta, yapay zekânın serbest metninden sayısal beslenme verisi üretilmemektedir. Bir adayın seçilmiş olması ile eşleşmenin tamamen kesin olması farklı kavramlar olarak değerlendirildi. Alternatif adayların veya eksik alanların bulunması, kullanıcıya daha sonra düzeltme imkânı sunulmasını gerektirmektedir. Uygulamada seçimin kaynağı ve inceleme gereksinimi ayrı alanlarla taşınmaktadır.</w:t>
+        <w:t>VoiceResolution ve ilgili alt modeller üzerinden seçilmiş adayla alternatifleri ayırdım. Uygulama besin değerlerini modelin metninden üretmiyor; adayın foodId değeriyle Core ayrıntısını yükleyip kaynak besin ögelerini alıyor. Böylece dil çözümleme sonucu, hesaplama verisinin yerine geçmiyor. Duyulan ifadeyi ve seçilen besini birlikte göstermek, kullanıcıya eşleşmenin doğru olup olmadığını kontrol etme imkânı sağlıyor.</w:t>
       </w:r>
     </w:p>
     <w:p>
@@ -2938,7 +3244,24 @@
           <w:sz w:val="24"/>
           <w:lang w:val="tr-TR"/>
         </w:rPr>
-        <w:t>Çözümleme sonrasında ayrıntı yükleme işlemi başarısız olursa yeniden kayıt yapmadan tekrar deneme yapılabilmesi incelendi. Kullanılabilir konuşma metni elde edilmişse bu metnin hata sırasında tamamen kaybedilmemesi gerektiği üzerinde duruldu. Elle aramaya geçiş, başarısız işlemin ardından kullanıcının görevini sürdürebilmesini sağlamaktadır. Günün sonunda sesli kayıt özelliğinin, konuşma anlama ile doğrulanmış besin seçimini birleştiren çok aşamalı bir kullanıcı akışı olduğu görüldü.</w:t>
+        <w:t>Hızlı akışta önce yalnızca seçilmiş besinlerin ayrıntıları yükleniyor. Kimlikler bir kümeye alınarak aynı besin için tekrarlı ayrıntı isteği azaltılıyor; farklı ayrıntılar Future.wait ile birlikte bekleniyor. Her şey kullanılabilir durumdaysa bütün alternatifleri indirmeden kayda geçiliyor. İnceleme gerektiğinde aday listesi genişletiliyor. Bu düzen, kullanıcının ihtiyaç duymadığı seçenekleri bekleme süresine eklememeyi sağlıyor.</w:t>
+      </w:r>
+    </w:p>
+    <w:p>
+      <w:pPr>
+        <w:widowControl/>
+        <w:spacing w:after="260" w:before="0" w:line="293" w:lineRule="auto"/>
+        <w:jc w:val="both"/>
+      </w:pPr>
+      <w:r>
+        <w:rPr>
+          <w:rFonts w:ascii="Arial" w:hAnsi="Arial"/>
+          <w:b w:val="0"/>
+          <w:color w:val="000000"/>
+          <w:sz w:val="24"/>
+          <w:lang w:val="tr-TR"/>
+        </w:rPr>
+        <w:t>Besin ayrıntısı yüklenemezse konuşma sonucunun tamamen başarısız sayılmamasına dikkat ettim. Ekran, öğünün anlaşıldığını fakat sayısal ayrıntıların yüklenemediğini açıklayabiliyor; yeniden deneme veya elle arama sunuyor. Geçersiz yapılandırılmış yanıt senaryosu da korunabilen konuşma metninin ekranda kalmasını denetliyor. Gün sonunda çok aşamalı bir işlemde her aşamanın sonucunu ayrı tutmanın önemini öğrendim: son adımın hatası, önceki adımda elde edilmiş yararlı bilgiyi silmemelidir.</w:t>
       </w:r>
     </w:p>
     <w:p>
@@ -2991,7 +3314,7 @@
           <w:sz w:val="24"/>
           <w:lang w:val="tr-TR"/>
         </w:rPr>
-        <w:t>Bu çalışma gününde sesli kayıt sonrasındaki onay adımının kullanım süresine etkisi ele alındı. Her öğün için zorunlu bir onay ekranı göstermek yerine, kullanılabilir sonuçların doğrudan günlüğe eklenmesi yaklaşımı incelendi. Otomatik kayıt için bütün öğelerin seçilmiş besini, yüklenmiş ayrıntısı ve geçerli miktarı bulunmalıdır. Bu koşullar sağlandığında kullanıcı sonucu günlükte görüp gerektiğinde değiştirebilmektedir.</w:t>
+        <w:t>Bugün sesli kaydın her başarılı çözümlemeden sonra onay formunda beklemesini kaldıran akış üzerinde çalıştım. Kullanıcının amacı öğünü hızlı eklemek olduğu için, kullanılabilir besinler doğrudan günlüğe yazılıyor. _canInstantLog, grubun boş olmamasını ve bütün öğelerin geçerli olmasını esas alıyor. Burada “geçerli”, seçilmiş Core ayrıntısının, uygun miktarın ve kullanılabilir ağırlık temelinin bulunması anlamına geliyor.</w:t>
       </w:r>
     </w:p>
     <w:p>
@@ -3008,7 +3331,7 @@
           <w:sz w:val="24"/>
           <w:lang w:val="tr-TR"/>
         </w:rPr>
-        <w:t>Belirsiz sonuçların kesin ölçüm gibi gösterilmemesi gerektiği değerlendirildi. Miktar belirtilmemişse mevcut uygulama yüz gramlık başlangıç değeri kullanmakta ve kaydı hızlı tahmin olarak işaretlemektedir. Bu değer kullanıcının gerçekten yüz gram tükettiğine dair bir tespit değildir. Kullanıcının açıkça söylediği miktar ise korunmaktadır. Kaydın sesle oluşturulduğu ve gözden geçirilmesi gerektiği bilgileri, sonraki düzenleme için görünür tutulmaktadır.</w:t>
+        <w:t>Miktar söylenmemişse 100 gram, ağırlık temeli belirtilmemişse yenilebilir ağırlık varsayılanını kullandım. Bu değerleri ölçülmüş bilgi gibi sunmadım; belirsiz eşleşmeler ve varsayılanlar needsReview üzerinden Quick estimate olarak işaretleniyor. Kullanıcı açıkça satın alınan ağırlık belirtmiş fakat seçilen besinde kullanılabilir dönüşüm katsayısı yoksa kayıt engelleniyor. Bir öğe bile kullanılabilir değilse mevcut uygulama bütün grubu incelemeye bırakıyor; kısmi kaydetme kuyruğu bulunmuyor.</w:t>
       </w:r>
     </w:p>
     <w:p>
@@ -3025,7 +3348,24 @@
           <w:sz w:val="24"/>
           <w:lang w:val="tr-TR"/>
         </w:rPr>
-        <w:t>Toplu kayıtta herhangi bir öğe kullanılabilir bir eşleşmeye sahip değilse bütün grubun incelemeye açıldığı görüldü. Mevcut sürümün eşleşen öğeleri kaydedip kalanları ayrı bir arka plan kuyruğuna taşıdığı iddia edilmemektedir. Başarı sonrasında Geri al ve Düzenle seçenekleriyle kullanıcı kontrolünün korunması ele alındı. Bu çalışma, işlem hızını artırmak için doğruluk sorumluluğunu ortadan kaldırmak yerine, belirsizliği açıkça gösteren ve düzeltmeyi kolaylaştıran bir tasarımın önemini ortaya koydu.</w:t>
+        <w:t>Kayıt kimliğini servis requestId değeriyle besinin conceptIndex bilgisini birleştirerek oluşturdum. Aynı yanıt yeniden işlendiğinde aynı kimlik üretilmesi, denetleyicideki tekrar denetiminin çift kayıt oluşmasını önlemesine yardımcı oluyor. Kullanıcı isterse Undo ile grubu kaldırabiliyor veya Edit batch ile değiştirebiliyor. İsteğe bağlı geri bildirim, yerel kayıt tamamlandıktan sonra beklenmeden gönderiliyor; bu ek servis başarısız olsa da kayıt başarısı geri alınmıyor.</w:t>
+      </w:r>
+    </w:p>
+    <w:p>
+      <w:pPr>
+        <w:widowControl/>
+        <w:spacing w:after="260" w:before="0" w:line="293" w:lineRule="auto"/>
+        <w:jc w:val="both"/>
+      </w:pPr>
+      <w:r>
+        <w:rPr>
+          <w:rFonts w:ascii="Arial" w:hAnsi="Arial"/>
+          <w:b w:val="0"/>
+          <w:color w:val="000000"/>
+          <w:sz w:val="24"/>
+          <w:lang w:val="tr-TR"/>
+        </w:rPr>
+        <w:t>Sesli kayıt testlerinde miktarsız yanıtın tahmin olarak eklenmesi, verilen gram miktarının korunması ve geri bildirimin başarı ekranını geciktirmemesi denetleniyor. Düzenleme iptal edildiğinde özgün kayıtların korunması da aynı akışın devamıdır. Gün sonunda hızlı kayıtla doğruluğun birlikte yönetilebileceğini gördüm: kullanılabilir bilgiyi hemen kaydetmek, belirsizliği açık göstermek ve düzeltmeyi kolaylaştırmak, bütün durumlarda onay bekletmekten farklı bir kullanıcı deneyimi sağlıyor.</w:t>
       </w:r>
     </w:p>
     <w:p>
@@ -3078,7 +3418,7 @@
           <w:sz w:val="24"/>
           <w:lang w:val="tr-TR"/>
         </w:rPr>
-        <w:t>Bugünkü çalışmada sesli kayıt ve yapay zekâ önerilerinde hissedilen bekleme süresi incelendi. Kullanıcının beklediği toplam sürenin yalnızca model yanıtından oluşmadığı görüldü. Oturum hazırlığı, ağ isteği, besin ayrıntılarının alınması ve yerel kayıt işlemi de akışa dahildir. Kimlik doğrulama ve servis hazırlığının kayıt sırasında engelleyici olmadan başlatılması, gereksiz beklemeyi azaltan bir yaklaşım olarak ele alındı.</w:t>
+        <w:t>Bugün sesli kayıt ve yapay zekâ ekranlarında beklemenin hangi aşamalardan oluştuğunu araştırdım. Kullanıcının gördüğü toplam süre; kaydın bitmesi, oturum hazırlanması, istek kuyruğu, ses yükleme, model yanıtı ve besin ayrıntılarını alma işlemlerini içerebiliyor. Bu nedenle tek bir zaman aşımı değerini bütün akışın kesin süresi gibi yorumlamadım. Mikrofon açıkken hazırlık yapmak ve yalnızca gerekli ayrıntıları yüklemek, farklı bekleme kaynaklarını azaltan uygulama kararlarıdır.</w:t>
       </w:r>
     </w:p>
     <w:p>
@@ -3095,7 +3435,7 @@
           <w:sz w:val="24"/>
           <w:lang w:val="tr-TR"/>
         </w:rPr>
-        <w:t>Hata mesajlarının gerçek nedeni yansıtması üzerinde duruldu. Kota sınırına ulaşıldığında bağlantı kurulamadı mesajı göstermek, kullanıcıyı yanlış yönlendirmektedir. HTTP 429 yanıtının istek sınırı, bağlantı sorununun ağ hatası ve uzun süren isteğin zaman aşımı olarak ayrıştırılması incelendi. Destek servisindeki sınırlı yedek model davranışının uygulama tarafından doğru gösterilmesi de ele alındı. Yanıtı gerçekten üreten model adının sunulması, farklı bir modelin cevabını ana modelmiş gibi göstermemeyi sağlamaktadır.</w:t>
+        <w:t>Sunucu kullanıcı başına tek etkin yapay zekâ isteğine izin verdiğinden mobilde ortak bir istek sırası kullandım. VoiceApiClient içindeki _serialAi, günlük öneri, Oracle, metin çözümleme ve ses işlemlerini aynı Future zincirine bağlıyor. Bir isteğin hatası zinciri kalıcı olarak durdurmamalı; sonraki işlem çalışabilmelidir. Ekranda henüz açılmamış Oracle için erken istek oluşturmamak da bu sırayı gereksiz doldurmamayı sağlıyor.</w:t>
       </w:r>
     </w:p>
     <w:p>
@@ -3112,7 +3452,24 @@
           <w:sz w:val="24"/>
           <w:lang w:val="tr-TR"/>
         </w:rPr>
-        <w:t>Günlük öneri, Oracle ve sesli işlemlerin ortak bir istek sırasını paylaşması incelendi. Bu yapı aynı kullanıcının eşzamanlı isteklerinin birbirini engellemesini azaltmaktadır; ancak sırada bekleme süresini tamamen ortadan kaldırmamaktadır. Henüz açılmamış bir ekran için gereksiz yapay zekâ isteği yapılmaması değerlendirildi. Çalışma sonucunda performans iyileştirmesinin hız, istek sayısı, hata açıklaması ve kullanıcının devam edebilmesi arasında denge kurmayı gerektirdiği görüldü.</w:t>
+        <w:t>Hata açıklamalarında bağlantı sorunu, zaman aşımı, kimlik doğrulama, kota ve geçersiz yanıtı ayırdım. Özellikle HTTP 429, servise ulaşılamadığını değil istek sınırına takılındığını gösterebilir. Kullanıcıya her durumda “Gemini kullanılamıyor” demek çözüm yolunu belirsizleştiriyordu. Servisin yapılandırılmış tek yedek model denemesinden gelen yanıtta gerçek model adının taşınmasını da kullandım; ekranda her başarılı yanıtı ana model üretmiş gibi göstermedim.</w:t>
+      </w:r>
+    </w:p>
+    <w:p>
+      <w:pPr>
+        <w:widowControl/>
+        <w:spacing w:after="260" w:before="0" w:line="293" w:lineRule="auto"/>
+        <w:jc w:val="both"/>
+      </w:pPr>
+      <w:r>
+        <w:rPr>
+          <w:rFonts w:ascii="Arial" w:hAnsi="Arial"/>
+          <w:b w:val="0"/>
+          <w:color w:val="000000"/>
+          <w:sz w:val="24"/>
+          <w:lang w:val="tr-TR"/>
+        </w:rPr>
+        <w:t>Testte ilk yapay zekâ isteğini bekletip ikinciyi sıraya aldım. İlk yanıt 503 hatasıyla tamamlandığında ikinci isteğin başlayıp yanıt döndürmesi bekleniyor. Oracle ekranındaki ayrı test ise 429 durumunda bağlantı hatası yerine istek sınırı açıklamasını arıyor. Gün sonunda performans ve hata yönetiminin ilişkisini daha iyi anladım: gereksiz istekleri azaltmak kadar, bekleyen veya başarısız işlemin nedenini doğru sınıflandırmak da kullanıcının ne yapacağını anlamasını sağlıyor.</w:t>
       </w:r>
     </w:p>
     <w:p>
@@ -3165,7 +3522,7 @@
           <w:sz w:val="24"/>
           <w:lang w:val="tr-TR"/>
         </w:rPr>
-        <w:t>Bu çalışma gününde kullanıcının uygulama menülerine girmeden sesli kayda ulaşmasını sağlayan Android araç takımı ele alındı. Ana ekrandaki mikrofon düğmesinin, kayıt ekranını açan bir başlangıç noktası olarak kullanılması amaçlandı. Bu özellik Flutter ekranından farklı olarak Android platformunun araç takımı altyapısını gerektirmektedir. Kotlin tarafında VoiceLogWidgetProvider sınıfı ve düğmenin tıklama davranışı incelendi.</w:t>
+        <w:t>Bugün telefonun ana ekranındaki mikrofon araç takımını Flutter uygulamasına bağlayan Android bölümünü çalıştım. Araç takımı uygulama ekranının dışında yaşadığı için yalnızca bir Flutter düğmesi eklemek yeterli değildi. Kotlin tarafındaki VoiceLogWidgetProvider, Android'in AppWidgetProvider yapısını kullanıyor. Görünüm RemoteViews ile hazırlanıyor ve mikrofon düğmesine MainActivity'yi hedefleyen bir PendingIntent atanıyor.</w:t>
       </w:r>
     </w:p>
     <w:p>
@@ -3182,7 +3539,7 @@
           <w:sz w:val="24"/>
           <w:lang w:val="tr-TR"/>
         </w:rPr>
-        <w:t>Araç takımından gelen işlem Intent aracılığıyla MainActivity bileşenine iletilmektedir. Uygulama kapalıyken başlayan açılış ile zaten açık olan uygulamaya gelen yeni isteğin aynı şekilde ele alınamayacağı görüldü. İlk açılıştaki bekleyen işlem ve sonradan gelen yeni Intent ayrı yollar üzerinden alınmaktadır. İşlemin bir kez tüketilmesi, ekran yeniden kurulduğunda aynı sesli kayıt isteğinin tekrar başlamasını engellemektedir.</w:t>
+        <w:t>Tıklama isteğine ACTION_VOICE_LOG eylemini ekledim. MainActivity bu eylemi yakalayıp bekleyen sesli kayıt isteği olarak tutuyor. Uygulama kapalıyken açılmasıyla zaten çalışırken yeni istek alması farklı giriş yollarıdır: ilk durumda başlangıç Intent'i, ikinci durumda onNewIntent kullanılıyor. Aynı eylemin tekrar işlenmemesi için yakalandıktan sonra Intent üzerindeki action temizleniyor; bekleyen işaret tüketildiğinde de sıfırlanıyor.</w:t>
       </w:r>
     </w:p>
     <w:p>
@@ -3199,7 +3556,24 @@
           <w:sz w:val="24"/>
           <w:lang w:val="tr-TR"/>
         </w:rPr>
-        <w:t>Flutter ile Android tarafı arasındaki iletişim için MethodChannel kullanımı değerlendirildi. Kanal üzerinden bekleyen sesli işlem alınmakta ve Flutter kayıt ekranına geçmektedir. Böylece cihaz tarafındaki özellik ile uygulamanın mevcut kayıt akışı yeniden kullanılabilmektedir. Araç takımının yeni bir bağımsız besin günlüğü oluşturmadığı; aynı denetleyici ve yerel saklama yapısını kullandığı belirtildi. Günün sonunda mobil geliştirmede bazı kullanıcı deneyimlerinin ortak arayüz çatısının yanında yerel platform kodu da gerektirdiği görüldü.</w:t>
+        <w:t>Kotlin ile Dart arasındaki haberleşmeyi MethodChannel üzerinden kurdum. org.opennutri.app/voice_widget kanalında Flutter, consumePendingVoiceAction ile bekleyen işlemi alabiliyor; çalışan uygulamaya voiceLogRequested bildirimi gönderilebiliyor. Flutter tarafı mevcut VoiceLogScreen ekranını hızlı kayıt modunda açıyor. Böylece araç takımına özgü ikinci bir kayıt sistemi oluşturmak yerine aynı ses, eşleştirme ve saklama akışı yeniden kullanılıyor.</w:t>
+      </w:r>
+    </w:p>
+    <w:p>
+      <w:pPr>
+        <w:widowControl/>
+        <w:spacing w:after="260" w:before="0" w:line="293" w:lineRule="auto"/>
+        <w:jc w:val="both"/>
+      </w:pPr>
+      <w:r>
+        <w:rPr>
+          <w:rFonts w:ascii="Arial" w:hAnsi="Arial"/>
+          <w:b w:val="0"/>
+          <w:color w:val="000000"/>
+          <w:sz w:val="24"/>
+          <w:lang w:val="tr-TR"/>
+        </w:rPr>
+        <w:t>Native testlerde başlangıç ve yeni Intent yollarının eylemi bir kez tüketmesi denetleniyor. Bu testin telefonun ana ekranına gerçekten araç takımı yerleştirildiğini kanıtlamadığını ayrıca ayırdım. Gün sonunda Flutter ile platform kodunun görev paylaşımını öğrendim: Android ana ekran bileşenini ve açılış isteğini yönetirken, uygulamanın ortak kayıt mantığı Dart tarafında kalıyor. Bir kısa yolun güvenilir olması için sadece ilk açılışın değil, tekrar açılma ve yinelenen istek durumlarının da düşünülmesi gerekiyor.</w:t>
       </w:r>
     </w:p>
     <w:p>
@@ -3448,7 +3822,7 @@
           <w:sz w:val="24"/>
           <w:lang w:val="tr-TR"/>
         </w:rPr>
-        <w:t>Bugünkü çalışmada araç takımının cihazda bulunması ile ana ekrana yerleştirilmesi arasındaki fark ele alındı. Uygulamanın kurulması, araç takımının kullanıcı ana ekranına otomatik eklendiği anlamına gelmemektedir. Ayarlar ekranındaki mikrofon araç takımı ekleme seçeneğiyle Android başlatıcısına yerleştirme isteği gönderilmektedir. Son onayın kullanıcı tarafından verilmesi gerektiği açık bir biçimde anlatıldı.</w:t>
+        <w:t>Bugün araç takımının kullanıcı tarafından bulunmasını ve kayıt sonrası telefonun ana ekranına dönüşünü ele aldım. Uygulamanın kurulmuş olması mikrofonun kendiliğinden ana ekrana yerleştiği anlamına gelmiyor. Ayarlar ekranının üst bölümüne Add microphone widget girişini koyan akışı kullandım. Android tarafında sürüm ve başlatıcının pinleme desteği kontrol edilerek requestPinAppWidget çağrılıyor; yerleştirme için kullanıcının onayı gerekiyor.</w:t>
       </w:r>
     </w:p>
     <w:p>
@@ -3465,7 +3839,7 @@
           <w:sz w:val="24"/>
           <w:lang w:val="tr-TR"/>
         </w:rPr>
-        <w:t>Doğrudan yerleştirmeyi desteklemeyen başlatıcılar için elle ekleme açıklamaları incelendi. Kullanıcının ana ekranda boş alana basılı tutarak araç takımları listesinden OpenNutri'yi seçmesi alternatif yol olarak sunulmaktadır. Yerleştirme isteğinin kabul edilmesiyle araç takımının gerçekten yerleştirilmesinin aynı başarı ölçütü olmadığı görüldü. Bu nedenle uygulamanın yanıltıcı bir tamamlandı mesajı vermemesi üzerinde duruldu.</w:t>
+        <w:t>İstek kabul edilse bile kullanıcının ekleme penceresini iptal edebileceğini dikkate aldım. Bu yüzden yöntemden dönen true değerini “araç takımı eklendi” diye yorumlamadım. Destek yoksa ana ekranda boş alana uzun basma, Widgets bölümünü açma ve OpenNutri mikrofonunu seçme adımları açıklanıyor. Kurulum testleri desteklenen ve desteklenmeyen yanıtları taklit ederek uygulamanın uygun yönlendirmeyi gösterdiğini denetliyor.</w:t>
       </w:r>
     </w:p>
     <w:p>
@@ -3482,7 +3856,24 @@
           <w:sz w:val="24"/>
           <w:lang w:val="tr-TR"/>
         </w:rPr>
-        <w:t>Araç takımından başlayan kaydın her zaman bugünün günlüğüne yönlendirilmesi ve yerel saklama tamamlandıktan sonra kısa bir bildirimle kapanması ele alındı. İsteğe bağlı geri bildirim gönderiminin bu kapanışı bekletmemesi sağlanmaktadır. Kullanıcı düzenleme veya geri alma seçerse otomatik kapanışın iptal edilmesi incelendi. Mevcut özellik, uygulama kapatıldıktan sonra işi sürdüren kalıcı bir arka plan sistemi değildir. Günün sonunda araç takımı deneyiminin başlangıç, kullanıcı onayı, kayıt ve güvenli kapanış adımlarının birlikte ele alınması gerektiği anlaşıldı.</w:t>
+        <w:t>Hızlı kayıt açılırken günlük tarihini bugüne aldım. Uygulama daha önce geçmiş bir günü gösteriyor olsa da ana ekran mikrofonundan söylenen yeni öğün o eski güne yazılmamalı. Kayıt tamamlandığında Flutter önce addEntries sonucunu bekliyor, ardından kısa başarı görünümünden sonra finishQuickCapture çağırıyor. Kotlin tarafı eklenen besin sayısını Toast ile gösterip finishAndRemoveTask üzerinden uygulama görevini kapatıyor.</w:t>
+      </w:r>
+    </w:p>
+    <w:p>
+      <w:pPr>
+        <w:widowControl/>
+        <w:spacing w:after="260" w:before="0" w:line="293" w:lineRule="auto"/>
+        <w:jc w:val="both"/>
+      </w:pPr>
+      <w:r>
+        <w:rPr>
+          <w:rFonts w:ascii="Arial" w:hAnsi="Arial"/>
+          <w:b w:val="0"/>
+          <w:color w:val="000000"/>
+          <w:sz w:val="24"/>
+          <w:lang w:val="tr-TR"/>
+        </w:rPr>
+        <w:t>Testte yerel saklamayı yapay olarak bekleterek kapanış çağrısının erken gelmediğini kontrol ettim. Saklama tamamlanınca kapanışa izin verilmesi, “söyle ve dön” akışının veri kaybetmeden tamamlanmasını sağlıyor. Bu özellik görünür kayıt ekranını kullanıyor; kullanıcı işlem bitmeden kapatırsa arka planda garantili devam eden kuyruk yok. Gün sonunda küçük görünen bir araç takımında bile kurulum, tarih, kalıcılık ve kapanış sırasının ayrı ayrı doğrulanması gerektiğini öğrendim.</w:t>
       </w:r>
     </w:p>
     <w:p>
@@ -3535,7 +3926,7 @@
           <w:sz w:val="24"/>
           <w:lang w:val="tr-TR"/>
         </w:rPr>
-        <w:t>Bu çalışma gününde kullanıcının hazır bir başlangıç düzeni seçebilmesini sağlayan beslenme şablonları incelendi. Dengeli beslenme, Akdeniz, yüksek protein, bitki ağırlıklı, düşük karbonhidrat ve Blue Zones esintili seçenekler uygulama içinde ayrı tanımlar olarak tutulmaktadır. Her şablonda ad, açıklama ve temel makro enerji oranları bulunmaktadır. Bu tanımların tekrar kullanılabilir veri nesneleri olarak düzenlenmesi, arayüzün aynı yapıyla farklı seçenekleri gösterebilmesini sağlamaktadır.</w:t>
+        <w:t>Bugün kişisel hedeflerle birlikte kullanılabilen diyet şablonları üzerinde çalıştım. Uygulamada dengeli, Akdeniz, yüksek proteinli, bitki ağırlıklı, düşük karbonhidratlı keto ve Blue Zones esinli altı seçenek bulunuyor. DietPreset sınıfında ad, açıklama, temel ilkeler ve karbonhidrat/protein/yağ enerji payları tutuluyor. Şablonu yalnızca görsel bir kart olarak değil, hedef hesaplamasına bağlanan veri olarak ele aldım.</w:t>
       </w:r>
     </w:p>
     <w:p>
@@ -3552,7 +3943,7 @@
           <w:sz w:val="24"/>
           <w:lang w:val="tr-TR"/>
         </w:rPr>
-        <w:t>Seçilen şablonun kullanıcının mevcut kalori hedefinden gram hedefleri üretmesi ele alındı. Karbonhidrat ve protein için gram başına dört, yağ için dokuz kilokalorilik dönüşüm kullanımı incelendi. Genel hedefe göre bazı oranların küçük miktarda değiştirilmesiyle kişiselleştirme yapılmaktadır. Hesaplanan değerlerin ayarlar ekranına yansıması ve kullanıcı tarafından daha sonra değiştirilebilmesi değerlendirildi. Şablon seçiminin kullanıcı kontrolünü ortadan kaldırmaması amaçlandı.</w:t>
+        <w:t>targetsForCalories yöntemi kullanıcının mevcut kalori hedefini koruyup makro hedeflerini hesaplıyor. Protein ve karbonhidrat payları 4'e, yağ payı 9'a bölünerek gram değerine çevriliyor. Kodun dengeli şablonunu açıklamak için 2.000 kcal örneğini kullandım: yüzde 25 protein 125 gram, yüzde 45 karbonhidrat 225 gram, yüzde 30 yağ yaklaşık 66,7 gram verir. Bu, şablon hesabını gösteren örnektir; kişiye özel tıbbi öneri değildir.</w:t>
       </w:r>
     </w:p>
     <w:p>
@@ -3569,7 +3960,24 @@
           <w:sz w:val="24"/>
           <w:lang w:val="tr-TR"/>
         </w:rPr>
-        <w:t>Bu özelliğin sınırları açıkça ayrıştırıldı. Şablonlar haftalık yemek listesi veya kişiye özel tıbbi diyet değildir; yaş, boy, kilo ve aktivite üzerinden enerji ihtiyacı hesaplamamaktadır. Serbest metin notları önerilere bağlam sağlamakta, tek başına sayısal hedefleri yeniden hesaplamamaktadır. Günün sonunda basit bir şablon özelliğinin bile veri tanımı, dönüşüm hesabı ve kullanıcıya verilen sözün sınırları bakımından dikkatli tasarlanması gerektiği görüldü.</w:t>
+        <w:t>Hedefe göre yapılan küçük oran değişikliklerini de inceledim. Kas geliştirme veya yağ kaybı hedefinde, karbonhidrat payı uygun düzeydeyse beş yüzde puanı proteine aktarılıyor. Dengeli örnekte böylece protein 150, karbonhidrat 200 gram olurken toplam enerji korunuyor. Performans hedefinde keto dışındaki uygun şablonlarda yağdan karbonhidrata aktarım yapılıyor. Kullanıcı bu başlangıç değerlerini daha sonra ayarlardan değiştirebiliyor ve serbest açıklama ekleyebiliyor.</w:t>
+      </w:r>
+    </w:p>
+    <w:p>
+      <w:pPr>
+        <w:widowControl/>
+        <w:spacing w:after="260" w:before="0" w:line="293" w:lineRule="auto"/>
+        <w:jc w:val="both"/>
+      </w:pPr>
+      <w:r>
+        <w:rPr>
+          <w:rFonts w:ascii="Arial" w:hAnsi="Arial"/>
+          <w:b w:val="0"/>
+          <w:color w:val="000000"/>
+          <w:sz w:val="24"/>
+          <w:lang w:val="tr-TR"/>
+        </w:rPr>
+        <w:t>personalization_test.dart içindeki senaryo şablonun hedefe uyarlanmasını ve sonradan düzenlenebilmesini kontrol ediyor. Şablon değişikliği, eski günlük önerinin temizlenmesini de tetikliyor. Bu çalışmada otomatik kalori ihtiyacı hesabı veya haftalık menü üretildiğini varsaymadım; mevcut özellik makro oranları ve öneri bağlamını düzenliyor. Gün sonunda kişiselleştirmenin sabit bir listeyi kullanıcıya göstermenin ötesinde, seçimin hesaplamalara ve sonraki ekranlara tutarlı yansımasını gerektirdiğini öğrendim.</w:t>
       </w:r>
     </w:p>
     <w:p>
@@ -3622,7 +4030,7 @@
           <w:sz w:val="24"/>
           <w:lang w:val="tr-TR"/>
         </w:rPr>
-        <w:t>Bugünkü çalışmada uygulama açıldığında sunulan günlük öneri kartı ele alındı. Kullanıcının hedefleri, seçtiği beslenme şablonu ve günlük kayıt özeti bir bağlam olarak hazırlanmaktadır. Bu bağlamı oluşturma görevinin ekran kodundan ayrılarak CoachService üzerinden yürütülmesi incelendi. Öneri alınması, kullanıcı iznine bağlı bir özellik olarak değerlendirilmiştir; yerel günlüğün temel işleyişi için zorunlu değildir.</w:t>
+        <w:t>Bugün uygulama açıldığında gösterilen günlük öneri kartı üzerinde çalıştım. CoachService, kullanıcının seçtiği tarih, hedef, diyet, notlar, açıkça kaydedilmiş tercihleri ve günlük toplamlarından sınırlı bir istek hazırlıyor. Seçilen gündeki son besinler de bağlama ekleniyor; bütün günlük geçmişi gönderilmiyor. Bu düzen, modelin kişiye ve güne uygun öneri verebilmesi için gerekli bilgiyi sınırlı tutmayı amaçlıyor.</w:t>
       </w:r>
     </w:p>
     <w:p>
@@ -3639,7 +4047,7 @@
           <w:sz w:val="24"/>
           <w:lang w:val="tr-TR"/>
         </w:rPr>
-        <w:t>Aynı gün için alınan önerinin sürekli yeniden üretilmemesi amacıyla önbellek kullanımı ele alındı. Ancak önbellekteki metnin başka bir tarihe ait günlükte görünmesi hatalı olacağından, önerinin tarih anahtarıyla birlikte saklanması incelendi. Hedef, profil veya kayıtlı tercihler değiştiğinde eski bağlamın geçersiz sayılması gerektiği görüldü. İstek sürerken kullanıcı bağlamı değiştirirse geç gelen yanıtın yeni ayarların üzerine yazılmaması için güncellik kontrolü kullanıldı.</w:t>
+        <w:t>DailyCoachBrief öneriyi dateKey ile birlikte yerelde saklıyor. Aynı gün için geçerli öneri varsa her ekran açılışında yeniden model çağrısı yapılmıyor. Hedef, diyet veya kayıtlı tercih değiştiğinde önbellek hem bellekten hem diskten temizleniyor. Başka güne geçildiğinde önceki günün kartı gösterilmiyor. Günlükteki her besin düzeltmesinin otomatik yeni çağrı üretmediğini, kartın belirli anda hazırlanmış bir özet olduğunu ayırdım.</w:t>
       </w:r>
     </w:p>
     <w:p>
@@ -3656,7 +4064,24 @@
           <w:sz w:val="24"/>
           <w:lang w:val="tr-TR"/>
         </w:rPr>
-        <w:t>Her besin düzenlemesinin otomatik olarak yeni model isteği başlatmadığı, önerinin bir günlük özet anını temsil ettiği belirtildi. Kullanıcı isterse yenileme yapabilmektedir. Yapay zekâ isteği başarısız olduğunda gösterilen cihaz içi kural tabanlı özetin farklı etiketlenmesi incelendi. Bu çalışma, öneri kalitesinin yalnızca model seçimine değil, gönderilen bağlamın doğruluğuna ve ekranda gösterilen sonucun güncelliğine de bağlı olduğunu ortaya koydu.</w:t>
+        <w:t>İstek devam ederken kullanıcı tarih veya profil değiştirebilir. Bu yüzden istek başlangıcındaki coachContextRevision değeri yanıt geldiğinde tekrar karşılaştırılıyor. Bağlam değişmişse eski yanıt kaydedilmiyor; uygun ekranda güncel bağlamla yenileme yapılabiliyor. Servis kullanılamadığında yerel hedef ilerlemesine dayalı basit öneri hazırlanıyor ve generatedByAi false olarak işaretleniyor. Yerel metni yeni üretilmiş yapay zekâ yanıtı gibi göstermedim.</w:t>
+      </w:r>
+    </w:p>
+    <w:p>
+      <w:pPr>
+        <w:widowControl/>
+        <w:spacing w:after="260" w:before="0" w:line="293" w:lineRule="auto"/>
+        <w:jc w:val="both"/>
+      </w:pPr>
+      <w:r>
+        <w:rPr>
+          <w:rFonts w:ascii="Arial" w:hAnsi="Arial"/>
+          <w:b w:val="0"/>
+          <w:color w:val="000000"/>
+          <w:sz w:val="24"/>
+          <w:lang w:val="tr-TR"/>
+        </w:rPr>
+        <w:t>Önbellek testinde önce öneriyi saklayıp diyet, hedef veya tercih değişikliği uyguladım; ardından yeni denetleyiciyle veriyi tekrar yükleyen senaryoyu değerlendirdim. Eski önerinin null gelmesi, temizliğin yalnızca ekranda yapılmadığını doğruluyor. Tarih testi de kartın yanlış gün altında görünmemesini denetliyor. Gün sonunda önbelleğin yalnızca istek sayısını azaltmak olmadığını öğrendim: hangi bilginin ne zaman geçersiz sayılacağını doğru belirlemek, önerinin anlamını ve güvenilirliğini koruyor.</w:t>
       </w:r>
     </w:p>
     <w:p>
@@ -3709,7 +4134,7 @@
           <w:sz w:val="24"/>
           <w:lang w:val="tr-TR"/>
         </w:rPr>
-        <w:t>Bu çalışma gününde kullanıcının uygulamayla yazılı veya sesli görüşebilmesi ele alındı. Günlük öneri tek yönlü bir özet sunarken, görüşme ekranı kullanıcının ek soru sormasına olanak tanımaktadır. Mesajların kullanıcı ve asistan ayrımıyla gösterilmesi, bekleme durumunun açıklanması ve yanıt sonrasında ilgili önerilerin sunulması incelendi. Sesli görüşmede kayıt akışının tekrar kullanılmasının kod tekrarını azalttığı görüldü.</w:t>
+        <w:t>Bugün kullanıcının koça yazılı veya sesli mesaj gönderebildiği görüşme ekranını çalıştım. Metin gönderiminde baştaki ve sondaki boşlukları temizledim; boş, fazla uzun veya başka gönderim sürerken oluşturulan isteği engelleyen kontrolleri kullandım. Mesaj kutusunu gönderim sırasında temizlemek arayüzü sadeleştiriyor; istek başarısız olursa kullanıcının yeniden yazmak zorunda kalmaması için metin kutuya geri konuluyor.</w:t>
       </w:r>
     </w:p>
     <w:p>
@@ -3726,7 +4151,7 @@
           <w:sz w:val="24"/>
           <w:lang w:val="tr-TR"/>
         </w:rPr>
-        <w:t>Takip sorularının anlaşılabilmesi için sınırlı sayıda önceki mesajın bağlama eklenmesi değerlendirildi. Bunun bütün konuşma geçmişinin kalıcı olarak saklandığı anlamına gelmediği belirtildi. Mevcut uygulamada görüşme geçmişi oturumla sınırlıdır; kullanıcının açıkça ifade ettiği bazı kalıcı tercihler ayrı profil bilgileri olarak korunabilmektedir. Yapay zekânın kendi önerisini kullanıcıya ait bir gerçek gibi kaydetmemesi gerektiği üzerinde duruldu.</w:t>
+        <w:t>Görüşme ile kalıcı tercih belleğini ayrı tuttum. Ekrandaki konuşma geçmişi oturumluktur ve isteğe en fazla son altı mesaj bağlam olarak aktarılıyor. CoachMemory ise açık kullanıcı ifadelerinden çıkarılan kısa bilgileri saklıyor. Örneğin “Et yemiyorum” ifadesi bir tercih adayı olabilir; yalnızca belirli bir besin hakkında soru sormak, kullanıcının onu tükettiğini veya ona alerjisi olduğunu kanıtlamaz. Bu örneği gerçek kullanıcı bilgisi değil, ayrımın açıklaması olarak kullandım.</w:t>
       </w:r>
     </w:p>
     <w:p>
@@ -3743,7 +4168,24 @@
           <w:sz w:val="24"/>
           <w:lang w:val="tr-TR"/>
         </w:rPr>
-        <w:t>Kaydedilen tercihlerin kullanıcıya gösterilmesi ve tek tek silinebilmesi incelendi. Günlük öneri veya Oracle yanıtlarının kendiliğinden yeni kişisel bilgi eklememesi, görüşme ile öneri üretmenin farklı sorumlulukları olarak ele alındı. Kaydetme adaylarının açık kullanıcı ifadesine dayanması yönündeki sınırın büyük ölçüde model talimatıyla sağlandığı ve kusursuz bir anlam denetimi olmadığı not edildi. Günün sonunda kişiselleştirmenin, veri saklamanın yanında görünürlük ve kullanıcı kontrolü gerektirdiği anlaşıldı.</w:t>
+        <w:t>Servisten dönen memoryUpdates alanını profil yönetimine bağladım. Aynı bilginin tekrarlanmasını sınırlayan denetim bulunuyor ve en fazla 30 tercih saklanıyor. Eklenen bilgiler yanıtta gösteriliyor; ayarlardan tek tek silinebiliyor. Silme, sonraki önerilerde gönderilen bağlamı da değiştiriyor. Yalnızca açık ifadeleri kaydetme kuralının model talimatına dayandığını, dilin anlamını kusursuz doğrulayan ayrı bir güvence olmadığını not ettim.</w:t>
+      </w:r>
+    </w:p>
+    <w:p>
+      <w:pPr>
+        <w:widowControl/>
+        <w:spacing w:after="260" w:before="0" w:line="293" w:lineRule="auto"/>
+        <w:jc w:val="both"/>
+      </w:pPr>
+      <w:r>
+        <w:rPr>
+          <w:rFonts w:ascii="Arial" w:hAnsi="Arial"/>
+          <w:b w:val="0"/>
+          <w:color w:val="000000"/>
+          <w:sz w:val="24"/>
+          <w:lang w:val="tr-TR"/>
+        </w:rPr>
+        <w:t>Sesli görüşmede aynı sınırlı kayıt bileşeninden yararlanılıyor, fakat amaç besini günlüğe eklemek değil koça mesaj göndermektir. Geçici dosya işlem sonunda temizleniyor; yanıtta varsa konuşma metni ve cevaplayan model gösteriliyor. Profil testleri saklama ve silme davranışlarını değerlendirmeye yardımcı oluyor. Gün sonunda kişiselleştirmede çok veri toplamanın değil, kullanıcı tarafından ifade edilen yararlı bilgiyi görünür ve yönetilebilir biçimde saklamanın önemli olduğunu öğrendim.</w:t>
       </w:r>
     </w:p>
     <w:p>
@@ -3796,7 +4238,7 @@
           <w:sz w:val="24"/>
           <w:lang w:val="tr-TR"/>
         </w:rPr>
-        <w:t>Bugünkü çalışmada kullanıcının hedeflerine uygun besin fikirleri sunan Oracle ekranı incelendi. Bu ekran, günlük kayıtları ve kişisel tercihleri bağlam olarak kullanarak öneriler oluşturmaktadır. Her önerinin yalnızca açıklama metni olarak kalmaması, uygulamada bir sonraki işleme bağlanması hedeflendi. Öneriye dokunulduğunda ilgili arama ifadesinin besin arama ekranına aktarılması ele alındı.</w:t>
+        <w:t>Bugün kullanıcının hedeflerine göre besin fikirleri sunan Oracle ekranı üzerinde çalıştım. Bu ekran, günlükteki bilinen toplamları ve kişisel tercihleri koç servisine oracle modu ile gönderiyor. Yanıtın amacı bir sonraki öğünde düşünülebilecek besinleri ve gerekçelerini sunmak. Öneriyi doğrudan günlük kaydı saymadım; kullanıcı kaynak besini ve porsiyonu seçmeden sayısal beslenme hesabına eklenmiyor.</w:t>
       </w:r>
     </w:p>
     <w:p>
@@ -3813,7 +4255,7 @@
           <w:sz w:val="24"/>
           <w:lang w:val="tr-TR"/>
         </w:rPr>
-        <w:t>Öneriden günlüğe geçişte mevcut besin servisinin kullanılması önemli bir sınır olarak değerlendirildi. Kullanıcı arama sonucundan gerçek bir besin seçmekte, ayrıntılarını görmekte ve porsiyon belirlemektedir. Yapay zekâ tarafından önerilen isim doğrudan doğrulanmış kimlik veya besin değeri olarak kabul edilmemektedir. Bu yaklaşım, öneri oluşturmanın esnekliğini kaynak veriye dayalı kayıt akışıyla birleştirmektedir.</w:t>
+        <w:t>Oracle'ı yalnızca kullanıcı ilgili sekmeyi açtığında yükleyen davranışı kullandım. Uygulama açılır açılmaz görünmeyen bu ekran için çağrı yapmak, günlük öneri veya sesli kayıtla aynı istek sırasını gereksiz doldurabiliyordu. İçerik değişikliklerini izleyip görünür ekran açıldığında yenileme yapılmasını sağladım. İstek başlangıcındaki bağlam değişmişse eski yanıtın güncel öneri gibi kullanılmaması için durum denetimlerini takip ettim.</w:t>
       </w:r>
     </w:p>
     <w:p>
@@ -3830,7 +4272,24 @@
           <w:sz w:val="24"/>
           <w:lang w:val="tr-TR"/>
         </w:rPr>
-        <w:t>Oracle ekranının yalnızca açıldığında istek göndermesi incelendi. Değişmemiş sonuçların tekrar kullanılabilmesi ve günlük bağlam değiştiğinde eski önerilerin geçersizleşmesi, gereksiz bekleme ve istek sayısını azaltmaktadır. Servis sınırı veya bağlantı hatasında mevcut günlük verisinin korunması ele alındı. Mevcut Oracle'ın matematiksel olarak en iyi beslenmeyi hesaplayan bir optimizasyon sistemi olmadığı belirtildi. Çalışma sonucunda özelliğin, kişiselleştirilmiş besin keşfini kolaylaştıran ve doğrulama adımını koruyan bir yardımcı olarak sunulması benimsendi.</w:t>
+        <w:t>Önerideki eylem bir besin kimliği veya modelin uydurduğu besin değerleri yerine, İngilizce Core arama sorgusu taşıyor. Kullanıcı eyleme dokununca bu sorguyla FoodSearchScreen açılıyor; gerçek besin ayrıntısı yükleniyor ve porsiyon seçiliyor. Bu bağlantı, öneri üretme ile besin doğrulamasını birbirinden ayırıyor. Model önerisinin makul görünmesi, veri kaynağında doğru ürüne karşılık geldiğini tek başına kanıtlamaz.</w:t>
+      </w:r>
+    </w:p>
+    <w:p>
+      <w:pPr>
+        <w:widowControl/>
+        <w:spacing w:after="260" w:before="0" w:line="293" w:lineRule="auto"/>
+        <w:jc w:val="both"/>
+      </w:pPr>
+      <w:r>
+        <w:rPr>
+          <w:rFonts w:ascii="Arial" w:hAnsi="Arial"/>
+          <w:b w:val="0"/>
+          <w:color w:val="000000"/>
+          <w:sz w:val="24"/>
+          <w:lang w:val="tr-TR"/>
+        </w:rPr>
+        <w:t>Testlerde Oracle'ın görünmeden istek başlatmaması ve kota hatasını bağlantı kesintisinden ayırması ele alınıyor. Bu özellik için matematiksel olarak en iyi beslenmeyi hesapladığı iddiasında bulunmadım; mevcut yapı bağlama dayalı besin fikirleri sunuyor. Alerji ve özel kısıtların doğrulanması da yalnızca öneri metnine bırakılamaz. Gün sonunda yapay zekâ özelliğini kullanılabilir kılan şeyin sadece cevap üretmek olmadığını gördüm; cevabın kontrollü bir kullanıcı işlemine ve doğrulanmış veri kaynağına bağlanması gerekiyor.</w:t>
       </w:r>
     </w:p>
     <w:p>
@@ -3883,7 +4342,7 @@
           <w:sz w:val="24"/>
           <w:lang w:val="tr-TR"/>
         </w:rPr>
-        <w:t>Bu çalışma gününde kullanıcı verisinin hangi işlemlerde cihaz dışına gönderildiğinin açıklanması ele alındı. Günlük kayıtların telefonda saklanması ile yapay zekâ isteğinde seçili bağlamın sunucuya gönderilmesi farklı durumlar olarak değerlendirildi. Sesli kayıt izni ve koç kullanım izninin ayrı tutulması incelendi. Kullanıcının bir özelliğe izin vermesinin bütün kişiselleştirme özelliklerini otomatik açmaması gerektiği üzerinde duruldu.</w:t>
+        <w:t>Bugün sesli kayıt, koç ve geri bildirim seçeneklerinin kullanıcıya nasıl açıklandığını çalıştım. Telefonun mikrofon izniyle yapay zekâ servisine veri gönderme açıklaması farklı ihtiyaçlardır. Koç önerilerini kabul etmek de sesli besin kaydını kullanmanın zorunlu koşulu değildir. Bu nedenle özelliklerin izinlerini ve tercihlerini ayrı tuttum; isteğe bağlı geri bildirimin kapalı kalması temel kaydı engellemiyor.</w:t>
       </w:r>
     </w:p>
     <w:p>
@@ -3900,7 +4359,7 @@
           <w:sz w:val="24"/>
           <w:lang w:val="tr-TR"/>
         </w:rPr>
-        <w:t>Yapay zekâ sağlayıcısının veri işleme koşullarının uygulama içi bilgilendirmede açıklanması ve koç özelliğinin ayarlardan kapatılabilmesi ele alındı. İsteğe bağlı düzeltme geri bildiriminin temel kayıt işleminin önüne geçmemesi değerlendirildi. Kullanıcı izin durumunu değiştirirken devam eden eski yanıtların profil veya öneri ekranını yeniden güncellememesi için mevcut kontroller incelendi. Günlükte hassas veri bulunduğu için teknik testlerde gerçek kişisel kayıtların kullanılmaması yaklaşımı benimsendi.</w:t>
+        <w:t>Koç açıklamasında hangi günlük özetinin ve tercihlerin hizmete gönderildiğini, kullanılan sağlayıcıya ilişkin veri işleme bilgisini görünür tuttum. Açıklama kapsamı değiştiğinde eski onayın otomatik geçerli sayılmaması için sürüm bilgisini kullandım. Regresyon testinde yalnızca eski coach_enabled alanına sahip profilin yeniden onay gerektirmesi denetleniyor. Kullanıcının ayarlardan koçu kapatabilmesi ve saklanan bilgileri silebilmesi, açıklamanın yanında gerçek kontrol de sunuyor.</w:t>
       </w:r>
     </w:p>
     <w:p>
@@ -3917,7 +4376,24 @@
           <w:sz w:val="24"/>
           <w:lang w:val="tr-TR"/>
         </w:rPr>
-        <w:t>Ayarlar ekranındaki servis durumu kontrolünde görülen asenkron hata ayrıca incelendi. Durum bileşeni henüz görünür alana gelmeden ağ isteği başarısız olduğunda hatanın dinleyicisiz kalabildiği görüldü. Sonucu değiştirmeden hatayı erken ele almak ve bileşen görünür olduğunda doğru durumu göstermek üzere düzenlenen yapı değerlendirildi. Bu çalışma, gizlilik seçenekleri ile hata yönetiminin kullanıcı güveni bakımından aynı derecede önemli olduğunu gösterdi.</w:t>
+        <w:t>Ayarlar ekranında servis durumu satırı görünür alanın altında kaldığında oluşabilen hatayı ele aldım. İstek başlamış olsa da ListView içindeki FutureBuilder henüz oluşturulmamış olabilir. İstek o anda başarısız olursa hatayı dinleyen bileşen bulunmayabilir. _checkCoreHealth içinde request.ignore() ile hatanın baştan ele alınmasını sağladım; aynı özgün Future döndürüldüğü için satır görünür olduğunda başarısız durum yine gösteriliyor. Bu yöntem hatayı kullanıcıdan saklamak değil, erken gelen hatanın yakalanmadan kalmasını önlemektir.</w:t>
+      </w:r>
+    </w:p>
+    <w:p>
+      <w:pPr>
+        <w:widowControl/>
+        <w:spacing w:after="260" w:before="0" w:line="293" w:lineRule="auto"/>
+        <w:jc w:val="both"/>
+      </w:pPr>
+      <w:r>
+        <w:rPr>
+          <w:rFonts w:ascii="Arial" w:hAnsi="Arial"/>
+          <w:b w:val="0"/>
+          <w:color w:val="000000"/>
+          <w:sz w:val="24"/>
+          <w:lang w:val="tr-TR"/>
+        </w:rPr>
+        <w:t>Testte çevrimdışı servis nesnesiyle ayarlar açılıyor; önce yakalanmamış hata oluşmadığı, ardından aşağı kaydırınca Unavailable yazısının göründüğü kontrol ediliyor. İsteğe bağlı geri bildirim ve eski onayın yenilenmesi de ayrı senaryolardır. Bu çalışma, ekrandaki bir satırın henüz çizilmemiş olmasının ağ isteği açısından önemli olabileceğini gösterdi. Kullanıcının neye izin verdiğini açıklarken, görünmeyen bileşenlere ait asenkron işlemlerin de uygulamanın geri kalanını etkilememesine dikkat etmeyi öğrendim.</w:t>
       </w:r>
     </w:p>
     <w:p>
@@ -3970,7 +4446,7 @@
           <w:sz w:val="24"/>
           <w:lang w:val="tr-TR"/>
         </w:rPr>
-        <w:t>Bugünkü çalışmada uygulamanın yalnızca elle açılarak kontrol edilmesinin yeterli olmadığı ele alındı. Birim testleriyle veri dönüşümleri ve hesaplamalar, Flutter bileşen testleriyle kullanıcı etkileşimleri değerlendirildi. Gerçek ağ bağlantısı yerine kontrollü yanıt veren test istemcilerinin kullanılması, gecikme ve hata durumlarının tekrar üretilebilmesini sağlamaktadır. Böylece yalnızca başarılı işlemler değil, başarısızlık sonrasındaki davranışlar da incelenebilmektedir.</w:t>
+        <w:t>Bugün uygulamanın doğrulama çalışmalarını test türlerine göre değerlendirdim. Birim testleri miktar hesaplama, JSON dönüşümü ve hedef uyarlama gibi arayüzden bağımsız kuralları denetliyor. Widget testleri ise ekranı kontrollü ortamda açıp düğmeye basma, metin girme ve geri dönme gibi etkileşimleri sınayabiliyor. Aynı özelliği hem model hem ekran düzeyinde ele almak, hesabın doğru olmasına rağmen kullanıcı akışında oluşan hataları fark etmeyi sağlıyor.</w:t>
       </w:r>
     </w:p>
     <w:p>
@@ -3987,7 +4463,7 @@
           <w:sz w:val="24"/>
           <w:lang w:val="tr-TR"/>
         </w:rPr>
-        <w:t>Doğrulama kapsamında yüz gram değerlerinin miktara göre ölçeklenmesi, günlük toplamlar, JSON dönüşümü ve kayıt kopyalama senaryoları ele alındı. Düzenlemeyi iptal etmenin kaydı koruması, aynı sesli grubun iki kez sayılmaması ve arama temizlendikten sonra eski sonucun görünmemesi önemli regresyon örnekleri olarak incelendi. Araç takımı kapanışının yerel kaydı beklemesi ve Oracle'ın istek sınırı hatasını bağlantı hatasından ayırması da kapsam içinde değerlendirildi.</w:t>
+        <w:t>Test verilerinde gerçek günlük veya canlı yapay zekâ yanıtı yerine sabit besin nesneleri, sahte servisler ve bellek içi depolama kullandım. Beklenen sonucu böylece önceden hesaplayabiliyorum. Örneğin kalori testinde 132 sonucunu, düzenleme testinde aynı kayıt kimliğini, tekrar istekte ise tek besin kalmasını arıyorum. Sadece ekranda hata görünmemesi değil, verinin beklenen sayıya ve duruma sahip olması kontrol ediliyor.</w:t>
       </w:r>
     </w:p>
     <w:p>
@@ -4004,7 +4480,24 @@
           <w:sz w:val="24"/>
           <w:lang w:val="tr-TR"/>
         </w:rPr>
-        <w:t>Uygulamanın doğrulama kaydında 44 Flutter testinin geçtiği ve statik analizde sorun bildirilmediği görüldü. Bu sayı, her cihazda ve her gerçek konuşmada kusursuz çalışma garantisi olarak yorumlanmadı. Android araç takımı işlem testleriyle gerçek ana ekran yerleşiminin farklı denemeler olduğu belirtildi. Günün sonunda bir hatanın tekrar üretilebilmesi, düzeltme sonrası aynı senaryonun test edilmesi ve kanıtın saklanmasının yazılım bakımındaki önemi değerlendirildi.</w:t>
+        <w:t>Asenkron sorunlar için Completer ile yanıtı ve depolamayı istediğim aşamada bekleten senaryoları inceledim. Arama temizlendikten sonra geç gelen sonuç, başarısız düzeltme sonrası geri dönüş ve araç takımı kapanmadan önce yerel kaydın tamamlanması bu yöntemle sınanıyor. Böylece doğal kullanımda zamanlamaya bağlı ortaya çıkan hatalar, aynı sırayla tekrar üretilebilir hâle geliyor. Düzeltmeden sonra aynı testi korumak, hatanın ileride geri dönmesini yakalamaya yardımcı oluyor.</w:t>
+      </w:r>
+    </w:p>
+    <w:p>
+      <w:pPr>
+        <w:widowControl/>
+        <w:spacing w:after="260" w:before="0" w:line="293" w:lineRule="auto"/>
+        <w:jc w:val="both"/>
+      </w:pPr>
+      <w:r>
+        <w:rPr>
+          <w:rFonts w:ascii="Arial" w:hAnsi="Arial"/>
+          <w:b w:val="0"/>
+          <w:color w:val="000000"/>
+          <w:sz w:val="24"/>
+          <w:lang w:val="tr-TR"/>
+        </w:rPr>
+        <w:t>Doğrulama kaydında 14 Eylül 2026 tarihinde flutter analyze --no-pub temiz sonuç verdi; flutter test --no-pub --reporter expanded ile 44 Flutter testi geçti. Bu sonuçları bütün telefonlarda veya her konuşmada kusursuz çalışma garantisi olarak yorumlamadım. Gerçek mikrofon gürültüsü, başlatıcı davranışı ve sağlayıcı sürekliliği ayrı denemeler gerektiriyor. Gün sonunda test yazmanın yalnızca son aşama olmadığını öğrendim: beklenen davranışı açıkça tanımlamak, uygulamadaki tasarım kararlarını da daha anlaşılır hâle getiriyor.</w:t>
       </w:r>
     </w:p>
     <w:p>
@@ -4057,7 +4550,7 @@
           <w:sz w:val="24"/>
           <w:lang w:val="tr-TR"/>
         </w:rPr>
-        <w:t>Son çalışma başlığında mobil uygulamanın teslim edilebilir Android paketi ve teknik açıklamaları ele alındı. Derleme sırasında servis adresleri ile istemci yapılandırmasının nasıl verildiği incelendi. Uygulama sürümünün paket bilgisi içinde izlenmesi, hangi düzeltmelerin hangi kurulumda bulunduğunun anlaşılması açısından değerlendirildi. Mevcut kişisel beta sürümünün 1.1.2 olduğu ve kurulumun mağaza yayınıyla aynı şey olmadığı belirtildi.</w:t>
+        <w:t>Bugün çalışmanın Android paketleme ve teslim tarafını ele aldım. pubspec.yaml içindeki 1.1.2+5 bilgisinde kullanıcıya gösterilen sürümle derleme numarasını ayırdım. flutter build apk --release komutu kurulum paketini üretir; uygulamaya ait herkese açık kimlik doğrulama yapılandırması derleme sırasında verilir. Gizli sunucu anahtarlarının pakete eklenmemesi gerekiyor. APK'nın üretilmesiyle mağazada yayımlanmasının farklı aşamalar olduğunu da not ettim.</w:t>
       </w:r>
     </w:p>
     <w:p>
@@ -4074,7 +4567,7 @@
           <w:sz w:val="24"/>
           <w:lang w:val="tr-TR"/>
         </w:rPr>
-        <w:t>Kaynak kod, testler ve uygulama kılavuzunun birlikte teslim edilmesi üzerinde duruldu. Kurulum yönergeleri, ekranların görevleri, veri akışı ve bilinen sınırlar özetlendi. Kayıt oluşturma, miktar düzeltme, besin raporunu açma, araç takımından sesli kayda geçme ve Oracle önerisini aramaya aktarma adımları gösterim akışı olarak düzenlendi. Kullanıcı verisini temizlemeyen sürüm güncelleme yaklaşımı, günlük uygulaması için önemli bir teslim ayrıntısı olarak değerlendirildi.</w:t>
+        <w:t>Paket çıktısının build/app/outputs/flutter-apk/app-release.apk altında oluştuğunu ve güncellemede adb install -r komutunun mevcut uygulamanın üzerine kurulum için kullanıldığını inceledim. 5 Eylül denetim kaydı bu sürümün kurulum ve cihaz kontrollerini içeriyor; belge hazırlanırken yeni telefon kurulumu yapılmadı. Mevcut beta yerel debug imzasıyla hazırlanıyor. Mağaza dağıtımı için ayrı yayın anahtarı ve dağıtım hazırlığı gerektiğini ayırdım.</w:t>
       </w:r>
     </w:p>
     <w:p>
@@ -4091,7 +4584,24 @@
           <w:sz w:val="24"/>
           <w:lang w:val="tr-TR"/>
         </w:rPr>
-        <w:t>Genel değerlendirmede, yerel kayıt ile ağ servislerini birleştiren bir mobil uygulamanın geliştirme sorumlulukları ortaya konuldu. Flutter arayüzü, Dart veri modelleri, asenkron işlemler ve Kotlin platform bağlantısı aynı ürün içinde birlikte çalışmaktadır. Kalıcı arka plan kayıt kuyruğu, dışa aktarma ve kapsamlı cihaz denemeleri sonraki geliştirmeler olarak ayrıldı. Çalışmaların sonucu, bütün koşullarda hatasız olduğu iddia edilen bir ürün değil; temel akışları uygulanmış, testleri ve sınırları belgelenmiş bir Android beslenme günlüğü olarak özetlendi.</w:t>
+        <w:t>Teslim akışını uygulamanın günlük kullanım sırasına göre toparladım: besin arama, porsiyon seçme, kaydı düzenleme, günlük toplamı görme, sesli kayıt ve araç takımıyla hızlı giriş. Ardından hedef ve diyet seçimiyle günlük öneri, koç görüşmesi ve Oracle bağlantısını ilişkilendirdim. README kullanım ve doğrulama komutlarını, davranış belgesi mimariyi, denetim kaydı test sonuçlarını, BACKLOG ise tamamlanmamış işleri açıklıyor. Böylece sonraki kişi yalnızca kurulum dosyasına bağımlı kalmıyor.</w:t>
+      </w:r>
+    </w:p>
+    <w:p>
+      <w:pPr>
+        <w:widowControl/>
+        <w:spacing w:after="260" w:before="0" w:line="293" w:lineRule="auto"/>
+        <w:jc w:val="both"/>
+      </w:pPr>
+      <w:r>
+        <w:rPr>
+          <w:rFonts w:ascii="Arial" w:hAnsi="Arial"/>
+          <w:b w:val="0"/>
+          <w:color w:val="000000"/>
+          <w:sz w:val="24"/>
+          <w:lang w:val="tr-TR"/>
+        </w:rPr>
+        <w:t>Genel değerlendirmede yerel yedekleme, yarım kalan ses işlerinin kalıcı kuyruğu, daha kapsamlı cihaz denemeleri ve kaynak verisiyle puanlanan Oracle gibi geliştirme alanlarını belirttim. Bunları bitmiş özellikler gibi sunmadım. Bu çalışma boyunca arayüz, API, cihaz özellikleri, hesaplama ve testlerin birbirine bağlı olduğunu öğrendim. En önemli kazanımım, bir özelliği yalnızca çalışır göstermekle yetinmeyip hangi veriyle, hangi koşulda ve hata olduğunda nasıl davrandığını açıklayabilecek bir geliştirme yaklaşımı edinmek oldu.</w:t>
       </w:r>
     </w:p>
     <w:sectPr>

</xml_diff>

<commit_message>
Polish internship journal and add screenshot placeholders
</commit_message>
<xml_diff>
--- a/apps/nutrition-app/docs/staj_defteri/OpenNutri_Staj_Defteri_30_Gun.docx
+++ b/apps/nutrition-app/docs/staj_defteri/OpenNutri_Staj_Defteri_30_Gun.docx
@@ -483,7 +483,7 @@
           <w:sz w:val="20"/>
           <w:lang w:val="tr-TR"/>
         </w:rPr>
-        <w:t>30 günlük içerik taslağı • Tarih ve katkı doğrulaması bekliyor</w:t>
+        <w:t>30 günlük çalışma metni • Düzenlenebilir taslak</w:t>
       </w:r>
     </w:p>
     <w:p>
@@ -1018,7 +1018,7 @@
           <w:sz w:val="21"/>
           <w:lang w:val="tr-TR"/>
         </w:rPr>
-        <w:t>Bu defter yalnızca OpenNutri mobil uygulamasını anlatır. Mevcut besin ve yapay zekâ servisleri, uygulamanın kullandığı dış bileşenler olarak ele alınmıştır. Veri kaynağının oluşturulması ve diğer proje çalışmalarına ilişkin geliştirme iddiası içermez.</w:t>
+        <w:t>Bu defter, OpenNutri mobil uygulamasının arayüzlerini, besin günlüğünü, sesli kayıt ve Android araç takımı akışını, kişiselleştirme özelliklerini ve testlerini kapsar. Mevcut besin ve yapay zekâ servisleriyle kurulan mobil entegrasyonlar da çalışma kapsamında açıklanır.</w:t>
       </w:r>
     </w:p>
     <w:p>
@@ -1035,7 +1035,7 @@
           <w:sz w:val="24"/>
           <w:lang w:val="tr-TR"/>
         </w:rPr>
-        <w:t>Teslim öncesi doğrulama</w:t>
+        <w:t>Düzenleme ve onay</w:t>
       </w:r>
     </w:p>
     <w:p>
@@ -1052,7 +1052,7 @@
           <w:sz w:val="21"/>
           <w:lang w:val="tr-TR"/>
         </w:rPr>
-        <w:t>Birinci tekil şahısla yazılan günlükler, öğrenci tarafından doğrulanacak anlatım önerileridir. Yapılan işi açıklayan kod ve testler, o işi öğrencinin yaptığını veya belirtilen sırada çalıştığını tek başına kanıtlamaz. Öğrenci, geliştirme, entegrasyon, test ve inceleme ifadelerini gerçek katkısına göre düzeltmeli; tarihleri doğrulamalıdır. Sayısal örnekler kodu açıklayan kontrollü verilerdir. Metin yapay zekâ desteğiyle hazırlanmış; kurum bilgileri ve imzalar boş bırakılmıştır.</w:t>
+        <w:t>Teknik kayıtlar temel alınarak yapay zekâ desteğiyle hazırlanan bu taslak, öğrencinin kendi çalışmasına göre gözden geçirmesi için düzenlenmiştir. Gün sırası, tarihler ve birinci tekil şahısla anlatılan katkılar öğrenci tarafından doğrulanarak son hâline getirilir. Sayısal örnekler, hesaplama ve testleri açıklayan kontrollü verilerdir. İşaretli alanlara gerçek ekran görüntüleri eklenir; kurum ve onay bilgileri ilgili kişilerce tamamlanır.</w:t>
       </w:r>
     </w:p>
     <w:p>
@@ -1193,7 +1193,7 @@
           <w:sz w:val="24"/>
           <w:lang w:val="tr-TR"/>
         </w:rPr>
-        <w:t>Bu çalışma sırasında yapay zekânın göreviyle besin verisinin kaynağını özellikle ayırdım. Yapay zekâ ifadeyi anlamaya yardımcı olurken sayısal değerler mevcut Core servisinden alınmaktadır. Gün sonunda uygulamanın kapsamını Android öncelikli mobil geliştirme olarak netleştirdim; veri seti üretimi ve araştırma sistemlerini bu çalışmaya dahil etmedim. Kullanıcı ihtiyacını somut kabul koşullarına dönüştürmenin, sonraki geliştirmeleri değerlendirmeyi kolaylaştırdığını öğrendim.</w:t>
+        <w:t>Bu çalışma sırasında yapay zekânın göreviyle besin verisinin kaynağını özellikle ayırdım. Yapay zekâ ifadeyi anlamaya yardımcı olurken sayısal değerler mevcut Core servisinden alınmaktadır. Çalışmanın kapsamını Android öncelikli mobil geliştirme, hazır servislerin entegrasyonu ve kullanıcı etkileşimleri olarak netleştirdim. Kullanıcı ihtiyacını somut kabul koşullarına dönüştürmenin, sonraki geliştirmeleri değerlendirmeyi kolaylaştırdığını öğrendim.</w:t>
       </w:r>
     </w:p>
     <w:p>
@@ -1280,7 +1280,7 @@
           <w:sz w:val="24"/>
           <w:lang w:val="tr-TR"/>
         </w:rPr>
-        <w:t>Komutların hangi aşamayı doğruladığını not ettim. flutter pub get bağımlılıkları hazırlar; flutter analyze kaynak kodu statik olarak denetler; flutter test beklenen davranışları sınar. flutter build apk --release ise Android kurulum paketini üretir. Analizin temiz çıkmasıyla telefondaki bütün etkileşimlerin doğrulanmasının aynı şey olmadığını özellikle ayırdım. Derleme çıktısını kaynak kod yerine düzenlememek ve kalıcı değişiklikleri lib ile android altındaki ilgili dosyalarda yapmak gerektiğini öğrendim.</w:t>
+        <w:t>Komutların hangi aşamayı doğruladığını not ettim. flutter pub get bağımlılıkları hazırlar; flutter analyze kaynak kodu statik olarak denetler; flutter test beklenen davranışları sınar. flutter build apk --release ise Android kurulum paketini üretir. Statik analiz, davranış testleri ve Android derlemesini birbirini tamamlayan doğrulama adımları olarak ele aldım. Derleme çıktısını kaynak kod yerine düzenlememek ve kalıcı değişiklikleri lib ile android altındaki ilgili dosyalarda yapmak gerektiğini öğrendim.</w:t>
       </w:r>
     </w:p>
     <w:p>
@@ -1297,7 +1297,7 @@
           <w:sz w:val="24"/>
           <w:lang w:val="tr-TR"/>
         </w:rPr>
-        <w:t>Son olarak yapılandırma değerlerinin --dart-define üzerinden aktarılmasını inceledim. Uygulamadaki herkese açık istemci anahtarı ile sunucuda tutulması gereken Gemini veya yönetici anahtarları aynı yetkiye sahip değildir. Gizli anahtarları kaynak dosyalara yazmadan çalışmak, Git değişikliklerini kontrol etmek ve doğrulanmış sürümleri korumak geliştirme düzeninin bir parçası oldu. Gün sonunda araçların görevlerini ve projenin hangi bölümüne ne zaman müdahale edeceğimi daha iyi anladım.</w:t>
+        <w:t>Son olarak yapılandırma değerlerinin --dart-define üzerinden aktarılmasını inceledim. Uygulamadaki herkese açık istemci anahtarı ile sunucuda tutulması gereken Gemini veya yönetici anahtarları aynı yetkiye sahip değildir. Gizli anahtarları kaynak dosyalara yazmadan çalışmak, Git değişikliklerini kontrol etmek ve doğrulanmış sürümleri korumak geliştirme düzeninin bir parçası oldu. Bu hazırlık, bağımlılık, kaynak kod ve derleme ayarları arasında daha rahat çalışmamı sağladı.</w:t>
       </w:r>
     </w:p>
     <w:p>
@@ -1384,7 +1384,7 @@
           <w:sz w:val="24"/>
           <w:lang w:val="tr-TR"/>
         </w:rPr>
-        <w:t>Başlangıçta main.dart içinde Flutter bağlamının hazırlanması, yerel kayıtların yüklenmesi ve uygulamanın açılması sırasını inceledim. Supabase hazırlığı beklenmeden başlatılıyor; günlük arayüzü uzak kimlik doğrulama servisini beklemiyor. Yerel denetleyicinin hazırlanması ise runApp öncesinde tamamlanıyor. Böylece daha önce kaydedilmiş öğünlerin gösterilmesiyle yapay zekâ bağlantısının hazır olması birbirinden ayrılmış oluyor.</w:t>
+        <w:t>Başlangıçta main.dart içinde Flutter bağlamının hazırlanması, yerel kayıtların yüklenmesi ve uygulamanın açılması sırasını inceledim.</w:t>
       </w:r>
     </w:p>
     <w:p>
@@ -1401,7 +1401,24 @@
           <w:sz w:val="24"/>
           <w:lang w:val="tr-TR"/>
         </w:rPr>
-        <w:t>Testlerde gerçek depolama veya ağ istemcisi yerine kontrollü nesneler verilebilmesini de kullandım. Örneğin LocalStore yerine kaydetmeyi bekleten bir test nesnesi, normal kullanımda yakalanması zor yazma sırası sorunlarını görünür kılıyor. Gün sonunda katmanlı yapının yalnızca dosyaları klasörlere ayırmak olmadığını; her bileşenin girdisini, çıktısını ve sorumluluğunu belirlemek anlamına geldiğini öğrendim.</w:t>
+        <w:t>Supabase hazırlığı beklenmeden başlatılıyor; günlük arayüzü uzak kimlik doğrulama servisini beklemiyor. Yerel denetleyicinin hazırlanması ise runApp öncesinde tamamlanıyor. Böylece daha önce kaydedilmiş öğünlerin gösterilmesiyle yapay zekâ bağlantısının hazır olması birbirinden ayrılmış oluyor.</w:t>
+      </w:r>
+    </w:p>
+    <w:p>
+      <w:pPr>
+        <w:widowControl/>
+        <w:spacing w:after="260" w:before="0" w:line="293" w:lineRule="auto"/>
+        <w:jc w:val="both"/>
+      </w:pPr>
+      <w:r>
+        <w:rPr>
+          <w:rFonts w:ascii="Arial" w:hAnsi="Arial"/>
+          <w:b w:val="0"/>
+          <w:color w:val="000000"/>
+          <w:sz w:val="24"/>
+          <w:lang w:val="tr-TR"/>
+        </w:rPr>
+        <w:t>Testlerde gerçek depolama veya ağ istemcisi yerine kontrollü nesneler verilebilmesini de kullandım. Örneğin LocalStore yerine kaydetmeyi bekleten bir test nesnesi, normal kullanımda yakalanması zor yazma sırası sorunlarını görünür kılıyor. Bu uygulama sayesinde bileşenlerin girdisini, çıktısını ve sorumluluğunu belirleme konusunda deneyim kazandım.</w:t>
       </w:r>
     </w:p>
     <w:p>
@@ -1670,40 +1687,160 @@
         <w:t>Arayüzde ortak tema, kartlar, düğmeler ve öğün bölümlerini kullandım. Günlük özet ve öğün listelerinin aynı tarih üzerinden hesaplanması için AppController'ın seçilen gün bilgisini esas aldım. Tarih ileri veya geri alındığında başlıkla birlikte kayıtların ve toplamların da değişmesi gerekiyor. Yalnızca tarih metnini değiştirmek, kullanıcıya başka güne ait beslenme bilgisi gösterilmesine yol açacağından yeterli değildir.</w:t>
       </w:r>
     </w:p>
-    <w:p>
-      <w:pPr>
-        <w:widowControl/>
-        <w:spacing w:after="260" w:before="0" w:line="293" w:lineRule="auto"/>
-        <w:jc w:val="both"/>
-      </w:pPr>
-      <w:r>
-        <w:rPr>
-          <w:rFonts w:ascii="Arial" w:hAnsi="Arial"/>
-          <w:b w:val="0"/>
-          <w:color w:val="000000"/>
-          <w:sz w:val="24"/>
-          <w:lang w:val="tr-TR"/>
-        </w:rPr>
-        <w:t>Boş bir gün, kayıt bulunan bir gün ve veri beklenen ekranlar için farklı görünüm durumlarını ele aldım. Boş ekranda kullanıcının ilk kaydı nasıl yapacağını anlaması; kayıt bulunan ekranda ise toplamlarla öğünlere kolay ulaşması amaçlandı. Kaydırılabilir alanlar ve içerik genişliği sınırı, uzun besin adlarının ve farklı ekran ölçülerinin düzeni bozmasını azaltıyor. Renk ve simgelerin yanında açıklayıcı metin kullanarak işlemlerin anlaşılır kalmasını sağladım.</w:t>
-      </w:r>
-    </w:p>
-    <w:p>
-      <w:pPr>
-        <w:widowControl/>
-        <w:spacing w:after="260" w:before="0" w:line="293" w:lineRule="auto"/>
-        <w:jc w:val="both"/>
-      </w:pPr>
-      <w:r>
-        <w:rPr>
-          <w:rFonts w:ascii="Arial" w:hAnsi="Arial"/>
-          <w:b w:val="0"/>
-          <w:color w:val="000000"/>
-          <w:sz w:val="24"/>
-          <w:lang w:val="tr-TR"/>
-        </w:rPr>
-        <w:t>Ana ekranın kayıt davranışını home_shell_test.dart içindeki senaryoyla değerlendirdim. Depolama tamamlanmadan yeni besinin görünmesi, arayüzün gereksiz beklemediğini gösteriyor; kalıcı kaydın sonucu ise denetleyicide ayrıca takip ediliyor. Bu çalışma sayesinde görsel tasarımla veri akışını birlikte düşünmeyi öğrendim. Güzel görünen bir ekranın, yanlış gün veya eski veri göstermesi durumunda işlevsel açıdan doğru sayılamayacağını gördüm.</w:t>
-      </w:r>
-    </w:p>
+    <w:tbl>
+      <w:tblPr>
+        <w:tblW w:type="auto" w:w="0"/>
+        <w:jc w:val="center"/>
+        <w:tblLayout w:type="fixed"/>
+        <w:tblLook w:firstColumn="1" w:firstRow="1" w:lastColumn="0" w:lastRow="0" w:noHBand="0" w:noVBand="1" w:val="04A0"/>
+        <w:tblBorders>
+          <w:top w:val="nil"/>
+          <w:left w:val="nil"/>
+          <w:bottom w:val="nil"/>
+          <w:right w:val="nil"/>
+          <w:insideH w:val="nil"/>
+          <w:insideV w:val="nil"/>
+        </w:tblBorders>
+        <w:tblCellMar>
+          <w:top w:w="0" w:type="dxa"/>
+          <w:bottom w:w="0" w:type="dxa"/>
+          <w:left w:w="0" w:type="dxa"/>
+          <w:right w:w="90" w:type="dxa"/>
+        </w:tblCellMar>
+      </w:tblPr>
+      <w:tblGrid>
+        <w:gridCol w:w="7030"/>
+        <w:gridCol w:w="2778"/>
+      </w:tblGrid>
+      <w:tr>
+        <w:trPr>
+          <w:cantSplit/>
+        </w:trPr>
+        <w:tc>
+          <w:tcPr>
+            <w:tcW w:type="dxa" w:w="7030"/>
+            <w:vAlign w:val="top"/>
+          </w:tcPr>
+          <w:p>
+            <w:pPr>
+              <w:widowControl/>
+              <w:spacing w:after="260" w:before="0" w:line="293" w:lineRule="auto"/>
+              <w:jc w:val="both"/>
+            </w:pPr>
+            <w:r>
+              <w:rPr>
+                <w:rFonts w:ascii="Arial" w:hAnsi="Arial"/>
+                <w:b w:val="0"/>
+                <w:color w:val="000000"/>
+                <w:sz w:val="24"/>
+                <w:lang w:val="tr-TR"/>
+              </w:rPr>
+              <w:t>Boş bir gün, kayıt bulunan bir gün ve veri beklenen ekranlar için farklı görünüm durumlarını ele aldım. Boş ekranda kullanıcının ilk kaydı nasıl yapacağını anlaması; kayıt bulunan ekranda ise toplamlarla öğünlere kolay ulaşması amaçlandı. Kaydırılabilir alanlar ve içerik genişliği sınırı, uzun besin adlarının ve farklı ekran ölçülerinin düzeni bozmasını azaltıyor. Renk ve simgelerin yanında açıklayıcı metin kullanarak işlemlerin anlaşılır kalmasını sağladım.</w:t>
+            </w:r>
+          </w:p>
+          <w:p>
+            <w:pPr>
+              <w:widowControl/>
+              <w:spacing w:after="260" w:before="0" w:line="293" w:lineRule="auto"/>
+              <w:jc w:val="both"/>
+            </w:pPr>
+            <w:r>
+              <w:rPr>
+                <w:rFonts w:ascii="Arial" w:hAnsi="Arial"/>
+                <w:b w:val="0"/>
+                <w:color w:val="000000"/>
+                <w:sz w:val="24"/>
+                <w:lang w:val="tr-TR"/>
+              </w:rPr>
+              <w:t>Ana ekranın kayıt davranışını home_shell_test.dart içindeki senaryoyla değerlendirdim. Depolama tamamlanmadan yeni besinin görünmesi, arayüzün gereksiz beklemediğini gösteriyor; kalıcı kaydın sonucu ise denetleyicide ayrıca takip ediliyor. Bu çalışma sayesinde görsel tasarımla veri akışını birlikte düşünmeyi öğrendim. Özellikle tarih başlığı, öğün listesi ve toplamların birlikte güncellenmesi üzerinde durdum.</w:t>
+            </w:r>
+          </w:p>
+        </w:tc>
+        <w:tc>
+          <w:tcPr>
+            <w:tcW w:type="dxa" w:w="2778"/>
+            <w:vAlign w:val="top"/>
+          </w:tcPr>
+          <w:tbl>
+            <w:tblPr>
+              <w:tblW w:type="auto" w:w="0"/>
+              <w:jc w:val="center"/>
+              <w:tblLayout w:type="fixed"/>
+              <w:tblLook w:firstColumn="1" w:firstRow="1" w:lastColumn="0" w:lastRow="0" w:noHBand="0" w:noVBand="1" w:val="04A0"/>
+              <w:tblBorders>
+                <w:top w:val="single" w:sz="6" w:color="999999"/>
+                <w:left w:val="single" w:sz="6" w:color="999999"/>
+                <w:bottom w:val="single" w:sz="6" w:color="999999"/>
+                <w:right w:val="single" w:sz="6" w:color="999999"/>
+                <w:insideH w:val="single" w:sz="6" w:color="999999"/>
+                <w:insideV w:val="single" w:sz="6" w:color="999999"/>
+              </w:tblBorders>
+              <w:tblCellMar>
+                <w:top w:w="70" w:type="dxa"/>
+                <w:bottom w:w="70" w:type="dxa"/>
+                <w:left w:w="110" w:type="dxa"/>
+                <w:right w:w="110" w:type="dxa"/>
+              </w:tblCellMar>
+            </w:tblPr>
+            <w:tblGrid>
+              <w:gridCol w:w="2381"/>
+            </w:tblGrid>
+            <w:tr>
+              <w:trPr>
+                <w:trHeight w:val="5443" w:hRule="atLeast"/>
+                <w:cantSplit/>
+              </w:trPr>
+              <w:tc>
+                <w:tcPr>
+                  <w:tcW w:type="dxa" w:w="2381"/>
+                  <w:vAlign w:val="center"/>
+                </w:tcPr>
+                <w:p>
+                  <w:pPr>
+                    <w:spacing w:after="80" w:before="80" w:line="259" w:lineRule="auto"/>
+                    <w:jc w:val="center"/>
+                  </w:pPr>
+                  <w:r/>
+                  <w:r>
+                    <w:rPr>
+                      <w:rFonts w:ascii="Arial" w:hAnsi="Arial"/>
+                      <w:b w:val="0"/>
+                      <w:color w:val="000000"/>
+                      <w:sz w:val="20"/>
+                      <w:lang w:val="tr-TR"/>
+                    </w:rPr>
+                    <w:t>EKRAN GÖRÜNTÜSÜ</w:t>
+                    <w:br/>
+                    <w:t>EKLENECEK</w:t>
+                    <w:br/>
+                    <w:br/>
+                    <w:t>Şekil 1</w:t>
+                    <w:br/>
+                    <w:t>04. gün</w:t>
+                  </w:r>
+                </w:p>
+              </w:tc>
+            </w:tr>
+          </w:tbl>
+          <w:p>
+            <w:pPr>
+              <w:spacing w:line="259" w:lineRule="auto" w:before="100" w:after="0"/>
+              <w:jc w:val="center"/>
+            </w:pPr>
+            <w:r>
+              <w:rPr>
+                <w:rFonts w:ascii="Arial" w:hAnsi="Arial"/>
+                <w:b w:val="0"/>
+                <w:color w:val="000000"/>
+                <w:sz w:val="18"/>
+                <w:lang w:val="tr-TR"/>
+              </w:rPr>
+              <w:t>Şekil 1. Günlük özeti ve öğün bölümleri</w:t>
+            </w:r>
+          </w:p>
+        </w:tc>
+      </w:tr>
+    </w:tbl>
     <w:p>
       <w:pPr>
         <w:sectPr>
@@ -1805,7 +1942,7 @@
           <w:sz w:val="24"/>
           <w:lang w:val="tr-TR"/>
         </w:rPr>
-        <w:t>toJson ve fromJson dönüşümlerinde tarih, kimlik, miktar ve besin listesinin korunmasını kontrol ettim. Eski kayıtlarda inputGrams yoksa grams değerinin kullanılması, yeni alanların varsayılanlarla okunabilmesine örnektir. JSON dönüşüm testinde 125 gramlık kaydın geri okunduğunda aynı kimliği ve kaloriyi taşıması bekleniyor. Gün sonunda veri modelini tasarlarken yalnızca bugünkü ekranı değil, sonraki sürümlerde eski kayıtların okunmasını da düşünmek gerektiğini öğrendim.</w:t>
+        <w:t>toJson ve fromJson dönüşümlerinde tarih, kimlik, miktar ve besin listesinin korunmasını kontrol ettim. Eski kayıtlarda inputGrams yoksa grams değerinin kullanılması, yeni alanların varsayılanlarla okunabilmesine örnektir. JSON dönüşüm testinde 125 gramlık kaydın geri okunduğunda aynı kimliği ve kaloriyi taşıması bekleniyor. Böylece veri modeliyle geriye dönük uyumluluk arasındaki ilişkiyi uygulamalı olarak pekiştirdim.</w:t>
       </w:r>
     </w:p>
     <w:p>
@@ -1878,40 +2015,160 @@
         <w:t>searchFoods içinde arama metninin başındaki ve sonundaki boşlukları temizledim. Metin boşsa ağ isteği oluşturmadan boş sonuç dönülüyor. Dolu sorguda q ve limit parametreleri URI üzerinden hazırlanıyor; varsayılan sonuç sınırı 30. Yanıtın JSON içeriği FoodSearchResults modeline çevriliyor. Yanıt kodu başarılı aralıkta değilse hata üretilmesi, bağlantı sorununun yanlışlıkla “besin bulunamadı” diye yorumlanmasını engelliyor.</w:t>
       </w:r>
     </w:p>
-    <w:p>
-      <w:pPr>
-        <w:widowControl/>
-        <w:spacing w:after="260" w:before="0" w:line="293" w:lineRule="auto"/>
-        <w:jc w:val="both"/>
-      </w:pPr>
-      <w:r>
-        <w:rPr>
-          <w:rFonts w:ascii="Arial" w:hAnsi="Arial"/>
-          <w:b w:val="0"/>
-          <w:color w:val="000000"/>
-          <w:sz w:val="24"/>
-          <w:lang w:val="tr-TR"/>
-        </w:rPr>
-        <w:t>Arama sonuçlarından seçim yapıldığında önce besinin ayrıntısını yükleyip ardından porsiyon penceresini açan akışı bağladım. Kullanıcı porsiyonu onaylarsa bu pencere DiaryEntry döndürüyor; iptal ederse kayıt oluşmuyor. Ayrıntıları besin kimliğine göre bellekte saklayan önbellek, aynı besin tekrar açıldığında gereksiz ağ çağrılarını azaltıyor. Bu önbelleğin uygulama kapanınca bütün besinleri koruyan çevrimdışı bir veritabanı olmadığını ayırdım.</w:t>
-      </w:r>
-    </w:p>
-    <w:p>
-      <w:pPr>
-        <w:widowControl/>
-        <w:spacing w:after="260" w:before="0" w:line="293" w:lineRule="auto"/>
-        <w:jc w:val="both"/>
-      </w:pPr>
-      <w:r>
-        <w:rPr>
-          <w:rFonts w:ascii="Arial" w:hAnsi="Arial"/>
-          <w:b w:val="0"/>
-          <w:color w:val="000000"/>
-          <w:sz w:val="24"/>
-          <w:lang w:val="tr-TR"/>
-        </w:rPr>
-        <w:t>İsteklere 30 saniyelik zaman aşımı uygulanmasını ve hatanın arayüzde yakalanmasını inceledim. Beklenen akışı “sorgu → kısa sonuç → ayrıntı → porsiyon → günlük kaydı” şeklinde takip ederek veri dönüşümlerini netleştirdim. Bu çalışma, API entegrasyonunun yalnızca adres çağırmak olmadığını gösterdi; boş girdi, başarısız yanıt ve kullanıcının işlemi iptal etmesi de akışın parçalarıdır. Besin servisinin geliştirilmesini değil, hazır servisin mobil uygulamaya bağlanmasını üstlenen katman üzerinde çalıştım.</w:t>
-      </w:r>
-    </w:p>
+    <w:tbl>
+      <w:tblPr>
+        <w:tblW w:type="auto" w:w="0"/>
+        <w:jc w:val="center"/>
+        <w:tblLayout w:type="fixed"/>
+        <w:tblLook w:firstColumn="1" w:firstRow="1" w:lastColumn="0" w:lastRow="0" w:noHBand="0" w:noVBand="1" w:val="04A0"/>
+        <w:tblBorders>
+          <w:top w:val="nil"/>
+          <w:left w:val="nil"/>
+          <w:bottom w:val="nil"/>
+          <w:right w:val="nil"/>
+          <w:insideH w:val="nil"/>
+          <w:insideV w:val="nil"/>
+        </w:tblBorders>
+        <w:tblCellMar>
+          <w:top w:w="0" w:type="dxa"/>
+          <w:bottom w:w="0" w:type="dxa"/>
+          <w:left w:w="0" w:type="dxa"/>
+          <w:right w:w="90" w:type="dxa"/>
+        </w:tblCellMar>
+      </w:tblPr>
+      <w:tblGrid>
+        <w:gridCol w:w="7030"/>
+        <w:gridCol w:w="2778"/>
+      </w:tblGrid>
+      <w:tr>
+        <w:trPr>
+          <w:cantSplit/>
+        </w:trPr>
+        <w:tc>
+          <w:tcPr>
+            <w:tcW w:type="dxa" w:w="7030"/>
+            <w:vAlign w:val="top"/>
+          </w:tcPr>
+          <w:p>
+            <w:pPr>
+              <w:widowControl/>
+              <w:spacing w:after="260" w:before="0" w:line="293" w:lineRule="auto"/>
+              <w:jc w:val="both"/>
+            </w:pPr>
+            <w:r>
+              <w:rPr>
+                <w:rFonts w:ascii="Arial" w:hAnsi="Arial"/>
+                <w:b w:val="0"/>
+                <w:color w:val="000000"/>
+                <w:sz w:val="24"/>
+                <w:lang w:val="tr-TR"/>
+              </w:rPr>
+              <w:t>Arama sonuçlarından seçim yapıldığında önce besinin ayrıntısını yükleyip ardından porsiyon penceresini açan akışı bağladım. Kullanıcı porsiyonu onaylarsa bu pencere DiaryEntry döndürüyor; iptal ederse kayıt oluşmuyor. Ayrıntıları besin kimliğine göre bellekte saklayan önbellek, aynı besin tekrar açıldığında gereksiz ağ çağrılarını azaltıyor. Önbelleği, açık oturumdaki ayrıntı isteklerini hızlandıran bir katman olarak kullandım.</w:t>
+            </w:r>
+          </w:p>
+          <w:p>
+            <w:pPr>
+              <w:widowControl/>
+              <w:spacing w:after="260" w:before="0" w:line="293" w:lineRule="auto"/>
+              <w:jc w:val="both"/>
+            </w:pPr>
+            <w:r>
+              <w:rPr>
+                <w:rFonts w:ascii="Arial" w:hAnsi="Arial"/>
+                <w:b w:val="0"/>
+                <w:color w:val="000000"/>
+                <w:sz w:val="24"/>
+                <w:lang w:val="tr-TR"/>
+              </w:rPr>
+              <w:t>İsteklere 30 saniyelik zaman aşımı uygulanmasını ve hatanın arayüzde yakalanmasını inceledim. Beklenen akışı “sorgu → kısa sonuç → ayrıntı → porsiyon → günlük kaydı” şeklinde takip ederek veri dönüşümlerini netleştirdim. Bu çalışma, API entegrasyonunun yalnızca adres çağırmak olmadığını gösterdi; boş girdi, başarısız yanıt ve kullanıcının işlemi iptal etmesi de akışın parçalarıdır. Hazır besin servisinin mobil uygulamaya entegrasyonunu bu katmanda düzenledim.</w:t>
+            </w:r>
+          </w:p>
+        </w:tc>
+        <w:tc>
+          <w:tcPr>
+            <w:tcW w:type="dxa" w:w="2778"/>
+            <w:vAlign w:val="top"/>
+          </w:tcPr>
+          <w:tbl>
+            <w:tblPr>
+              <w:tblW w:type="auto" w:w="0"/>
+              <w:jc w:val="center"/>
+              <w:tblLayout w:type="fixed"/>
+              <w:tblLook w:firstColumn="1" w:firstRow="1" w:lastColumn="0" w:lastRow="0" w:noHBand="0" w:noVBand="1" w:val="04A0"/>
+              <w:tblBorders>
+                <w:top w:val="single" w:sz="6" w:color="999999"/>
+                <w:left w:val="single" w:sz="6" w:color="999999"/>
+                <w:bottom w:val="single" w:sz="6" w:color="999999"/>
+                <w:right w:val="single" w:sz="6" w:color="999999"/>
+                <w:insideH w:val="single" w:sz="6" w:color="999999"/>
+                <w:insideV w:val="single" w:sz="6" w:color="999999"/>
+              </w:tblBorders>
+              <w:tblCellMar>
+                <w:top w:w="70" w:type="dxa"/>
+                <w:bottom w:w="70" w:type="dxa"/>
+                <w:left w:w="110" w:type="dxa"/>
+                <w:right w:w="110" w:type="dxa"/>
+              </w:tblCellMar>
+            </w:tblPr>
+            <w:tblGrid>
+              <w:gridCol w:w="2381"/>
+            </w:tblGrid>
+            <w:tr>
+              <w:trPr>
+                <w:trHeight w:val="5443" w:hRule="atLeast"/>
+                <w:cantSplit/>
+              </w:trPr>
+              <w:tc>
+                <w:tcPr>
+                  <w:tcW w:type="dxa" w:w="2381"/>
+                  <w:vAlign w:val="center"/>
+                </w:tcPr>
+                <w:p>
+                  <w:pPr>
+                    <w:spacing w:after="80" w:before="80" w:line="259" w:lineRule="auto"/>
+                    <w:jc w:val="center"/>
+                  </w:pPr>
+                  <w:r/>
+                  <w:r>
+                    <w:rPr>
+                      <w:rFonts w:ascii="Arial" w:hAnsi="Arial"/>
+                      <w:b w:val="0"/>
+                      <w:color w:val="000000"/>
+                      <w:sz w:val="20"/>
+                      <w:lang w:val="tr-TR"/>
+                    </w:rPr>
+                    <w:t>EKRAN GÖRÜNTÜSÜ</w:t>
+                    <w:br/>
+                    <w:t>EKLENECEK</w:t>
+                    <w:br/>
+                    <w:br/>
+                    <w:t>Şekil 2</w:t>
+                    <w:br/>
+                    <w:t>06. gün</w:t>
+                  </w:r>
+                </w:p>
+              </w:tc>
+            </w:tr>
+          </w:tbl>
+          <w:p>
+            <w:pPr>
+              <w:spacing w:line="259" w:lineRule="auto" w:before="100" w:after="0"/>
+              <w:jc w:val="center"/>
+            </w:pPr>
+            <w:r>
+              <w:rPr>
+                <w:rFonts w:ascii="Arial" w:hAnsi="Arial"/>
+                <w:b w:val="0"/>
+                <w:color w:val="000000"/>
+                <w:sz w:val="18"/>
+                <w:lang w:val="tr-TR"/>
+              </w:rPr>
+              <w:t>Şekil 2. Besin arama sonuçları</w:t>
+            </w:r>
+          </w:p>
+        </w:tc>
+      </w:tr>
+    </w:tbl>
     <w:p>
       <w:pPr>
         <w:sectPr>
@@ -1979,7 +2236,24 @@
           <w:sz w:val="24"/>
           <w:lang w:val="tr-TR"/>
         </w:rPr>
-        <w:t>Öncelikle her tuş vuruşunda istek göndermemek için 350 milisaniyelik gecikmeli aramayı kullandım. Yeni bir değişiklik olduğunda önceki zamanlayıcı iptal ediliyor ve yeni süre başlıyor. Ancak bu yöntem, daha önce gönderilmiş bir isteği tek başına geçersiz kılmıyor. Bu nedenle her değişiklikte istek numarasını artırıp, dönen yanıtın numarasını güncel numarayla karşılaştırdım. Yalnızca son aramaya ait yanıt ekran durumunu güncelliyor.</w:t>
+        <w:t>Öncelikle her tuş vuruşunda istek göndermemek için 350 milisaniyelik gecikmeli aramayı kullandım. Yeni bir değişiklik olduğunda önceki zamanlayıcı iptal ediliyor ve yeni süre başlıyor.</w:t>
+      </w:r>
+    </w:p>
+    <w:p>
+      <w:pPr>
+        <w:widowControl/>
+        <w:spacing w:after="260" w:before="0" w:line="293" w:lineRule="auto"/>
+        <w:jc w:val="both"/>
+      </w:pPr>
+      <w:r>
+        <w:rPr>
+          <w:rFonts w:ascii="Arial" w:hAnsi="Arial"/>
+          <w:b w:val="0"/>
+          <w:color w:val="000000"/>
+          <w:sz w:val="24"/>
+          <w:lang w:val="tr-TR"/>
+        </w:rPr>
+        <w:t>Ancak bu yöntem, daha önce gönderilmiş bir isteği tek başına geçersiz kılmıyor. Bu nedenle her değişiklikte istek numarasını artırıp, dönen yanıtın numarasını güncel numarayla karşılaştırdım. Yalnızca son aramaya ait yanıt ekran durumunu güncelliyor.</w:t>
       </w:r>
     </w:p>
     <w:p>
@@ -2013,7 +2287,7 @@
           <w:sz w:val="24"/>
           <w:lang w:val="tr-TR"/>
         </w:rPr>
-        <w:t>Regresyon testinde isteğin yanıtını Completer ile bekletip arama alanını temizleyen senaryoyu kullandım. Sonradan tamamlanan yanıtın ekranda besin göstermemesi bekleniyor. Böylece yalnızca hızlı internet üzerinde düzgün görünen bir ekranı değil, yanıt sırası değiştiğinde de doğru davranan akışı değerlendirdim. Gün sonunda asenkron programlamada en son tamamlanan işlemin her zaman kullanıcının en son isteği olmadığını öğrendim.</w:t>
+        <w:t>Regresyon testinde isteğin yanıtını Completer ile bekletip arama alanını temizleyen senaryoyu kullandım. Sonradan tamamlanan yanıtın ekranda besin göstermemesi bekleniyor. Böylece yalnızca hızlı internet üzerinde düzgün görünen bir ekranı değil, yanıt sırası değiştiğinde de doğru davranan akışı değerlendirdim. Bu test sayesinde kullanıcının son isteğini temsil eden yanıtı seçme ve eski sonuçları ayıklama konusunda pratik kazandım.</w:t>
       </w:r>
     </w:p>
     <w:p>
@@ -2086,40 +2360,160 @@
         <w:t>EntryDetailSheet açılırken foodId üzerinden kaynak ayrıntısı isteniyor. Günlükte tüketilmiş miktara ait değerler ise kaydın kendi nutrients listesinden gösteriliyor. Bu ayrımı korudum; uzak kaynaktaki yüz gramlık değerle kullanıcının gerçekten kaydettiği miktarın değeri birbirine karışmamalı. Besin ögelerini isimlerine göre sıralamak ve uzun içerik için kaydırılabilir pencere kullanmak, listeyi daha rahat okunabilir hâle getiriyor.</w:t>
       </w:r>
     </w:p>
-    <w:p>
-      <w:pPr>
-        <w:widowControl/>
-        <w:spacing w:after="260" w:before="0" w:line="293" w:lineRule="auto"/>
-        <w:jc w:val="both"/>
-      </w:pPr>
-      <w:r>
-        <w:rPr>
-          <w:rFonts w:ascii="Arial" w:hAnsi="Arial"/>
-          <w:b w:val="0"/>
-          <w:color w:val="000000"/>
-          <w:sz w:val="24"/>
-          <w:lang w:val="tr-TR"/>
-        </w:rPr>
-        <w:t>Düzenleme işlemini iki farklı ihtiyaca ayırdım. Miktar veya öğün yanlışsa mevcut kaydın porsiyonu değiştiriliyor; besinin kendisi yanlışsa Replace food üzerinden yeniden arama açılıyor. Besin değiştirme sırasında yeni seçimin değerlerini alırken eski kaydın kimliğini ve tarihini korudum. Böylece düzeltme, yanlışlıkla yeni bir öğün eklemek veya eski günü değiştirmek anlamına gelmiyor. Kullanıcı seçimden vazgeçerse özgün kayıt korunuyor.</w:t>
-      </w:r>
-    </w:p>
-    <w:p>
-      <w:pPr>
-        <w:widowControl/>
-        <w:spacing w:after="260" w:before="0" w:line="293" w:lineRule="auto"/>
-        <w:jc w:val="both"/>
-      </w:pPr>
-      <w:r>
-        <w:rPr>
-          <w:rFonts w:ascii="Arial" w:hAnsi="Arial"/>
-          <w:b w:val="0"/>
-          <w:color w:val="000000"/>
-          <w:sz w:val="24"/>
-          <w:lang w:val="tr-TR"/>
-        </w:rPr>
-        <w:t>needsReview işaretli kayıtta Quick estimate açıklamasını göstererek tahmini miktarın fark edilmesini sağladım. entry_detail_test.dart içindeki besin değiştirme senaryosu, yeni besin seçildiğinde eski kayıt kimliğinin korunmasını denetliyor. Bu çalışma bana kaynak bilgisini göstermenin yalnızca ayrıntı eklemek olmadığını öğretti: kullanıcı hangi besini kaydettiğini anlayabiliyor ve hatanın miktarda mı, eşleşmede mi olduğunu ayırt ederek doğru düzeltmeyi yapabiliyor.</w:t>
-      </w:r>
-    </w:p>
+    <w:tbl>
+      <w:tblPr>
+        <w:tblW w:type="auto" w:w="0"/>
+        <w:jc w:val="center"/>
+        <w:tblLayout w:type="fixed"/>
+        <w:tblLook w:firstColumn="1" w:firstRow="1" w:lastColumn="0" w:lastRow="0" w:noHBand="0" w:noVBand="1" w:val="04A0"/>
+        <w:tblBorders>
+          <w:top w:val="nil"/>
+          <w:left w:val="nil"/>
+          <w:bottom w:val="nil"/>
+          <w:right w:val="nil"/>
+          <w:insideH w:val="nil"/>
+          <w:insideV w:val="nil"/>
+        </w:tblBorders>
+        <w:tblCellMar>
+          <w:top w:w="0" w:type="dxa"/>
+          <w:bottom w:w="0" w:type="dxa"/>
+          <w:left w:w="0" w:type="dxa"/>
+          <w:right w:w="90" w:type="dxa"/>
+        </w:tblCellMar>
+      </w:tblPr>
+      <w:tblGrid>
+        <w:gridCol w:w="7030"/>
+        <w:gridCol w:w="2778"/>
+      </w:tblGrid>
+      <w:tr>
+        <w:trPr>
+          <w:cantSplit/>
+        </w:trPr>
+        <w:tc>
+          <w:tcPr>
+            <w:tcW w:type="dxa" w:w="7030"/>
+            <w:vAlign w:val="top"/>
+          </w:tcPr>
+          <w:p>
+            <w:pPr>
+              <w:widowControl/>
+              <w:spacing w:after="260" w:before="0" w:line="293" w:lineRule="auto"/>
+              <w:jc w:val="both"/>
+            </w:pPr>
+            <w:r>
+              <w:rPr>
+                <w:rFonts w:ascii="Arial" w:hAnsi="Arial"/>
+                <w:b w:val="0"/>
+                <w:color w:val="000000"/>
+                <w:sz w:val="24"/>
+                <w:lang w:val="tr-TR"/>
+              </w:rPr>
+              <w:t>Düzenleme işlemini iki farklı ihtiyaca ayırdım. Miktar veya öğün yanlışsa mevcut kaydın porsiyonu değiştiriliyor; besinin kendisi yanlışsa Replace food üzerinden yeniden arama açılıyor. Besin değiştirme sırasında yeni seçimin değerlerini alırken eski kaydın kimliğini ve tarihini korudum. Böylece düzeltme, yanlışlıkla yeni bir öğün eklemek veya eski günü değiştirmek anlamına gelmiyor. Kullanıcı seçimden vazgeçerse özgün kayıt korunuyor.</w:t>
+            </w:r>
+          </w:p>
+          <w:p>
+            <w:pPr>
+              <w:widowControl/>
+              <w:spacing w:after="260" w:before="0" w:line="293" w:lineRule="auto"/>
+              <w:jc w:val="both"/>
+            </w:pPr>
+            <w:r>
+              <w:rPr>
+                <w:rFonts w:ascii="Arial" w:hAnsi="Arial"/>
+                <w:b w:val="0"/>
+                <w:color w:val="000000"/>
+                <w:sz w:val="24"/>
+                <w:lang w:val="tr-TR"/>
+              </w:rPr>
+              <w:t>needsReview işaretli kayıtta Quick estimate açıklamasını göstererek tahmini miktarın fark edilmesini sağladım. entry_detail_test.dart içindeki besin değiştirme senaryosu, yeni besin seçildiğinde eski kayıt kimliğinin korunmasını denetliyor. Bu çalışma bana kaynak bilgisini göstermenin yalnızca ayrıntı eklemek olmadığını öğretti: kullanıcı hangi besini kaydettiğini anlayabiliyor ve hatanın miktarda mı, eşleşmede mi olduğunu ayırt ederek doğru düzeltmeyi yapabiliyor.</w:t>
+            </w:r>
+          </w:p>
+        </w:tc>
+        <w:tc>
+          <w:tcPr>
+            <w:tcW w:type="dxa" w:w="2778"/>
+            <w:vAlign w:val="top"/>
+          </w:tcPr>
+          <w:tbl>
+            <w:tblPr>
+              <w:tblW w:type="auto" w:w="0"/>
+              <w:jc w:val="center"/>
+              <w:tblLayout w:type="fixed"/>
+              <w:tblLook w:firstColumn="1" w:firstRow="1" w:lastColumn="0" w:lastRow="0" w:noHBand="0" w:noVBand="1" w:val="04A0"/>
+              <w:tblBorders>
+                <w:top w:val="single" w:sz="6" w:color="999999"/>
+                <w:left w:val="single" w:sz="6" w:color="999999"/>
+                <w:bottom w:val="single" w:sz="6" w:color="999999"/>
+                <w:right w:val="single" w:sz="6" w:color="999999"/>
+                <w:insideH w:val="single" w:sz="6" w:color="999999"/>
+                <w:insideV w:val="single" w:sz="6" w:color="999999"/>
+              </w:tblBorders>
+              <w:tblCellMar>
+                <w:top w:w="70" w:type="dxa"/>
+                <w:bottom w:w="70" w:type="dxa"/>
+                <w:left w:w="110" w:type="dxa"/>
+                <w:right w:w="110" w:type="dxa"/>
+              </w:tblCellMar>
+            </w:tblPr>
+            <w:tblGrid>
+              <w:gridCol w:w="2381"/>
+            </w:tblGrid>
+            <w:tr>
+              <w:trPr>
+                <w:trHeight w:val="5443" w:hRule="atLeast"/>
+                <w:cantSplit/>
+              </w:trPr>
+              <w:tc>
+                <w:tcPr>
+                  <w:tcW w:type="dxa" w:w="2381"/>
+                  <w:vAlign w:val="center"/>
+                </w:tcPr>
+                <w:p>
+                  <w:pPr>
+                    <w:spacing w:after="80" w:before="80" w:line="259" w:lineRule="auto"/>
+                    <w:jc w:val="center"/>
+                  </w:pPr>
+                  <w:r/>
+                  <w:r>
+                    <w:rPr>
+                      <w:rFonts w:ascii="Arial" w:hAnsi="Arial"/>
+                      <w:b w:val="0"/>
+                      <w:color w:val="000000"/>
+                      <w:sz w:val="20"/>
+                      <w:lang w:val="tr-TR"/>
+                    </w:rPr>
+                    <w:t>EKRAN GÖRÜNTÜSÜ</w:t>
+                    <w:br/>
+                    <w:t>EKLENECEK</w:t>
+                    <w:br/>
+                    <w:br/>
+                    <w:t>Şekil 3</w:t>
+                    <w:br/>
+                    <w:t>08. gün</w:t>
+                  </w:r>
+                </w:p>
+              </w:tc>
+            </w:tr>
+          </w:tbl>
+          <w:p>
+            <w:pPr>
+              <w:spacing w:line="259" w:lineRule="auto" w:before="100" w:after="0"/>
+              <w:jc w:val="center"/>
+            </w:pPr>
+            <w:r>
+              <w:rPr>
+                <w:rFonts w:ascii="Arial" w:hAnsi="Arial"/>
+                <w:b w:val="0"/>
+                <w:color w:val="000000"/>
+                <w:sz w:val="18"/>
+                <w:lang w:val="tr-TR"/>
+              </w:rPr>
+              <w:t>Şekil 3. Kaydedilen besinin ayrıntıları</w:t>
+            </w:r>
+          </w:p>
+        </w:tc>
+      </w:tr>
+    </w:tbl>
     <w:p>
       <w:pPr>
         <w:sectPr>
@@ -2190,40 +2584,160 @@
         <w:t>diary_test.dart dosyasındaki kontrollü elma örneğini kullandım. Test verisinde yüz gram için 52 kcal bulunuyor; 182 gram kaydedildiğinde işlem 52 × 182 / 100 = 94,64 kcal oluyor. Protein için 0,26 × 1,82 = 0,4732 gram bekleniyor. Bu rakamlar testin hesaplama verileridir. Ondalıklı işlemlerde küçük kayan nokta farklarını karşılamak için eşitliği uygun toleransla karşılaştırmanın neden gerekli olduğunu öğrendim.</w:t>
       </w:r>
     </w:p>
-    <w:p>
-      <w:pPr>
-        <w:widowControl/>
-        <w:spacing w:after="260" w:before="0" w:line="293" w:lineRule="auto"/>
-        <w:jc w:val="both"/>
-      </w:pPr>
-      <w:r>
-        <w:rPr>
-          <w:rFonts w:ascii="Arial" w:hAnsi="Arial"/>
-          <w:b w:val="0"/>
-          <w:color w:val="000000"/>
-          <w:sz w:val="24"/>
-          <w:lang w:val="tr-TR"/>
-        </w:rPr>
-        <w:t>Kemik veya kabuk içeren besinlerde satın alınan miktarla yenilen miktarı ayırdım. Testteki 500 gramlık tavuk örneğinde, besine bağlı kullanılabilir katsayı 0,67 olduğu için yenilebilir miktar 335 gramdır. Yüz gramda 161 kcal verisiyle toplam 539,35 kcal hesaplanır. inputGrams alanında 500, grams alanında 335 tutulması, hem kullanıcının girişini hem hesabın dayanağını koruyor. Benzer isimli başka bir besinin katsayısı kullanılmıyor.</w:t>
-      </w:r>
-    </w:p>
-    <w:p>
-      <w:pPr>
-        <w:widowControl/>
-        <w:spacing w:after="260" w:before="0" w:line="293" w:lineRule="auto"/>
-        <w:jc w:val="both"/>
-      </w:pPr>
-      <w:r>
-        <w:rPr>
-          <w:rFonts w:ascii="Arial" w:hAnsi="Arial"/>
-          <w:b w:val="0"/>
-          <w:color w:val="000000"/>
-          <w:sz w:val="24"/>
-          <w:lang w:val="tr-TR"/>
-        </w:rPr>
-        <w:t>Miktar düzenlemede sonlu, sıfırdan büyük ve en fazla 10.000 gram değer kabul edilmesini inceledim. Virgüllü ondalık girişin noktaya çevrilmesi, Türkçe kullanım için önemlidir. Satın alınan ağırlık seçilmiş ancak uygun katsayı bulunamamışsa kayıt düzeltme gerektiriyor. Gün sonunda doğru formül kadar, formüle verilen ağırlığın neyi temsil ettiğinin de önemli olduğunu gördüm; yanlış ağırlık temeliyle yapılan aritmetik, teknik olarak düzgün görünse bile yanlış sonuç verir.</w:t>
-      </w:r>
-    </w:p>
+    <w:tbl>
+      <w:tblPr>
+        <w:tblW w:type="auto" w:w="0"/>
+        <w:jc w:val="center"/>
+        <w:tblLayout w:type="fixed"/>
+        <w:tblLook w:firstColumn="1" w:firstRow="1" w:lastColumn="0" w:lastRow="0" w:noHBand="0" w:noVBand="1" w:val="04A0"/>
+        <w:tblBorders>
+          <w:top w:val="nil"/>
+          <w:left w:val="nil"/>
+          <w:bottom w:val="nil"/>
+          <w:right w:val="nil"/>
+          <w:insideH w:val="nil"/>
+          <w:insideV w:val="nil"/>
+        </w:tblBorders>
+        <w:tblCellMar>
+          <w:top w:w="0" w:type="dxa"/>
+          <w:bottom w:w="0" w:type="dxa"/>
+          <w:left w:w="0" w:type="dxa"/>
+          <w:right w:w="90" w:type="dxa"/>
+        </w:tblCellMar>
+      </w:tblPr>
+      <w:tblGrid>
+        <w:gridCol w:w="7030"/>
+        <w:gridCol w:w="2778"/>
+      </w:tblGrid>
+      <w:tr>
+        <w:trPr>
+          <w:cantSplit/>
+        </w:trPr>
+        <w:tc>
+          <w:tcPr>
+            <w:tcW w:type="dxa" w:w="7030"/>
+            <w:vAlign w:val="top"/>
+          </w:tcPr>
+          <w:p>
+            <w:pPr>
+              <w:widowControl/>
+              <w:spacing w:after="260" w:before="0" w:line="293" w:lineRule="auto"/>
+              <w:jc w:val="both"/>
+            </w:pPr>
+            <w:r>
+              <w:rPr>
+                <w:rFonts w:ascii="Arial" w:hAnsi="Arial"/>
+                <w:b w:val="0"/>
+                <w:color w:val="000000"/>
+                <w:sz w:val="24"/>
+                <w:lang w:val="tr-TR"/>
+              </w:rPr>
+              <w:t>Kemik veya kabuk içeren besinlerde satın alınan miktarla yenilen miktarı ayırdım. Testteki 500 gramlık tavuk örneğinde, besine bağlı kullanılabilir katsayı 0,67 olduğu için yenilebilir miktar 335 gramdır. Yüz gramda 161 kcal verisiyle toplam 539,35 kcal hesaplanır. inputGrams alanında 500, grams alanında 335 tutulması, hem kullanıcının girişini hem hesabın dayanağını koruyor. Benzer isimli başka bir besinin katsayısı kullanılmıyor.</w:t>
+            </w:r>
+          </w:p>
+          <w:p>
+            <w:pPr>
+              <w:widowControl/>
+              <w:spacing w:after="260" w:before="0" w:line="293" w:lineRule="auto"/>
+              <w:jc w:val="both"/>
+            </w:pPr>
+            <w:r>
+              <w:rPr>
+                <w:rFonts w:ascii="Arial" w:hAnsi="Arial"/>
+                <w:b w:val="0"/>
+                <w:color w:val="000000"/>
+                <w:sz w:val="24"/>
+                <w:lang w:val="tr-TR"/>
+              </w:rPr>
+              <w:t>Miktar düzenlemede sonlu, sıfırdan büyük ve en fazla 10.000 gram değer kabul edilmesini inceledim. Virgüllü ondalık girişin noktaya çevrilmesi, Türkçe kullanım için önemlidir. Satın alınan ağırlık seçilmiş ancak uygun katsayı bulunamamışsa kayıt düzeltme gerektiriyor. Bu uygulama, miktar doğrulamasıyla ağırlık dönüşümünü aynı hesaplama akışında birleştirmemi sağladı.</w:t>
+            </w:r>
+          </w:p>
+        </w:tc>
+        <w:tc>
+          <w:tcPr>
+            <w:tcW w:type="dxa" w:w="2778"/>
+            <w:vAlign w:val="top"/>
+          </w:tcPr>
+          <w:tbl>
+            <w:tblPr>
+              <w:tblW w:type="auto" w:w="0"/>
+              <w:jc w:val="center"/>
+              <w:tblLayout w:type="fixed"/>
+              <w:tblLook w:firstColumn="1" w:firstRow="1" w:lastColumn="0" w:lastRow="0" w:noHBand="0" w:noVBand="1" w:val="04A0"/>
+              <w:tblBorders>
+                <w:top w:val="single" w:sz="6" w:color="999999"/>
+                <w:left w:val="single" w:sz="6" w:color="999999"/>
+                <w:bottom w:val="single" w:sz="6" w:color="999999"/>
+                <w:right w:val="single" w:sz="6" w:color="999999"/>
+                <w:insideH w:val="single" w:sz="6" w:color="999999"/>
+                <w:insideV w:val="single" w:sz="6" w:color="999999"/>
+              </w:tblBorders>
+              <w:tblCellMar>
+                <w:top w:w="70" w:type="dxa"/>
+                <w:bottom w:w="70" w:type="dxa"/>
+                <w:left w:w="110" w:type="dxa"/>
+                <w:right w:w="110" w:type="dxa"/>
+              </w:tblCellMar>
+            </w:tblPr>
+            <w:tblGrid>
+              <w:gridCol w:w="2381"/>
+            </w:tblGrid>
+            <w:tr>
+              <w:trPr>
+                <w:trHeight w:val="5443" w:hRule="atLeast"/>
+                <w:cantSplit/>
+              </w:trPr>
+              <w:tc>
+                <w:tcPr>
+                  <w:tcW w:type="dxa" w:w="2381"/>
+                  <w:vAlign w:val="center"/>
+                </w:tcPr>
+                <w:p>
+                  <w:pPr>
+                    <w:spacing w:after="80" w:before="80" w:line="259" w:lineRule="auto"/>
+                    <w:jc w:val="center"/>
+                  </w:pPr>
+                  <w:r/>
+                  <w:r>
+                    <w:rPr>
+                      <w:rFonts w:ascii="Arial" w:hAnsi="Arial"/>
+                      <w:b w:val="0"/>
+                      <w:color w:val="000000"/>
+                      <w:sz w:val="20"/>
+                      <w:lang w:val="tr-TR"/>
+                    </w:rPr>
+                    <w:t>EKRAN GÖRÜNTÜSÜ</w:t>
+                    <w:br/>
+                    <w:t>EKLENECEK</w:t>
+                    <w:br/>
+                    <w:br/>
+                    <w:t>Şekil 4</w:t>
+                    <w:br/>
+                    <w:t>09. gün</w:t>
+                  </w:r>
+                </w:p>
+              </w:tc>
+            </w:tr>
+          </w:tbl>
+          <w:p>
+            <w:pPr>
+              <w:spacing w:line="259" w:lineRule="auto" w:before="100" w:after="0"/>
+              <w:jc w:val="center"/>
+            </w:pPr>
+            <w:r>
+              <w:rPr>
+                <w:rFonts w:ascii="Arial" w:hAnsi="Arial"/>
+                <w:b w:val="0"/>
+                <w:color w:val="000000"/>
+                <w:sz w:val="18"/>
+                <w:lang w:val="tr-TR"/>
+              </w:rPr>
+              <w:t>Şekil 4. Porsiyon ve gram seçimi</w:t>
+            </w:r>
+          </w:p>
+        </w:tc>
+      </w:tr>
+    </w:tbl>
     <w:p>
       <w:pPr>
         <w:sectPr>
@@ -2291,7 +2805,7 @@
           <w:sz w:val="24"/>
           <w:lang w:val="tr-TR"/>
         </w:rPr>
-        <w:t>Kaydetme sırasında her DiaryEntry nesnesi toJson ile alanlarına ayrılıyor; oluşan liste jsonEncode ile metne dönüştürülüyor. Açılışta getString ile okunan içerik jsonDecode ve fromJson üzerinden tekrar nesnelere çevriliyor. Henüz kayıt yoksa boş liste dönülüyor. Yalnızca foodId saklamak yerine miktar, tarih ve hesaplanmış besin değerlerini birlikte tutmak, geçmiş öğünlerin kaynak servisine yeniden bağlanmadan gösterilmesini sağlıyor.</w:t>
+        <w:t>Kaydetme sırasında her DiaryEntry nesnesi toJson ile alanlarına ayrılıyor; oluşan liste jsonEncode ile metne dönüştürülüyor. Açılışta getString ile okunan içerik jsonDecode ve fromJson üzerinden tekrar nesnelere çevriliyor. Henüz kayıt yoksa boş liste dönülüyor. Yalnızca foodId saklamak yerine miktar, tarih ve hesaplanmış besin değerlerini birlikte tutmak, geçmiş öğünlerin kaynak servisine yeniden bağlanmadan gösterilmesini sağlıyor. saveEntries içindeki setString sonucunu kontrol ettim. Depolama işlemi false dönerse StateError üretiliyor; böylece çağıran ekran başarısız yazmayı tamamlanmış gibi kabul etmiyor. Testlerde gerçek kişisel günlük yerine bellek içi saklama nesneleri ve SharedPreferences test başlangıç değerleri kullanılıyor. JSON dönüşüm senaryosu kimlik, öğün, gram ve kalori bilgisinin geri okunduğunda korunmasını sınayarak veri kaybına karşı somut kontrol sağlıyor.</w:t>
       </w:r>
     </w:p>
     <w:p>
@@ -2308,24 +2822,7 @@
           <w:sz w:val="24"/>
           <w:lang w:val="tr-TR"/>
         </w:rPr>
-        <w:t>saveEntries içindeki setString sonucunu kontrol ettim. Depolama işlemi false dönerse StateError üretiliyor; böylece çağıran ekran başarısız yazmayı tamamlanmış gibi kabul etmiyor. Testlerde gerçek kişisel günlük yerine bellek içi saklama nesneleri ve SharedPreferences test başlangıç değerleri kullanılıyor. JSON dönüşüm senaryosu kimlik, öğün, gram ve kalori bilgisinin geri okunduğunda korunmasını sınayarak veri kaybına karşı somut kontrol sağlıyor.</w:t>
-      </w:r>
-    </w:p>
-    <w:p>
-      <w:pPr>
-        <w:widowControl/>
-        <w:spacing w:after="260" w:before="0" w:line="293" w:lineRule="auto"/>
-        <w:jc w:val="both"/>
-      </w:pPr>
-      <w:r>
-        <w:rPr>
-          <w:rFonts w:ascii="Arial" w:hAnsi="Arial"/>
-          <w:b w:val="0"/>
-          <w:color w:val="000000"/>
-          <w:sz w:val="24"/>
-          <w:lang w:val="tr-TR"/>
-        </w:rPr>
-        <w:t>Bu yöntemin sınırlarını da not ettim. Yerel saklama, bulut eşitleme veya yedekleme anlamına gelmiyor; mevcut uygulamada dışa aktarma ve geri yükleme arayüzü bulunmuyor. Büyük günlükler, bozuk JSON ve uygulamanın beklenmedik kapanması için daha kapsamlı dayanıklılık çalışmaları yapılabilir. Gün sonunda kalıcılığın yalnızca bir kaydetme komutu olmadığını; veri biçimi, hata sonucu ve yeniden açılıştaki okuma davranışının birlikte tasarlanması gerektiğini öğrendim.</w:t>
+        <w:t>Son olarak yerel saklama ile açılış akışının bağlantısını takip ettim. Denetleyici kayıtları yükledikten sonra seçilen tarihe ait öğünleri aynı modeller üzerinden görüntülüyor. Verilerin ayrı anahtarlarda tutulması ve kayıt anındaki besin değerlerinin korunması bu akışı anlaşılır kılıyor. Çalışma boyunca JSON dönüşümü, yazma sonucunun kontrolü ve kayıtların yeniden okunması konularında pratik deneyim kazandım.</w:t>
       </w:r>
     </w:p>
     <w:p>
@@ -2429,7 +2926,7 @@
           <w:sz w:val="24"/>
           <w:lang w:val="tr-TR"/>
         </w:rPr>
-        <w:t>Regresyon testinde ilk yazmayı bekletip düzeltmeyi sıraya aldım; ikinci yazmaya “disk full” hatası verilince kaydın son saklanan 100 grama dönmesi bekleniyor. Bu kontrollü hata, normal bir denemede kolayca görünmeyen yarış durumunu anlamamı sağladı. Gün sonunda hızlı tepki veren arayüzün arkasında işlem sırası, kimlik denetimi ve başarısızlık davranışının birlikte kurulması gerektiğini öğrendim.</w:t>
+        <w:t>Regresyon testinde ilk yazmayı bekletip düzeltmeyi sıraya aldım; ikinci yazmaya “disk full” hatası verilince kaydın son saklanan 100 grama dönmesi bekleniyor. Bu kontrollü hata, normal bir denemede kolayca görünmeyen yarış durumunu anlamamı sağladı. Bu çalışma, işlem sırasını ve kimlik denetimini hızlı arayüz davranışıyla birlikte tasarlama becerimi geliştirdi.</w:t>
       </w:r>
     </w:p>
     <w:p>
@@ -2482,7 +2979,7 @@
           <w:sz w:val="24"/>
           <w:lang w:val="tr-TR"/>
         </w:rPr>
-        <w:t>Bugün kaydedilmiş bir öğünü düzenlerken özgün verinin kaybolmaması üzerine çalıştım. Özellikle sesli kaydın ardından Edit batch açıldığında mevcut besinleri önce silmek risklidir. Kullanıcı yalnızca kontrol etmek için pencereyi açıp geri dönebilir. Düzenleme ekranının açılmasını veri değişikliği saymak yerine, değişiklikleri ancak Save changes başarıyla tamamlandığında uygulayan akışı kullandım.</w:t>
+        <w:t>Bugün kaydedilmiş bir öğünü düzenlerken özgün verinin kaybolmaması üzerine çalıştım. Özellikle sesli kaydın ardından Edit batch açıldığında mevcut besinleri önce silmek risklidir. Kullanıcı yalnızca kontrol etmek için pencereyi açıp geri dönebilir. Editör açıldığında ve iptal edildiğinde özgün kayıtları korudum. Save changes başlatılınca bellek ve arayüz hemen güncelleniyor, disk yazması sıraya alınıyor. Başarı bildirimi yazma tamamlandıktan sonra veriliyor. Yazma başarısızsa ve bu değişiklik hâlâ güncelse son saklanan duruma dönülüyor.</w:t>
       </w:r>
     </w:p>
     <w:p>
@@ -2502,40 +2999,160 @@
         <w:t>Toplu düzenlemede updateEntries, mevcut listedeki kayıtları kimliklerine göre yeni değerlerle değiştiriyor. Editör açılırken veya iptal edilirken silme yapılmıyor. Ayrıca listeden daha önce kaldırılmış bir kaydı, eski bir editörden dönen sonuçla yeniden eklememek için yalnızca mevcut kimlikler güncelleniyor. Böylece “düzenle” ile “yeni kayıt oluştur” işlemleri arasında net bir ayrım bulunuyor.</w:t>
       </w:r>
     </w:p>
-    <w:p>
-      <w:pPr>
-        <w:widowControl/>
-        <w:spacing w:after="260" w:before="0" w:line="293" w:lineRule="auto"/>
-        <w:jc w:val="both"/>
-      </w:pPr>
-      <w:r>
-        <w:rPr>
-          <w:rFonts w:ascii="Arial" w:hAnsi="Arial"/>
-          <w:b w:val="0"/>
-          <w:color w:val="000000"/>
-          <w:sz w:val="24"/>
-          <w:lang w:val="tr-TR"/>
-        </w:rPr>
-        <w:t>Tek besinin miktarını değiştiren pencerede withEditedServing yöntemini kullandım. Bu yöntem eski kimliği ve tarihi koruyup besin değerlerini yeni miktarın eski miktara oranıyla ölçekliyor. Örneğin kontrollü testte 100 gramlık, 52 kcal içeren tahmini kayıt 150 grama düzeltildiğinde 78 kcal oluyor. Öğün kahvaltı olarak değiştirilebiliyor ve düzeltme sonrası needsReview işareti kaldırılıyor. Kullanıcının virgüllü girişini kabul etmek için ondalık ayracını da normalleştirdim.</w:t>
-      </w:r>
-    </w:p>
-    <w:p>
-      <w:pPr>
-        <w:widowControl/>
-        <w:spacing w:after="260" w:before="0" w:line="293" w:lineRule="auto"/>
-        <w:jc w:val="both"/>
-      </w:pPr>
-      <w:r>
-        <w:rPr>
-          <w:rFonts w:ascii="Arial" w:hAnsi="Arial"/>
-          <w:b w:val="0"/>
-          <w:color w:val="000000"/>
-          <w:sz w:val="24"/>
-          <w:lang w:val="tr-TR"/>
-        </w:rPr>
-        <w:t>entry_detail_test.dart içindeki iptal, ondalıklı miktar ve besin değiştirme senaryolarıyla işlemleri değerlendirdim. Sesli toplu düzenlemeden çıkma testi de özgün besinlerin günlükte kaldığını kontrol ediyor. Miktar penceresinde metin alanının kapanış animasyonu boyunca geçerli kalmasına dikkat ettim; erken bırakılan denetleyici arayüz hatası oluşturabilir. Bu çalışma, düzenleme başarısını yalnızca Kaydet düğmesine basmakla değil, kullanıcının vazgeçtiği bütün çıkış yollarıyla birlikte değerlendirmeyi öğretti.</w:t>
-      </w:r>
-    </w:p>
+    <w:tbl>
+      <w:tblPr>
+        <w:tblW w:type="auto" w:w="0"/>
+        <w:jc w:val="center"/>
+        <w:tblLayout w:type="fixed"/>
+        <w:tblLook w:firstColumn="1" w:firstRow="1" w:lastColumn="0" w:lastRow="0" w:noHBand="0" w:noVBand="1" w:val="04A0"/>
+        <w:tblBorders>
+          <w:top w:val="nil"/>
+          <w:left w:val="nil"/>
+          <w:bottom w:val="nil"/>
+          <w:right w:val="nil"/>
+          <w:insideH w:val="nil"/>
+          <w:insideV w:val="nil"/>
+        </w:tblBorders>
+        <w:tblCellMar>
+          <w:top w:w="0" w:type="dxa"/>
+          <w:bottom w:w="0" w:type="dxa"/>
+          <w:left w:w="0" w:type="dxa"/>
+          <w:right w:w="90" w:type="dxa"/>
+        </w:tblCellMar>
+      </w:tblPr>
+      <w:tblGrid>
+        <w:gridCol w:w="7030"/>
+        <w:gridCol w:w="2778"/>
+      </w:tblGrid>
+      <w:tr>
+        <w:trPr>
+          <w:cantSplit/>
+        </w:trPr>
+        <w:tc>
+          <w:tcPr>
+            <w:tcW w:type="dxa" w:w="7030"/>
+            <w:vAlign w:val="top"/>
+          </w:tcPr>
+          <w:p>
+            <w:pPr>
+              <w:widowControl/>
+              <w:spacing w:after="260" w:before="0" w:line="293" w:lineRule="auto"/>
+              <w:jc w:val="both"/>
+            </w:pPr>
+            <w:r>
+              <w:rPr>
+                <w:rFonts w:ascii="Arial" w:hAnsi="Arial"/>
+                <w:b w:val="0"/>
+                <w:color w:val="000000"/>
+                <w:sz w:val="24"/>
+                <w:lang w:val="tr-TR"/>
+              </w:rPr>
+              <w:t>Tek besinin miktarını değiştiren pencerede withEditedServing yöntemini kullandım. Bu yöntem eski kimliği ve tarihi koruyup besin değerlerini yeni miktarın eski miktara oranıyla ölçekliyor. Örneğin kontrollü testte 100 gramlık, 52 kcal içeren tahmini kayıt 150 grama düzeltildiğinde 78 kcal oluyor. Öğün kahvaltı olarak değiştirilebiliyor ve düzeltme sonrası needsReview işareti kaldırılıyor. Kullanıcının virgüllü girişini kabul etmek için ondalık ayracını da normalleştirdim.</w:t>
+            </w:r>
+          </w:p>
+          <w:p>
+            <w:pPr>
+              <w:widowControl/>
+              <w:spacing w:after="260" w:before="0" w:line="293" w:lineRule="auto"/>
+              <w:jc w:val="both"/>
+            </w:pPr>
+            <w:r>
+              <w:rPr>
+                <w:rFonts w:ascii="Arial" w:hAnsi="Arial"/>
+                <w:b w:val="0"/>
+                <w:color w:val="000000"/>
+                <w:sz w:val="24"/>
+                <w:lang w:val="tr-TR"/>
+              </w:rPr>
+              <w:t>entry_detail_test.dart içindeki iptal, ondalıklı miktar ve besin değiştirme senaryolarıyla işlemleri değerlendirdim. Sesli toplu düzenlemeden çıkma testi de özgün besinlerin günlükte kaldığını kontrol ediyor. Miktar penceresinde metin alanının kapanış animasyonu boyunca geçerli kalmasına dikkat ettim; erken bırakılan denetleyici arayüz hatası oluşturabilir. Bu çalışma, düzenleme başarısını yalnızca Kaydet düğmesine basmakla değil, kullanıcının vazgeçtiği bütün çıkış yollarıyla birlikte değerlendirmeyi öğretti.</w:t>
+            </w:r>
+          </w:p>
+        </w:tc>
+        <w:tc>
+          <w:tcPr>
+            <w:tcW w:type="dxa" w:w="2778"/>
+            <w:vAlign w:val="top"/>
+          </w:tcPr>
+          <w:tbl>
+            <w:tblPr>
+              <w:tblW w:type="auto" w:w="0"/>
+              <w:jc w:val="center"/>
+              <w:tblLayout w:type="fixed"/>
+              <w:tblLook w:firstColumn="1" w:firstRow="1" w:lastColumn="0" w:lastRow="0" w:noHBand="0" w:noVBand="1" w:val="04A0"/>
+              <w:tblBorders>
+                <w:top w:val="single" w:sz="6" w:color="999999"/>
+                <w:left w:val="single" w:sz="6" w:color="999999"/>
+                <w:bottom w:val="single" w:sz="6" w:color="999999"/>
+                <w:right w:val="single" w:sz="6" w:color="999999"/>
+                <w:insideH w:val="single" w:sz="6" w:color="999999"/>
+                <w:insideV w:val="single" w:sz="6" w:color="999999"/>
+              </w:tblBorders>
+              <w:tblCellMar>
+                <w:top w:w="70" w:type="dxa"/>
+                <w:bottom w:w="70" w:type="dxa"/>
+                <w:left w:w="110" w:type="dxa"/>
+                <w:right w:w="110" w:type="dxa"/>
+              </w:tblCellMar>
+            </w:tblPr>
+            <w:tblGrid>
+              <w:gridCol w:w="2381"/>
+            </w:tblGrid>
+            <w:tr>
+              <w:trPr>
+                <w:trHeight w:val="5443" w:hRule="atLeast"/>
+                <w:cantSplit/>
+              </w:trPr>
+              <w:tc>
+                <w:tcPr>
+                  <w:tcW w:type="dxa" w:w="2381"/>
+                  <w:vAlign w:val="center"/>
+                </w:tcPr>
+                <w:p>
+                  <w:pPr>
+                    <w:spacing w:after="80" w:before="80" w:line="259" w:lineRule="auto"/>
+                    <w:jc w:val="center"/>
+                  </w:pPr>
+                  <w:r/>
+                  <w:r>
+                    <w:rPr>
+                      <w:rFonts w:ascii="Arial" w:hAnsi="Arial"/>
+                      <w:b w:val="0"/>
+                      <w:color w:val="000000"/>
+                      <w:sz w:val="20"/>
+                      <w:lang w:val="tr-TR"/>
+                    </w:rPr>
+                    <w:t>EKRAN GÖRÜNTÜSÜ</w:t>
+                    <w:br/>
+                    <w:t>EKLENECEK</w:t>
+                    <w:br/>
+                    <w:br/>
+                    <w:t>Şekil 5</w:t>
+                    <w:br/>
+                    <w:t>12. gün</w:t>
+                  </w:r>
+                </w:p>
+              </w:tc>
+            </w:tr>
+          </w:tbl>
+          <w:p>
+            <w:pPr>
+              <w:spacing w:line="259" w:lineRule="auto" w:before="100" w:after="0"/>
+              <w:jc w:val="center"/>
+            </w:pPr>
+            <w:r>
+              <w:rPr>
+                <w:rFonts w:ascii="Arial" w:hAnsi="Arial"/>
+                <w:b w:val="0"/>
+                <w:color w:val="000000"/>
+                <w:sz w:val="18"/>
+                <w:lang w:val="tr-TR"/>
+              </w:rPr>
+              <w:t>Şekil 5. Miktar ve öğün düzenleme</w:t>
+            </w:r>
+          </w:p>
+        </w:tc>
+      </w:tr>
+    </w:tbl>
     <w:p>
       <w:pPr>
         <w:sectPr>
@@ -2603,7 +3220,24 @@
           <w:sz w:val="24"/>
           <w:lang w:val="tr-TR"/>
         </w:rPr>
-        <w:t>Enerji hesabında karşılaşılan önemli ayrıntı, USDA kaynaklarının aynı bilgiyi farklı alanlarda taşıyabilmesiydi. Bir besinde Energy, diğerinde Energy (Atwater Specific Factors) bulunabiliyor. Önce bütün alanları topladıktan sonra yalnızca Energy alanını seçmek, diğer besinin kalorisini kaybettiriyordu. Çözümde her DiaryEntry için öncelikle geçerli enerji alanını seçtim; günlük toplamı daha sonra bu tekil kalori değerlerinden oluşturdum.</w:t>
+        <w:t>Enerji hesabında karşılaşılan önemli ayrıntı, USDA kaynaklarının aynı bilgiyi farklı alanlarda taşıyabilmesiydi. Bir besinde Energy, diğerinde Energy (Atwater Specific Factors) bulunabiliyor. Önce bütün alanları topladıktan sonra yalnızca Energy alanını seçmek, diğer besinin kalorisini kaybettiriyordu.</w:t>
+      </w:r>
+    </w:p>
+    <w:p>
+      <w:pPr>
+        <w:widowControl/>
+        <w:spacing w:after="260" w:before="0" w:line="293" w:lineRule="auto"/>
+        <w:jc w:val="both"/>
+      </w:pPr>
+      <w:r>
+        <w:rPr>
+          <w:rFonts w:ascii="Arial" w:hAnsi="Arial"/>
+          <w:b w:val="0"/>
+          <w:color w:val="000000"/>
+          <w:sz w:val="24"/>
+          <w:lang w:val="tr-TR"/>
+        </w:rPr>
+        <w:t>Çözümde her DiaryEntry için öncelikle geçerli enerji alanını seçtim; günlük toplamı daha sonra bu tekil kalori değerlerinden oluşturdum.</w:t>
       </w:r>
     </w:p>
     <w:p>
@@ -2637,7 +3271,7 @@
           <w:sz w:val="24"/>
           <w:lang w:val="tr-TR"/>
         </w:rPr>
-        <w:t>Protein, karbonhidrat ve yağ toplamlarını da seçilen güne ait kayıtlar üzerinden hesapladım. Model testi, 100 ve 50 gramlık kontrollü elma kayıtlarının toplam enerjisinin 78 kcal olduğunu doğruluyor. Kullanıcı başka güne geçtiğinde aynı kayıtların yanlışlıkla toplamda kalmaması gerekiyor. Gün sonunda veri kaynaklarının farklı adlandırmalarını dikkate almadan yapılan toplamanın eksik veya çift sayım yaratabileceğini öğrendim; testte beklenen sayıyı elle hesaplamak bu tür hataları görünür kılıyor.</w:t>
+        <w:t>Protein, karbonhidrat ve yağ toplamlarını da seçilen güne ait kayıtlar üzerinden hesapladım. Model testi, 100 ve 50 gramlık kontrollü elma kayıtlarının toplam enerjisinin 78 kcal olduğunu doğruluyor. Kullanıcı başka güne geçtiğinde aynı kayıtların yanlışlıkla toplamda kalmaması gerekiyor. Beklenen sayıyı elle hesaplayıp test sonucuyla karşılaştırmak, kaynak alanlarını doğru seçtiğimi değerlendirmemi sağladı.</w:t>
       </w:r>
     </w:p>
     <w:p>
@@ -2710,40 +3344,160 @@
         <w:t>CoachService içindeki _nutrientMetric yönteminde önce her kayıtta ilgili ad ve birime sahip alanı aradım. Alan bulunan kayıt sayısı ayrıca tutuluyor; hiç değer bulunmazsa amount null gönderiliyor. Değer varsa bilinen miktarlar toplanıyor ve toplam kaç besinden kaçında veri bulunduğu bağlama ekleniyor. Böylece model yalnızca miktarı değil, o miktarın eksik kapsama dayanıp dayanmadığını da görebiliyor.</w:t>
       </w:r>
     </w:p>
-    <w:p>
-      <w:pPr>
-        <w:widowControl/>
-        <w:spacing w:after="260" w:before="0" w:line="293" w:lineRule="auto"/>
-        <w:jc w:val="both"/>
-      </w:pPr>
-      <w:r>
-        <w:rPr>
-          <w:rFonts w:ascii="Arial" w:hAnsi="Arial"/>
-          <w:b w:val="0"/>
-          <w:color w:val="000000"/>
-          <w:sz w:val="24"/>
-          <w:lang w:val="tr-TR"/>
-        </w:rPr>
-        <w:t>Testte üç günlük kayıt kullanılıyor: birinde 5 mikrogram D vitamini, ikincisinde sıfır, üçüncüsünde ise hiç alan bulunmuyor. Beklenen toplam 5, bilinen kayıt sayısı 2 ve toplam kayıt sayısı 3. Aynı örnekte kalsiyum bilgisi hiç yoksa null kalıyor. Mikrogram için µg, ug ve mcg gibi farklı yazımların aynı birime dönüştürülmesi de kontrol ediliyor. Sıfırın veri olarak korunması, eksik bilgiyle karıştırılmaması açısından önemliydi.</w:t>
-      </w:r>
-    </w:p>
-    <w:p>
-      <w:pPr>
-        <w:widowControl/>
-        <w:spacing w:after="260" w:before="0" w:line="293" w:lineRule="auto"/>
-        <w:jc w:val="both"/>
-      </w:pPr>
-      <w:r>
-        <w:rPr>
-          <w:rFonts w:ascii="Arial" w:hAnsi="Arial"/>
-          <w:b w:val="0"/>
-          <w:color w:val="000000"/>
-          <w:sz w:val="24"/>
-          <w:lang w:val="tr-TR"/>
-        </w:rPr>
-        <w:t>Raporun açıklamalarında mevcut günlük değerlerini kişisel tıbbi tanı gibi sunmamaya dikkat ettim. Uygulamada kullanılan genel referanslarla kişinin elle belirlediği hedefleri ayırdım; düşük görünen bir günlük toplam tek başına beslenme yetersizliği kanıtı değildir. Bu çalışma bana raporlama kalitesinin yalnızca çok sayıda gösterge eklemek olmadığını öğretti. Bilginin kaynağını, birimini ve eksik kalan kısmını açıklamak, sonucun kullanıcı tarafından doğru anlaşılması için gereklidir.</w:t>
-      </w:r>
-    </w:p>
+    <w:tbl>
+      <w:tblPr>
+        <w:tblW w:type="auto" w:w="0"/>
+        <w:jc w:val="center"/>
+        <w:tblLayout w:type="fixed"/>
+        <w:tblLook w:firstColumn="1" w:firstRow="1" w:lastColumn="0" w:lastRow="0" w:noHBand="0" w:noVBand="1" w:val="04A0"/>
+        <w:tblBorders>
+          <w:top w:val="nil"/>
+          <w:left w:val="nil"/>
+          <w:bottom w:val="nil"/>
+          <w:right w:val="nil"/>
+          <w:insideH w:val="nil"/>
+          <w:insideV w:val="nil"/>
+        </w:tblBorders>
+        <w:tblCellMar>
+          <w:top w:w="0" w:type="dxa"/>
+          <w:bottom w:w="0" w:type="dxa"/>
+          <w:left w:w="0" w:type="dxa"/>
+          <w:right w:w="90" w:type="dxa"/>
+        </w:tblCellMar>
+      </w:tblPr>
+      <w:tblGrid>
+        <w:gridCol w:w="7030"/>
+        <w:gridCol w:w="2778"/>
+      </w:tblGrid>
+      <w:tr>
+        <w:trPr>
+          <w:cantSplit/>
+        </w:trPr>
+        <w:tc>
+          <w:tcPr>
+            <w:tcW w:type="dxa" w:w="7030"/>
+            <w:vAlign w:val="top"/>
+          </w:tcPr>
+          <w:p>
+            <w:pPr>
+              <w:widowControl/>
+              <w:spacing w:after="260" w:before="0" w:line="293" w:lineRule="auto"/>
+              <w:jc w:val="both"/>
+            </w:pPr>
+            <w:r>
+              <w:rPr>
+                <w:rFonts w:ascii="Arial" w:hAnsi="Arial"/>
+                <w:b w:val="0"/>
+                <w:color w:val="000000"/>
+                <w:sz w:val="24"/>
+                <w:lang w:val="tr-TR"/>
+              </w:rPr>
+              <w:t>Testte günlüğe eklenmiş üç besin kaydı kullanılıyor: birinde 5 mikrogram D vitamini, ikincisinde sıfır, üçüncüsünde ise hiç alan bulunmuyor. Beklenen toplam 5, bilinen kayıt sayısı 2 ve toplam kayıt sayısı 3. Aynı örnekte kalsiyum bilgisi hiç yoksa null kalıyor. Mikrogram için µg, ug ve mcg gibi farklı yazımların aynı birime dönüştürülmesi de kontrol ediliyor. Sıfırın veri olarak korunması, eksik bilgiyle karıştırılmaması açısından önemliydi.</w:t>
+            </w:r>
+          </w:p>
+          <w:p>
+            <w:pPr>
+              <w:widowControl/>
+              <w:spacing w:after="260" w:before="0" w:line="293" w:lineRule="auto"/>
+              <w:jc w:val="both"/>
+            </w:pPr>
+            <w:r>
+              <w:rPr>
+                <w:rFonts w:ascii="Arial" w:hAnsi="Arial"/>
+                <w:b w:val="0"/>
+                <w:color w:val="000000"/>
+                <w:sz w:val="24"/>
+                <w:lang w:val="tr-TR"/>
+              </w:rPr>
+              <w:t>Raporun açıklamalarında günlük değerleri, birimleri ve genel referansları anlaşılır biçimde gösterdim. Kişinin elle belirlediği hedefleri ayrıca ele alarak raporun beslenme takibi amacıyla okunmasını sağladım. Bu çalışma bana raporlama kalitesinin yalnızca çok sayıda gösterge eklemek olmadığını öğretti. Bilginin kaynağını, birimini ve eksik kalan kısmını açıklamak, sonucun kullanıcı tarafından doğru anlaşılması için gereklidir.</w:t>
+            </w:r>
+          </w:p>
+        </w:tc>
+        <w:tc>
+          <w:tcPr>
+            <w:tcW w:type="dxa" w:w="2778"/>
+            <w:vAlign w:val="top"/>
+          </w:tcPr>
+          <w:tbl>
+            <w:tblPr>
+              <w:tblW w:type="auto" w:w="0"/>
+              <w:jc w:val="center"/>
+              <w:tblLayout w:type="fixed"/>
+              <w:tblLook w:firstColumn="1" w:firstRow="1" w:lastColumn="0" w:lastRow="0" w:noHBand="0" w:noVBand="1" w:val="04A0"/>
+              <w:tblBorders>
+                <w:top w:val="single" w:sz="6" w:color="999999"/>
+                <w:left w:val="single" w:sz="6" w:color="999999"/>
+                <w:bottom w:val="single" w:sz="6" w:color="999999"/>
+                <w:right w:val="single" w:sz="6" w:color="999999"/>
+                <w:insideH w:val="single" w:sz="6" w:color="999999"/>
+                <w:insideV w:val="single" w:sz="6" w:color="999999"/>
+              </w:tblBorders>
+              <w:tblCellMar>
+                <w:top w:w="70" w:type="dxa"/>
+                <w:bottom w:w="70" w:type="dxa"/>
+                <w:left w:w="110" w:type="dxa"/>
+                <w:right w:w="110" w:type="dxa"/>
+              </w:tblCellMar>
+            </w:tblPr>
+            <w:tblGrid>
+              <w:gridCol w:w="2381"/>
+            </w:tblGrid>
+            <w:tr>
+              <w:trPr>
+                <w:trHeight w:val="5443" w:hRule="atLeast"/>
+                <w:cantSplit/>
+              </w:trPr>
+              <w:tc>
+                <w:tcPr>
+                  <w:tcW w:type="dxa" w:w="2381"/>
+                  <w:vAlign w:val="center"/>
+                </w:tcPr>
+                <w:p>
+                  <w:pPr>
+                    <w:spacing w:after="80" w:before="80" w:line="259" w:lineRule="auto"/>
+                    <w:jc w:val="center"/>
+                  </w:pPr>
+                  <w:r/>
+                  <w:r>
+                    <w:rPr>
+                      <w:rFonts w:ascii="Arial" w:hAnsi="Arial"/>
+                      <w:b w:val="0"/>
+                      <w:color w:val="000000"/>
+                      <w:sz w:val="20"/>
+                      <w:lang w:val="tr-TR"/>
+                    </w:rPr>
+                    <w:t>EKRAN GÖRÜNTÜSÜ</w:t>
+                    <w:br/>
+                    <w:t>EKLENECEK</w:t>
+                    <w:br/>
+                    <w:br/>
+                    <w:t>Şekil 6</w:t>
+                    <w:br/>
+                    <w:t>14. gün</w:t>
+                  </w:r>
+                </w:p>
+              </w:tc>
+            </w:tr>
+          </w:tbl>
+          <w:p>
+            <w:pPr>
+              <w:spacing w:line="259" w:lineRule="auto" w:before="100" w:after="0"/>
+              <w:jc w:val="center"/>
+            </w:pPr>
+            <w:r>
+              <w:rPr>
+                <w:rFonts w:ascii="Arial" w:hAnsi="Arial"/>
+                <w:b w:val="0"/>
+                <w:color w:val="000000"/>
+                <w:sz w:val="18"/>
+                <w:lang w:val="tr-TR"/>
+              </w:rPr>
+              <w:t>Şekil 6. Günlük besin ögesi raporu</w:t>
+            </w:r>
+          </w:p>
+        </w:tc>
+      </w:tr>
+    </w:tbl>
     <w:p>
       <w:pPr>
         <w:sectPr>
@@ -2845,7 +3599,7 @@
           <w:sz w:val="24"/>
           <w:lang w:val="tr-TR"/>
         </w:rPr>
-        <w:t>Regresyon testi, diyet değişince formun güncellenmesini ve ilgisiz bildirimde kaydedilmemiş metnin korunmasını birlikte denetliyor. Ayrıca kişisel hedef değişiminin günlük öneriyi yeniden yüklenen denetleyicide de geçersiz bırakması sınanıyor. Gün sonunda durum yönetiminin yalnızca ortak değerleri paylaşmak olmadığını gördüm. Bir ekranın geçici kullanıcı girdisini korurken dışarıdan gelen gerçek değişikliklere uyum sağlaması, doğru form davranışının önemli bir parçasıdır.</w:t>
+        <w:t>Regresyon testi, diyet değişince formun güncellenmesini ve ilgisiz bildirimde kaydedilmemiş metnin korunmasını birlikte denetliyor. Ayrıca kişisel hedef değişiminin günlük öneriyi yeniden yüklenen denetleyicide de geçersiz bırakması sınanıyor. Bu senaryolarla formdaki geçici girdiyi koruma ve dışarıdan gelen hedef değişikliğine uyum sağlama konularında deneyim kazandım.</w:t>
       </w:r>
     </w:p>
     <w:p>
@@ -2918,40 +3672,160 @@
         <w:t>Kayıt başlamadan önce record paketinin izin kontrolünü kullandım. İzin verilmemişse durum permissionDenied olarak değişiyor ve kullanıcıya mikrofon izni gerektiği açıklanıyor. Bu hata, besin servisinin çalışmamasıyla aynı mesaj altında gösterilmiyor. Kullanıcı sesli kaydı kullanmak istemezse elle aramaya geçebiliyor. İzin reddini, uygulamanın bütün günlük işlevlerini durduran bir durum hâline getirmemeye dikkat ettim.</w:t>
       </w:r>
     </w:p>
-    <w:p>
-      <w:pPr>
-        <w:widowControl/>
-        <w:spacing w:after="260" w:before="0" w:line="293" w:lineRule="auto"/>
-        <w:jc w:val="both"/>
-      </w:pPr>
-      <w:r>
-        <w:rPr>
-          <w:rFonts w:ascii="Arial" w:hAnsi="Arial"/>
-          <w:b w:val="0"/>
-          <w:color w:val="000000"/>
-          <w:sz w:val="24"/>
-          <w:lang w:val="tr-TR"/>
-        </w:rPr>
-        <w:t>Ses dosyasını uygulamanın geçici dizininde, zaman bilgisinden üretilmiş bir adla oluşturdum. Kayıt ayarları WAV biçimi, 16.000 Hz örnekleme ve tek kanaldır. Bu seçim, konuşma için sınırlı büyüklükte ve servis tarafından işlenebilir bir dosya hazırlıyor. Ses seviyesini 100 milisaniyede bir dinleyerek kayıt ekranının güncellenmesini sağladım; bu seviye bilgisi bir sonraki aşamadaki sessizlik algılamasında da kullanılıyor.</w:t>
-      </w:r>
-    </w:p>
-    <w:p>
-      <w:pPr>
-        <w:widowControl/>
-        <w:spacing w:after="260" w:before="0" w:line="293" w:lineRule="auto"/>
-        <w:jc w:val="both"/>
-      </w:pPr>
-      <w:r>
-        <w:rPr>
-          <w:rFonts w:ascii="Arial" w:hAnsi="Arial"/>
-          <w:b w:val="0"/>
-          <w:color w:val="000000"/>
-          <w:sz w:val="24"/>
-          <w:lang w:val="tr-TR"/>
-        </w:rPr>
-        <w:t>Kayıt durumlarını boşta, kaydediyor, durdu, izin reddedildi ve hata şeklinde ayırdım. Kayıt başlatılamadığında geçici dosya temizleniyor ve ekran uygun duruma dönüyor. Dosya tamamlandıktan sonra çözümleme isteğine geçiliyor; uygulama sürekli açık mikrofonla arka planda konuşma göndermiyor. Gün sonunda bir cihaz özelliğini eklerken yalnızca başarılı başlatmayı değil, izinleri, ekran durumunu, dosya yaşam döngüsünü ve test edilebilirliği birlikte düşünmem gerektiğini öğrendim.</w:t>
-      </w:r>
-    </w:p>
+    <w:tbl>
+      <w:tblPr>
+        <w:tblW w:type="auto" w:w="0"/>
+        <w:jc w:val="center"/>
+        <w:tblLayout w:type="fixed"/>
+        <w:tblLook w:firstColumn="1" w:firstRow="1" w:lastColumn="0" w:lastRow="0" w:noHBand="0" w:noVBand="1" w:val="04A0"/>
+        <w:tblBorders>
+          <w:top w:val="nil"/>
+          <w:left w:val="nil"/>
+          <w:bottom w:val="nil"/>
+          <w:right w:val="nil"/>
+          <w:insideH w:val="nil"/>
+          <w:insideV w:val="nil"/>
+        </w:tblBorders>
+        <w:tblCellMar>
+          <w:top w:w="0" w:type="dxa"/>
+          <w:bottom w:w="0" w:type="dxa"/>
+          <w:left w:w="0" w:type="dxa"/>
+          <w:right w:w="90" w:type="dxa"/>
+        </w:tblCellMar>
+      </w:tblPr>
+      <w:tblGrid>
+        <w:gridCol w:w="7030"/>
+        <w:gridCol w:w="2778"/>
+      </w:tblGrid>
+      <w:tr>
+        <w:trPr>
+          <w:cantSplit/>
+        </w:trPr>
+        <w:tc>
+          <w:tcPr>
+            <w:tcW w:type="dxa" w:w="7030"/>
+            <w:vAlign w:val="top"/>
+          </w:tcPr>
+          <w:p>
+            <w:pPr>
+              <w:widowControl/>
+              <w:spacing w:after="260" w:before="0" w:line="293" w:lineRule="auto"/>
+              <w:jc w:val="both"/>
+            </w:pPr>
+            <w:r>
+              <w:rPr>
+                <w:rFonts w:ascii="Arial" w:hAnsi="Arial"/>
+                <w:b w:val="0"/>
+                <w:color w:val="000000"/>
+                <w:sz w:val="24"/>
+                <w:lang w:val="tr-TR"/>
+              </w:rPr>
+              <w:t>Ses dosyasını uygulamanın geçici dizininde, zaman bilgisinden üretilmiş bir adla oluşturdum. Kayıt ayarları WAV biçimi, 16.000 Hz örnekleme ve tek kanaldır. Bu seçim, konuşma için sınırlı büyüklükte ve servis tarafından işlenebilir bir dosya hazırlıyor. Ses seviyesini 100 milisaniyede bir dinleyerek kayıt ekranının güncellenmesini sağladım; bu seviye bilgisi bir sonraki aşamadaki sessizlik algılamasında da kullanılıyor.</w:t>
+            </w:r>
+          </w:p>
+          <w:p>
+            <w:pPr>
+              <w:widowControl/>
+              <w:spacing w:after="260" w:before="0" w:line="293" w:lineRule="auto"/>
+              <w:jc w:val="both"/>
+            </w:pPr>
+            <w:r>
+              <w:rPr>
+                <w:rFonts w:ascii="Arial" w:hAnsi="Arial"/>
+                <w:b w:val="0"/>
+                <w:color w:val="000000"/>
+                <w:sz w:val="24"/>
+                <w:lang w:val="tr-TR"/>
+              </w:rPr>
+              <w:t>Kayıt durumlarını boşta, kaydediyor, durdu, izin reddedildi ve hata şeklinde ayırdım. Kayıt başlatılamadığında geçici dosya temizleniyor ve ekran uygun duruma dönüyor. Dosya tamamlandıktan sonra çözümleme isteğine geçiliyor. Böylece izin kontrolü, kayıt durumu, dosya yaşam döngüsü ve servis bağlantısını adım adım takip edebildiğim bir yapı oluştu.</w:t>
+            </w:r>
+          </w:p>
+        </w:tc>
+        <w:tc>
+          <w:tcPr>
+            <w:tcW w:type="dxa" w:w="2778"/>
+            <w:vAlign w:val="top"/>
+          </w:tcPr>
+          <w:tbl>
+            <w:tblPr>
+              <w:tblW w:type="auto" w:w="0"/>
+              <w:jc w:val="center"/>
+              <w:tblLayout w:type="fixed"/>
+              <w:tblLook w:firstColumn="1" w:firstRow="1" w:lastColumn="0" w:lastRow="0" w:noHBand="0" w:noVBand="1" w:val="04A0"/>
+              <w:tblBorders>
+                <w:top w:val="single" w:sz="6" w:color="999999"/>
+                <w:left w:val="single" w:sz="6" w:color="999999"/>
+                <w:bottom w:val="single" w:sz="6" w:color="999999"/>
+                <w:right w:val="single" w:sz="6" w:color="999999"/>
+                <w:insideH w:val="single" w:sz="6" w:color="999999"/>
+                <w:insideV w:val="single" w:sz="6" w:color="999999"/>
+              </w:tblBorders>
+              <w:tblCellMar>
+                <w:top w:w="70" w:type="dxa"/>
+                <w:bottom w:w="70" w:type="dxa"/>
+                <w:left w:w="110" w:type="dxa"/>
+                <w:right w:w="110" w:type="dxa"/>
+              </w:tblCellMar>
+            </w:tblPr>
+            <w:tblGrid>
+              <w:gridCol w:w="2381"/>
+            </w:tblGrid>
+            <w:tr>
+              <w:trPr>
+                <w:trHeight w:val="5443" w:hRule="atLeast"/>
+                <w:cantSplit/>
+              </w:trPr>
+              <w:tc>
+                <w:tcPr>
+                  <w:tcW w:type="dxa" w:w="2381"/>
+                  <w:vAlign w:val="center"/>
+                </w:tcPr>
+                <w:p>
+                  <w:pPr>
+                    <w:spacing w:after="80" w:before="80" w:line="259" w:lineRule="auto"/>
+                    <w:jc w:val="center"/>
+                  </w:pPr>
+                  <w:r/>
+                  <w:r>
+                    <w:rPr>
+                      <w:rFonts w:ascii="Arial" w:hAnsi="Arial"/>
+                      <w:b w:val="0"/>
+                      <w:color w:val="000000"/>
+                      <w:sz w:val="20"/>
+                      <w:lang w:val="tr-TR"/>
+                    </w:rPr>
+                    <w:t>EKRAN GÖRÜNTÜSÜ</w:t>
+                    <w:br/>
+                    <w:t>EKLENECEK</w:t>
+                    <w:br/>
+                    <w:br/>
+                    <w:t>Şekil 7</w:t>
+                    <w:br/>
+                    <w:t>16. gün</w:t>
+                  </w:r>
+                </w:p>
+              </w:tc>
+            </w:tr>
+          </w:tbl>
+          <w:p>
+            <w:pPr>
+              <w:spacing w:line="259" w:lineRule="auto" w:before="100" w:after="0"/>
+              <w:jc w:val="center"/>
+            </w:pPr>
+            <w:r>
+              <w:rPr>
+                <w:rFonts w:ascii="Arial" w:hAnsi="Arial"/>
+                <w:b w:val="0"/>
+                <w:color w:val="000000"/>
+                <w:sz w:val="18"/>
+                <w:lang w:val="tr-TR"/>
+              </w:rPr>
+              <w:t>Şekil 7. Sesli kayıt ekranı</w:t>
+            </w:r>
+          </w:p>
+        </w:tc>
+      </w:tr>
+    </w:tbl>
     <w:p>
       <w:pPr>
         <w:sectPr>
@@ -3019,7 +3893,7 @@
           <w:sz w:val="24"/>
           <w:lang w:val="tr-TR"/>
         </w:rPr>
-        <w:t>Gerçek kayıt sınıfında eşik -40 dBFS, konuşma sonrasındaki sessizlik süresi 1,6 saniye olarak ayarlanmış. Eşiğin üstünde ses algılandığında sessizliğin başlangıcı sıfırlanıyor; düşük seviye yeterince uzun sürerse stop çağrılıyor. Buna ek olarak 30 saniyelik kesin süre sınırı bulunuyor. Böylece gürültülü ortamda sessizlik algılanmasa bile tek kaydın süresi sınırsız büyümüyor. Bu eşiklerin basit ses seviyesi mantığı olduğunu, kusursuz konuşma tanıma anlamına gelmediğini öğrendim.</w:t>
+        <w:t>Gerçek kayıt sınıfında eşik -40 dBFS, konuşma sonrasındaki sessizlik süresi 1,6 saniye olarak ayarlanmış. Eşiğin üstünde ses algılandığında sessizliğin başlangıcı sıfırlanıyor; düşük seviye yeterince uzun sürerse stop çağrılıyor.</w:t>
       </w:r>
     </w:p>
     <w:p>
@@ -3036,7 +3910,7 @@
           <w:sz w:val="24"/>
           <w:lang w:val="tr-TR"/>
         </w:rPr>
-        <w:t>Durdurma işleminin hem düğmeden hem zamanlayıcıdan tetiklenebilmesini dikkate aldım. _stopping işareti aynı dosyanın iki kez durdurulmasını sınırlıyor. Kayıt bittiğinde ses seviyesi aboneliği ve zamanlayıcı kapatılıyor; iptal veya işleme sonrasında geçici dosya siliniyor. Kaynakları yalnızca başarılı yolda temizlemek yeterli olmadığından hata ve iptal yollarını da takip ettim. İşletim sistemi süreci aniden sonlandırırsa bu temizliğin garantili olmadığını ayrıca not ettim.</w:t>
+        <w:t>Buna ek olarak 30 saniyelik kesin süre sınırı bulunuyor. Böylece gürültülü ortamda sessizlik algılanmasa bile tek kaydın süresi sınırsız büyümüyor. Ses seviyesi ve geçen süreyi birlikte değerlendirerek kayıt sonunu belirleyen bu mantığı uygulamalı olarak inceledim.</w:t>
       </w:r>
     </w:p>
     <w:p>
@@ -3053,7 +3927,24 @@
           <w:sz w:val="24"/>
           <w:lang w:val="tr-TR"/>
         </w:rPr>
-        <w:t>Birim testinde gerçek mikrofon yerine belirli zamanlarda verilen -60 ve -20 dBFS değerleri kullanılıyor. Test, başlangıç fırsatını ve yeniden yükselen sesin sessizlik sayacını sıfırlamasını kontrol ediyor. Test nesnesinin varsayılan son sessizliği 2 saniyedir; gerçek kaydedici bunu 1,6 saniyeye ayarlar. Bu ayrımı görmek, testteki sayıyı doğrudan çalışma ayarı sanmamayı öğretti. Gün sonunda zamanlayıcılarla çalışan bir özellikte süre, eşik ve kaynak temizliğinin birlikte değerlendirilmesi gerektiğini anladım.</w:t>
+        <w:t>Durdurma işleminin hem düğmeden hem zamanlayıcıdan tetiklenebilmesini dikkate aldım. _stopping işareti aynı dosyanın iki kez durdurulmasını sınırlıyor. Kayıt bittiğinde ses seviyesi aboneliği ve zamanlayıcı kapatılıyor; iptal veya işleme sonrasında geçici dosya siliniyor. Kaynakları yalnızca başarılı yolda temizlemek yeterli olmadığından hata ve iptal yollarını da takip ettim. Zamanlayıcı ve aboneliklerin aynı durdurma akışından kapatılması, kaynak yönetimini takip etmemi kolaylaştırdı.</w:t>
+      </w:r>
+    </w:p>
+    <w:p>
+      <w:pPr>
+        <w:widowControl/>
+        <w:spacing w:after="260" w:before="0" w:line="293" w:lineRule="auto"/>
+        <w:jc w:val="both"/>
+      </w:pPr>
+      <w:r>
+        <w:rPr>
+          <w:rFonts w:ascii="Arial" w:hAnsi="Arial"/>
+          <w:b w:val="0"/>
+          <w:color w:val="000000"/>
+          <w:sz w:val="24"/>
+          <w:lang w:val="tr-TR"/>
+        </w:rPr>
+        <w:t>Birim testinde gerçek mikrofon yerine belirli zamanlarda verilen -60 ve -20 dBFS değerleri kullanılıyor. Test, başlangıç fırsatını ve yeniden yükselen sesin sessizlik sayacını sıfırlamasını kontrol ediyor. Test nesnesinin varsayılan son sessizliği 2 saniyedir; gerçek kaydedici bunu 1,6 saniyeye ayarlar. Bu ayrımı görmek, testteki sayıyı doğrudan çalışma ayarı sanmamayı öğretti. Süre, eşik ve kaynak temizliğini birlikte ele alarak zamanlayıcılı işlemler konusundaki bilgimi pekiştirdim.</w:t>
       </w:r>
     </w:p>
     <w:p>
@@ -3106,24 +3997,7 @@
           <w:sz w:val="24"/>
           <w:lang w:val="tr-TR"/>
         </w:rPr>
-        <w:t>Bugün tamamlanmış ses dosyasını mevcut çözümleme servisine gönderen mobil istemciyi çalıştım. VoiceApiClient, doğrudan Gemini'ye gizli anahtarla bağlanmak yerine uygulamaya ayrılmış kimlik doğrulama oturumunu kullanıyor. Oturum yoksa anonim giriş yapılıyor ve erişim belirteci Authorization: Bearer başlığına ekleniyor. Buradaki anonimliğin ses içeriğinde kişisel bilgi bulunamayacağı anlamına gelmediğini, yalnızca kullanıcıya ayrı bir hesap formu açılmadığını ayırdım.</w:t>
-      </w:r>
-    </w:p>
-    <w:p>
-      <w:pPr>
-        <w:widowControl/>
-        <w:spacing w:after="260" w:before="0" w:line="293" w:lineRule="auto"/>
-        <w:jc w:val="both"/>
-      </w:pPr>
-      <w:r>
-        <w:rPr>
-          <w:rFonts w:ascii="Arial" w:hAnsi="Arial"/>
-          <w:b w:val="0"/>
-          <w:color w:val="000000"/>
-          <w:sz w:val="24"/>
-          <w:lang w:val="tr-TR"/>
-        </w:rPr>
-        <w:t>POST /v1/voice/resolve isteğini multipart biçiminde hazırladım. Dosya audio alanına meal.wav adı ve audio/wav içerik türüyle ekleniyor. language_hint, local_timestamp ve timezone alanları konuşmanın dili ve zaman bağlamını taşıyor. İngilizce ve Türkçe cihaz yerelleri desteklenen ipuçlarına dönüştürülüyor; diğerlerinde otomatik dil seçimi isteniyor. Dosya 1 MB sınırını aşıyorsa gönderimden önce hata veriliyor.</w:t>
+        <w:t>Bugün tamamlanmış ses dosyasını mevcut çözümleme servisine gönderen mobil istemciyi çalıştım. VoiceApiClient, doğrudan Gemini'ye gizli anahtarla bağlanmak yerine uygulamaya ayrılmış kimlik doğrulama oturumunu kullanıyor. Oturum yoksa anonim giriş yapılıyor ve erişim belirteci Authorization: Bearer başlığına ekleniyor. Buradaki anonimliğin ses içeriğinde kişisel bilgi bulunamayacağı anlamına gelmediğini, yalnızca kullanıcıya ayrı bir hesap formu açılmadığını ayırdım. POST /v1/voice/resolve isteğini multipart biçiminde hazırladım. Dosya audio alanına meal.wav adı ve audio/wav içerik türüyle ekleniyor. language_hint, local_timestamp ve timezone alanları konuşmanın dili ve zaman bağlamını taşıyor. İngilizce ve Türkçe cihaz yerelleri desteklenen ipuçlarına dönüştürülüyor; diğerlerinde otomatik dil seçimi isteniyor. Dosya 1 MB sınırını aşıyorsa gönderimden önce hata veriliyor.</w:t>
       </w:r>
     </w:p>
     <w:p>
@@ -3157,7 +4031,7 @@
           <w:sz w:val="24"/>
           <w:lang w:val="tr-TR"/>
         </w:rPr>
-        <w:t>Yanıttan VoiceResolution modeli üretilmesini ve ağ, zaman aşımı, kimlik doğrulama ile beklenmeyen yanıt hatalarının ayrılmasını ele aldım. Sadece HTTP başlığının gelmesi tamamlanma sayılmıyor; yanıt gövdesinin de alınması gerekiyor. Bu çalışma mevcut servisin mobil entegrasyonudur; sunucu altyapısını sıfırdan geliştirme çalışması değildir. Gün sonunda güvenli API kullanımında anahtarların konumu, dosya boyutu, istek bağlamı ve bekleme sınırlarının birlikte düşünülmesi gerektiğini öğrendim.</w:t>
+        <w:t>Yanıttan VoiceResolution modeli üretilmesini ve ağ, zaman aşımı, kimlik doğrulama ile beklenmeyen yanıt hatalarının ayrılmasını ele aldım. Sadece HTTP başlığının gelmesi tamamlanma sayılmıyor; yanıt gövdesinin de alınması gerekiyor. Mobil entegrasyon boyunca anahtarların konumu, dosya boyutu, istek bağlamı ve bekleme sınırlarını birlikte değerlendirdim. Bu çalışmalar güvenli API istemcisi hazırlama konusunda deneyim kazanmamı sağladı.</w:t>
       </w:r>
     </w:p>
     <w:p>
@@ -3261,7 +4135,7 @@
           <w:sz w:val="24"/>
           <w:lang w:val="tr-TR"/>
         </w:rPr>
-        <w:t>Besin ayrıntısı yüklenemezse konuşma sonucunun tamamen başarısız sayılmamasına dikkat ettim. Ekran, öğünün anlaşıldığını fakat sayısal ayrıntıların yüklenemediğini açıklayabiliyor; yeniden deneme veya elle arama sunuyor. Geçersiz yapılandırılmış yanıt senaryosu da korunabilen konuşma metninin ekranda kalmasını denetliyor. Gün sonunda çok aşamalı bir işlemde her aşamanın sonucunu ayrı tutmanın önemini öğrendim: son adımın hatası, önceki adımda elde edilmiş yararlı bilgiyi silmemelidir.</w:t>
+        <w:t>Besin ayrıntısı yüklenemezse konuşma sonucunun tamamen başarısız sayılmamasına dikkat ettim. Ekran, öğünün anlaşıldığını fakat sayısal ayrıntıların yüklenemediğini açıklayabiliyor; yeniden deneme veya elle arama sunuyor. Geçersiz yapılandırılmış yanıt senaryosu da korunabilen konuşma metninin ekranda kalmasını denetliyor. Bu süreçte konuşma metni, aday besin ve kaynak ayrıntısını ayrı durumlar olarak yönetmeyi öğrendim; yeniden deneme akışını bu ayrım üzerine kurdum.</w:t>
       </w:r>
     </w:p>
     <w:p>
@@ -3331,43 +4205,163 @@
           <w:sz w:val="24"/>
           <w:lang w:val="tr-TR"/>
         </w:rPr>
-        <w:t>Miktar söylenmemişse 100 gram, ağırlık temeli belirtilmemişse yenilebilir ağırlık varsayılanını kullandım. Bu değerleri ölçülmüş bilgi gibi sunmadım; belirsiz eşleşmeler ve varsayılanlar needsReview üzerinden Quick estimate olarak işaretleniyor. Kullanıcı açıkça satın alınan ağırlık belirtmiş fakat seçilen besinde kullanılabilir dönüşüm katsayısı yoksa kayıt engelleniyor. Bir öğe bile kullanılabilir değilse mevcut uygulama bütün grubu incelemeye bırakıyor; kısmi kaydetme kuyruğu bulunmuyor.</w:t>
+        <w:t>Miktar söylenmemişse 100 gram, ağırlık temeli belirtilmemişse yenilebilir ağırlık varsayılanını kullandım. Bu değerleri ölçülmüş bilgi gibi sunmadım; belirsiz eşleşmeler ve varsayılanlar needsReview üzerinden Quick estimate olarak işaretleniyor. Kullanıcı açıkça satın alınan ağırlık belirtmiş fakat seçilen besinde kullanılabilir dönüşüm katsayısı yoksa kayıt engelleniyor. Bütün öğeler kullanılabilir olduğunda grup birlikte kaydediliyor; düzeltme gereken gruplar ortak inceleme ekranına yönlendiriliyor.</w:t>
       </w:r>
     </w:p>
-    <w:p>
-      <w:pPr>
-        <w:widowControl/>
-        <w:spacing w:after="260" w:before="0" w:line="293" w:lineRule="auto"/>
-        <w:jc w:val="both"/>
-      </w:pPr>
-      <w:r>
-        <w:rPr>
-          <w:rFonts w:ascii="Arial" w:hAnsi="Arial"/>
-          <w:b w:val="0"/>
-          <w:color w:val="000000"/>
-          <w:sz w:val="24"/>
-          <w:lang w:val="tr-TR"/>
-        </w:rPr>
-        <w:t>Kayıt kimliğini servis requestId değeriyle besinin conceptIndex bilgisini birleştirerek oluşturdum. Aynı yanıt yeniden işlendiğinde aynı kimlik üretilmesi, denetleyicideki tekrar denetiminin çift kayıt oluşmasını önlemesine yardımcı oluyor. Kullanıcı isterse Undo ile grubu kaldırabiliyor veya Edit batch ile değiştirebiliyor. İsteğe bağlı geri bildirim, yerel kayıt tamamlandıktan sonra beklenmeden gönderiliyor; bu ek servis başarısız olsa da kayıt başarısı geri alınmıyor.</w:t>
-      </w:r>
-    </w:p>
-    <w:p>
-      <w:pPr>
-        <w:widowControl/>
-        <w:spacing w:after="260" w:before="0" w:line="293" w:lineRule="auto"/>
-        <w:jc w:val="both"/>
-      </w:pPr>
-      <w:r>
-        <w:rPr>
-          <w:rFonts w:ascii="Arial" w:hAnsi="Arial"/>
-          <w:b w:val="0"/>
-          <w:color w:val="000000"/>
-          <w:sz w:val="24"/>
-          <w:lang w:val="tr-TR"/>
-        </w:rPr>
-        <w:t>Sesli kayıt testlerinde miktarsız yanıtın tahmin olarak eklenmesi, verilen gram miktarının korunması ve geri bildirimin başarı ekranını geciktirmemesi denetleniyor. Düzenleme iptal edildiğinde özgün kayıtların korunması da aynı akışın devamıdır. Gün sonunda hızlı kayıtla doğruluğun birlikte yönetilebileceğini gördüm: kullanılabilir bilgiyi hemen kaydetmek, belirsizliği açık göstermek ve düzeltmeyi kolaylaştırmak, bütün durumlarda onay bekletmekten farklı bir kullanıcı deneyimi sağlıyor.</w:t>
-      </w:r>
-    </w:p>
+    <w:tbl>
+      <w:tblPr>
+        <w:tblW w:type="auto" w:w="0"/>
+        <w:jc w:val="center"/>
+        <w:tblLayout w:type="fixed"/>
+        <w:tblLook w:firstColumn="1" w:firstRow="1" w:lastColumn="0" w:lastRow="0" w:noHBand="0" w:noVBand="1" w:val="04A0"/>
+        <w:tblBorders>
+          <w:top w:val="nil"/>
+          <w:left w:val="nil"/>
+          <w:bottom w:val="nil"/>
+          <w:right w:val="nil"/>
+          <w:insideH w:val="nil"/>
+          <w:insideV w:val="nil"/>
+        </w:tblBorders>
+        <w:tblCellMar>
+          <w:top w:w="0" w:type="dxa"/>
+          <w:bottom w:w="0" w:type="dxa"/>
+          <w:left w:w="0" w:type="dxa"/>
+          <w:right w:w="90" w:type="dxa"/>
+        </w:tblCellMar>
+      </w:tblPr>
+      <w:tblGrid>
+        <w:gridCol w:w="7030"/>
+        <w:gridCol w:w="2778"/>
+      </w:tblGrid>
+      <w:tr>
+        <w:trPr>
+          <w:cantSplit/>
+        </w:trPr>
+        <w:tc>
+          <w:tcPr>
+            <w:tcW w:type="dxa" w:w="7030"/>
+            <w:vAlign w:val="top"/>
+          </w:tcPr>
+          <w:p>
+            <w:pPr>
+              <w:widowControl/>
+              <w:spacing w:after="260" w:before="0" w:line="293" w:lineRule="auto"/>
+              <w:jc w:val="both"/>
+            </w:pPr>
+            <w:r>
+              <w:rPr>
+                <w:rFonts w:ascii="Arial" w:hAnsi="Arial"/>
+                <w:b w:val="0"/>
+                <w:color w:val="000000"/>
+                <w:sz w:val="24"/>
+                <w:lang w:val="tr-TR"/>
+              </w:rPr>
+              <w:t>Kayıt kimliğini servis requestId değeriyle besinin conceptIndex bilgisini birleştirerek oluşturdum. Aynı yanıt yeniden işlendiğinde aynı kimlik üretilmesi, denetleyicideki tekrar denetiminin çift kayıt oluşmasını önlemesine yardımcı oluyor. Kullanıcı isterse Undo ile grubu kaldırabiliyor veya Edit batch ile değiştirebiliyor. İsteğe bağlı geri bildirim, yerel kayıt tamamlandıktan sonra beklenmeden gönderiliyor; bu ek servis başarısız olsa da kayıt başarısı geri alınmıyor.</w:t>
+            </w:r>
+          </w:p>
+          <w:p>
+            <w:pPr>
+              <w:widowControl/>
+              <w:spacing w:after="260" w:before="0" w:line="293" w:lineRule="auto"/>
+              <w:jc w:val="both"/>
+            </w:pPr>
+            <w:r>
+              <w:rPr>
+                <w:rFonts w:ascii="Arial" w:hAnsi="Arial"/>
+                <w:b w:val="0"/>
+                <w:color w:val="000000"/>
+                <w:sz w:val="24"/>
+                <w:lang w:val="tr-TR"/>
+              </w:rPr>
+              <w:t>Sesli kayıt testlerinde miktarsız yanıtın tahmin olarak eklenmesi, verilen gram miktarının korunması ve geri bildirimin başarı ekranını geciktirmemesi denetleniyor. Düzenleme iptal edildiğinde özgün kayıtların korunması da aynı akışın devamıdır. Bu çalışma sayesinde otomatik ekleme, görünür tahmin işareti ve sonradan düzeltme seçeneklerini tek bir kullanıcı akışında birleştirdim.</w:t>
+            </w:r>
+          </w:p>
+        </w:tc>
+        <w:tc>
+          <w:tcPr>
+            <w:tcW w:type="dxa" w:w="2778"/>
+            <w:vAlign w:val="top"/>
+          </w:tcPr>
+          <w:tbl>
+            <w:tblPr>
+              <w:tblW w:type="auto" w:w="0"/>
+              <w:jc w:val="center"/>
+              <w:tblLayout w:type="fixed"/>
+              <w:tblLook w:firstColumn="1" w:firstRow="1" w:lastColumn="0" w:lastRow="0" w:noHBand="0" w:noVBand="1" w:val="04A0"/>
+              <w:tblBorders>
+                <w:top w:val="single" w:sz="6" w:color="999999"/>
+                <w:left w:val="single" w:sz="6" w:color="999999"/>
+                <w:bottom w:val="single" w:sz="6" w:color="999999"/>
+                <w:right w:val="single" w:sz="6" w:color="999999"/>
+                <w:insideH w:val="single" w:sz="6" w:color="999999"/>
+                <w:insideV w:val="single" w:sz="6" w:color="999999"/>
+              </w:tblBorders>
+              <w:tblCellMar>
+                <w:top w:w="70" w:type="dxa"/>
+                <w:bottom w:w="70" w:type="dxa"/>
+                <w:left w:w="110" w:type="dxa"/>
+                <w:right w:w="110" w:type="dxa"/>
+              </w:tblCellMar>
+            </w:tblPr>
+            <w:tblGrid>
+              <w:gridCol w:w="2381"/>
+            </w:tblGrid>
+            <w:tr>
+              <w:trPr>
+                <w:trHeight w:val="5443" w:hRule="atLeast"/>
+                <w:cantSplit/>
+              </w:trPr>
+              <w:tc>
+                <w:tcPr>
+                  <w:tcW w:type="dxa" w:w="2381"/>
+                  <w:vAlign w:val="center"/>
+                </w:tcPr>
+                <w:p>
+                  <w:pPr>
+                    <w:spacing w:after="80" w:before="80" w:line="259" w:lineRule="auto"/>
+                    <w:jc w:val="center"/>
+                  </w:pPr>
+                  <w:r/>
+                  <w:r>
+                    <w:rPr>
+                      <w:rFonts w:ascii="Arial" w:hAnsi="Arial"/>
+                      <w:b w:val="0"/>
+                      <w:color w:val="000000"/>
+                      <w:sz w:val="20"/>
+                      <w:lang w:val="tr-TR"/>
+                    </w:rPr>
+                    <w:t>EKRAN GÖRÜNTÜSÜ</w:t>
+                    <w:br/>
+                    <w:t>EKLENECEK</w:t>
+                    <w:br/>
+                    <w:br/>
+                    <w:t>Şekil 8</w:t>
+                    <w:br/>
+                    <w:t>20. gün</w:t>
+                  </w:r>
+                </w:p>
+              </w:tc>
+            </w:tr>
+          </w:tbl>
+          <w:p>
+            <w:pPr>
+              <w:spacing w:line="259" w:lineRule="auto" w:before="100" w:after="0"/>
+              <w:jc w:val="center"/>
+            </w:pPr>
+            <w:r>
+              <w:rPr>
+                <w:rFonts w:ascii="Arial" w:hAnsi="Arial"/>
+                <w:b w:val="0"/>
+                <w:color w:val="000000"/>
+                <w:sz w:val="18"/>
+                <w:lang w:val="tr-TR"/>
+              </w:rPr>
+              <w:t>Şekil 8. Sesli kaydın günlüğe eklenmesi</w:t>
+            </w:r>
+          </w:p>
+        </w:tc>
+      </w:tr>
+    </w:tbl>
     <w:p>
       <w:pPr>
         <w:sectPr>
@@ -3435,7 +4429,7 @@
           <w:sz w:val="24"/>
           <w:lang w:val="tr-TR"/>
         </w:rPr>
-        <w:t>Sunucu kullanıcı başına tek etkin yapay zekâ isteğine izin verdiğinden mobilde ortak bir istek sırası kullandım. VoiceApiClient içindeki _serialAi, günlük öneri, Oracle, metin çözümleme ve ses işlemlerini aynı Future zincirine bağlıyor. Bir isteğin hatası zinciri kalıcı olarak durdurmamalı; sonraki işlem çalışabilmelidir. Ekranda henüz açılmamış Oracle için erken istek oluşturmamak da bu sırayı gereksiz doldurmamayı sağlıyor.</w:t>
+        <w:t>Sunucu kullanıcı başına tek etkin yapay zekâ isteğine izin verdiğinden mobilde ortak bir istek sırası kullandım. VoiceApiClient içindeki _serialAi, günlük öneri, Oracle, metin çözümleme ve ses işlemlerini aynı Future zincirine bağlıyor. Bir isteğin hatası zinciri kalıcı olarak durdurmamalı; sonraki işlem çalışabilmelidir. Ekranda henüz açılmamış Oracle için erken istek oluşturmamak da bu sırayı gereksiz doldurmamayı sağlıyor. Hata açıklamalarında bağlantı sorunu, zaman aşımı, kimlik doğrulama, kota ve geçersiz yanıtı ayırdım. Özellikle HTTP 429, servise ulaşılamadığını değil istek sınırına takılındığını gösterebilir. Kullanıcıya her durumda “Gemini kullanılamıyor” demek çözüm yolunu belirsizleştiriyordu. Servisin yapılandırılmış tek yedek model denemesinden gelen yanıtta gerçek model adının taşınmasını da kullandım; ekranda her başarılı yanıtı ana model üretmiş gibi göstermedim.</w:t>
       </w:r>
     </w:p>
     <w:p>
@@ -3452,24 +4446,7 @@
           <w:sz w:val="24"/>
           <w:lang w:val="tr-TR"/>
         </w:rPr>
-        <w:t>Hata açıklamalarında bağlantı sorunu, zaman aşımı, kimlik doğrulama, kota ve geçersiz yanıtı ayırdım. Özellikle HTTP 429, servise ulaşılamadığını değil istek sınırına takılındığını gösterebilir. Kullanıcıya her durumda “Gemini kullanılamıyor” demek çözüm yolunu belirsizleştiriyordu. Servisin yapılandırılmış tek yedek model denemesinden gelen yanıtta gerçek model adının taşınmasını da kullandım; ekranda her başarılı yanıtı ana model üretmiş gibi göstermedim.</w:t>
-      </w:r>
-    </w:p>
-    <w:p>
-      <w:pPr>
-        <w:widowControl/>
-        <w:spacing w:after="260" w:before="0" w:line="293" w:lineRule="auto"/>
-        <w:jc w:val="both"/>
-      </w:pPr>
-      <w:r>
-        <w:rPr>
-          <w:rFonts w:ascii="Arial" w:hAnsi="Arial"/>
-          <w:b w:val="0"/>
-          <w:color w:val="000000"/>
-          <w:sz w:val="24"/>
-          <w:lang w:val="tr-TR"/>
-        </w:rPr>
-        <w:t>Testte ilk yapay zekâ isteğini bekletip ikinciyi sıraya aldım. İlk yanıt 503 hatasıyla tamamlandığında ikinci isteğin başlayıp yanıt döndürmesi bekleniyor. Oracle ekranındaki ayrı test ise 429 durumunda bağlantı hatası yerine istek sınırı açıklamasını arıyor. Gün sonunda performans ve hata yönetiminin ilişkisini daha iyi anladım: gereksiz istekleri azaltmak kadar, bekleyen veya başarısız işlemin nedenini doğru sınıflandırmak da kullanıcının ne yapacağını anlamasını sağlıyor.</w:t>
+        <w:t>Testte ilk yapay zekâ isteğini bekletip ikinciyi sıraya aldım. İlk yanıt 503 hatasıyla tamamlandığında ikinci isteğin başlayıp yanıt döndürmesi bekleniyor. Oracle ekranındaki ayrı test ise 429 durumunda bağlantı hatası yerine istek sınırı açıklamasını arıyor. Bu testlerle istek sırasının hata sonrasında ilerlemesini ve kullanıcıya uygun yönlendirmenin verilmesini birlikte değerlendirdim.</w:t>
       </w:r>
     </w:p>
     <w:p>
@@ -3573,7 +4550,7 @@
           <w:sz w:val="24"/>
           <w:lang w:val="tr-TR"/>
         </w:rPr>
-        <w:t>Native testlerde başlangıç ve yeni Intent yollarının eylemi bir kez tüketmesi denetleniyor. Bu testin telefonun ana ekranına gerçekten araç takımı yerleştirildiğini kanıtlamadığını ayrıca ayırdım. Gün sonunda Flutter ile platform kodunun görev paylaşımını öğrendim: Android ana ekran bileşenini ve açılış isteğini yönetirken, uygulamanın ortak kayıt mantığı Dart tarafında kalıyor. Bir kısa yolun güvenilir olması için sadece ilk açılışın değil, tekrar açılma ve yinelenen istek durumlarının da düşünülmesi gerekiyor.</w:t>
+        <w:t>Native testlerde başlangıç ve yeni Intent yollarının eylemi bir kez tüketmesi denetleniyor. Flutter ile platform kodunun görev paylaşımını bu örnek üzerinden öğrendim: Android ana ekran bileşenini ve açılış isteğini yönetirken, uygulamanın ortak kayıt mantığı Dart tarafında kalıyor. Bir kısa yolun güvenilir olması için sadece ilk açılışın değil, tekrar açılma ve yinelenen istek durumlarının da düşünülmesi gerekiyor.</w:t>
       </w:r>
     </w:p>
     <w:p>
@@ -3842,40 +4819,160 @@
         <w:t>İstek kabul edilse bile kullanıcının ekleme penceresini iptal edebileceğini dikkate aldım. Bu yüzden yöntemden dönen true değerini “araç takımı eklendi” diye yorumlamadım. Destek yoksa ana ekranda boş alana uzun basma, Widgets bölümünü açma ve OpenNutri mikrofonunu seçme adımları açıklanıyor. Kurulum testleri desteklenen ve desteklenmeyen yanıtları taklit ederek uygulamanın uygun yönlendirmeyi gösterdiğini denetliyor.</w:t>
       </w:r>
     </w:p>
-    <w:p>
-      <w:pPr>
-        <w:widowControl/>
-        <w:spacing w:after="260" w:before="0" w:line="293" w:lineRule="auto"/>
-        <w:jc w:val="both"/>
-      </w:pPr>
-      <w:r>
-        <w:rPr>
-          <w:rFonts w:ascii="Arial" w:hAnsi="Arial"/>
-          <w:b w:val="0"/>
-          <w:color w:val="000000"/>
-          <w:sz w:val="24"/>
-          <w:lang w:val="tr-TR"/>
-        </w:rPr>
-        <w:t>Hızlı kayıt açılırken günlük tarihini bugüne aldım. Uygulama daha önce geçmiş bir günü gösteriyor olsa da ana ekran mikrofonundan söylenen yeni öğün o eski güne yazılmamalı. Kayıt tamamlandığında Flutter önce addEntries sonucunu bekliyor, ardından kısa başarı görünümünden sonra finishQuickCapture çağırıyor. Kotlin tarafı eklenen besin sayısını Toast ile gösterip finishAndRemoveTask üzerinden uygulama görevini kapatıyor.</w:t>
-      </w:r>
-    </w:p>
-    <w:p>
-      <w:pPr>
-        <w:widowControl/>
-        <w:spacing w:after="260" w:before="0" w:line="293" w:lineRule="auto"/>
-        <w:jc w:val="both"/>
-      </w:pPr>
-      <w:r>
-        <w:rPr>
-          <w:rFonts w:ascii="Arial" w:hAnsi="Arial"/>
-          <w:b w:val="0"/>
-          <w:color w:val="000000"/>
-          <w:sz w:val="24"/>
-          <w:lang w:val="tr-TR"/>
-        </w:rPr>
-        <w:t>Testte yerel saklamayı yapay olarak bekleterek kapanış çağrısının erken gelmediğini kontrol ettim. Saklama tamamlanınca kapanışa izin verilmesi, “söyle ve dön” akışının veri kaybetmeden tamamlanmasını sağlıyor. Bu özellik görünür kayıt ekranını kullanıyor; kullanıcı işlem bitmeden kapatırsa arka planda garantili devam eden kuyruk yok. Gün sonunda küçük görünen bir araç takımında bile kurulum, tarih, kalıcılık ve kapanış sırasının ayrı ayrı doğrulanması gerektiğini öğrendim.</w:t>
-      </w:r>
-    </w:p>
+    <w:tbl>
+      <w:tblPr>
+        <w:tblW w:type="auto" w:w="0"/>
+        <w:jc w:val="center"/>
+        <w:tblLayout w:type="fixed"/>
+        <w:tblLook w:firstColumn="1" w:firstRow="1" w:lastColumn="0" w:lastRow="0" w:noHBand="0" w:noVBand="1" w:val="04A0"/>
+        <w:tblBorders>
+          <w:top w:val="nil"/>
+          <w:left w:val="nil"/>
+          <w:bottom w:val="nil"/>
+          <w:right w:val="nil"/>
+          <w:insideH w:val="nil"/>
+          <w:insideV w:val="nil"/>
+        </w:tblBorders>
+        <w:tblCellMar>
+          <w:top w:w="0" w:type="dxa"/>
+          <w:bottom w:w="0" w:type="dxa"/>
+          <w:left w:w="0" w:type="dxa"/>
+          <w:right w:w="90" w:type="dxa"/>
+        </w:tblCellMar>
+      </w:tblPr>
+      <w:tblGrid>
+        <w:gridCol w:w="7030"/>
+        <w:gridCol w:w="2778"/>
+      </w:tblGrid>
+      <w:tr>
+        <w:trPr>
+          <w:cantSplit/>
+        </w:trPr>
+        <w:tc>
+          <w:tcPr>
+            <w:tcW w:type="dxa" w:w="7030"/>
+            <w:vAlign w:val="top"/>
+          </w:tcPr>
+          <w:p>
+            <w:pPr>
+              <w:widowControl/>
+              <w:spacing w:after="260" w:before="0" w:line="293" w:lineRule="auto"/>
+              <w:jc w:val="both"/>
+            </w:pPr>
+            <w:r>
+              <w:rPr>
+                <w:rFonts w:ascii="Arial" w:hAnsi="Arial"/>
+                <w:b w:val="0"/>
+                <w:color w:val="000000"/>
+                <w:sz w:val="24"/>
+                <w:lang w:val="tr-TR"/>
+              </w:rPr>
+              <w:t>Hızlı kayıt açılırken günlük tarihini bugüne aldım. Uygulama daha önce geçmiş bir günü gösteriyor olsa da ana ekran mikrofonundan söylenen yeni öğün o eski güne yazılmamalı. Kayıt tamamlandığında Flutter önce addEntries sonucunu bekliyor, ardından kısa başarı görünümünden sonra finishQuickCapture çağırıyor. Kotlin tarafı eklenen besin sayısını Toast ile gösterip finishAndRemoveTask üzerinden uygulama görevini kapatıyor.</w:t>
+            </w:r>
+          </w:p>
+          <w:p>
+            <w:pPr>
+              <w:widowControl/>
+              <w:spacing w:after="260" w:before="0" w:line="293" w:lineRule="auto"/>
+              <w:jc w:val="both"/>
+            </w:pPr>
+            <w:r>
+              <w:rPr>
+                <w:rFonts w:ascii="Arial" w:hAnsi="Arial"/>
+                <w:b w:val="0"/>
+                <w:color w:val="000000"/>
+                <w:sz w:val="24"/>
+                <w:lang w:val="tr-TR"/>
+              </w:rPr>
+              <w:t>Testte yerel saklamayı yapay olarak bekleterek kapanış çağrısının erken gelmediğini kontrol ettim. Saklama tamamlanınca kapanışa izin verilmesi, “söyle ve dön” akışının veri kaybetmeden tamamlanmasını sağlıyor. Görünür kayıt ekranı, saklama tamamlanana kadar işlemin durumunu gösteriyor. Bu uygulama sayesinde araç takımının kurulumunu, tarih seçimini ve kayıt sonrası kapanışını tek bir akışta ilişkilendirdim.</w:t>
+            </w:r>
+          </w:p>
+        </w:tc>
+        <w:tc>
+          <w:tcPr>
+            <w:tcW w:type="dxa" w:w="2778"/>
+            <w:vAlign w:val="top"/>
+          </w:tcPr>
+          <w:tbl>
+            <w:tblPr>
+              <w:tblW w:type="auto" w:w="0"/>
+              <w:jc w:val="center"/>
+              <w:tblLayout w:type="fixed"/>
+              <w:tblLook w:firstColumn="1" w:firstRow="1" w:lastColumn="0" w:lastRow="0" w:noHBand="0" w:noVBand="1" w:val="04A0"/>
+              <w:tblBorders>
+                <w:top w:val="single" w:sz="6" w:color="999999"/>
+                <w:left w:val="single" w:sz="6" w:color="999999"/>
+                <w:bottom w:val="single" w:sz="6" w:color="999999"/>
+                <w:right w:val="single" w:sz="6" w:color="999999"/>
+                <w:insideH w:val="single" w:sz="6" w:color="999999"/>
+                <w:insideV w:val="single" w:sz="6" w:color="999999"/>
+              </w:tblBorders>
+              <w:tblCellMar>
+                <w:top w:w="70" w:type="dxa"/>
+                <w:bottom w:w="70" w:type="dxa"/>
+                <w:left w:w="110" w:type="dxa"/>
+                <w:right w:w="110" w:type="dxa"/>
+              </w:tblCellMar>
+            </w:tblPr>
+            <w:tblGrid>
+              <w:gridCol w:w="2381"/>
+            </w:tblGrid>
+            <w:tr>
+              <w:trPr>
+                <w:trHeight w:val="5443" w:hRule="atLeast"/>
+                <w:cantSplit/>
+              </w:trPr>
+              <w:tc>
+                <w:tcPr>
+                  <w:tcW w:type="dxa" w:w="2381"/>
+                  <w:vAlign w:val="center"/>
+                </w:tcPr>
+                <w:p>
+                  <w:pPr>
+                    <w:spacing w:after="80" w:before="80" w:line="259" w:lineRule="auto"/>
+                    <w:jc w:val="center"/>
+                  </w:pPr>
+                  <w:r/>
+                  <w:r>
+                    <w:rPr>
+                      <w:rFonts w:ascii="Arial" w:hAnsi="Arial"/>
+                      <w:b w:val="0"/>
+                      <w:color w:val="000000"/>
+                      <w:sz w:val="20"/>
+                      <w:lang w:val="tr-TR"/>
+                    </w:rPr>
+                    <w:t>EKRAN GÖRÜNTÜSÜ</w:t>
+                    <w:br/>
+                    <w:t>EKLENECEK</w:t>
+                    <w:br/>
+                    <w:br/>
+                    <w:t>Şekil 9</w:t>
+                    <w:br/>
+                    <w:t>23. gün</w:t>
+                  </w:r>
+                </w:p>
+              </w:tc>
+            </w:tr>
+          </w:tbl>
+          <w:p>
+            <w:pPr>
+              <w:spacing w:line="259" w:lineRule="auto" w:before="100" w:after="0"/>
+              <w:jc w:val="center"/>
+            </w:pPr>
+            <w:r>
+              <w:rPr>
+                <w:rFonts w:ascii="Arial" w:hAnsi="Arial"/>
+                <w:b w:val="0"/>
+                <w:color w:val="000000"/>
+                <w:sz w:val="18"/>
+                <w:lang w:val="tr-TR"/>
+              </w:rPr>
+              <w:t>Şekil 9. Ana ekrandaki OpenNutri mikrofonu</w:t>
+            </w:r>
+          </w:p>
+        </w:tc>
+      </w:tr>
+    </w:tbl>
     <w:p>
       <w:pPr>
         <w:sectPr>
@@ -3943,43 +5040,163 @@
           <w:sz w:val="24"/>
           <w:lang w:val="tr-TR"/>
         </w:rPr>
-        <w:t>targetsForCalories yöntemi kullanıcının mevcut kalori hedefini koruyup makro hedeflerini hesaplıyor. Protein ve karbonhidrat payları 4'e, yağ payı 9'a bölünerek gram değerine çevriliyor. Kodun dengeli şablonunu açıklamak için 2.000 kcal örneğini kullandım: yüzde 25 protein 125 gram, yüzde 45 karbonhidrat 225 gram, yüzde 30 yağ yaklaşık 66,7 gram verir. Bu, şablon hesabını gösteren örnektir; kişiye özel tıbbi öneri değildir.</w:t>
+        <w:t>targetsForCalories yöntemi kullanıcının mevcut kalori hedefini koruyup makro hedeflerini hesaplıyor. Kalori hedefi her makronun enerji payıyla çarpılıyor; bulunan enerji protein ve karbonhidrat için 4'e, yağ için 9'a bölünerek gram değerine çevriliyor. Kodun dengeli şablonunu açıklamak için 2.000 kcal örneğini kullandım: yüzde 25 protein 125 gram, yüzde 45 karbonhidrat 225 gram, yüzde 30 yağ yaklaşık 66,7 gram verir. Bu örnek, mevcut kalori hedefinden makro hedeflerine geçişi açıklıyor.</w:t>
       </w:r>
     </w:p>
-    <w:p>
-      <w:pPr>
-        <w:widowControl/>
-        <w:spacing w:after="260" w:before="0" w:line="293" w:lineRule="auto"/>
-        <w:jc w:val="both"/>
-      </w:pPr>
-      <w:r>
-        <w:rPr>
-          <w:rFonts w:ascii="Arial" w:hAnsi="Arial"/>
-          <w:b w:val="0"/>
-          <w:color w:val="000000"/>
-          <w:sz w:val="24"/>
-          <w:lang w:val="tr-TR"/>
-        </w:rPr>
-        <w:t>Hedefe göre yapılan küçük oran değişikliklerini de inceledim. Kas geliştirme veya yağ kaybı hedefinde, karbonhidrat payı uygun düzeydeyse beş yüzde puanı proteine aktarılıyor. Dengeli örnekte böylece protein 150, karbonhidrat 200 gram olurken toplam enerji korunuyor. Performans hedefinde keto dışındaki uygun şablonlarda yağdan karbonhidrata aktarım yapılıyor. Kullanıcı bu başlangıç değerlerini daha sonra ayarlardan değiştirebiliyor ve serbest açıklama ekleyebiliyor.</w:t>
-      </w:r>
-    </w:p>
-    <w:p>
-      <w:pPr>
-        <w:widowControl/>
-        <w:spacing w:after="260" w:before="0" w:line="293" w:lineRule="auto"/>
-        <w:jc w:val="both"/>
-      </w:pPr>
-      <w:r>
-        <w:rPr>
-          <w:rFonts w:ascii="Arial" w:hAnsi="Arial"/>
-          <w:b w:val="0"/>
-          <w:color w:val="000000"/>
-          <w:sz w:val="24"/>
-          <w:lang w:val="tr-TR"/>
-        </w:rPr>
-        <w:t>personalization_test.dart içindeki senaryo şablonun hedefe uyarlanmasını ve sonradan düzenlenebilmesini kontrol ediyor. Şablon değişikliği, eski günlük önerinin temizlenmesini de tetikliyor. Bu çalışmada otomatik kalori ihtiyacı hesabı veya haftalık menü üretildiğini varsaymadım; mevcut özellik makro oranları ve öneri bağlamını düzenliyor. Gün sonunda kişiselleştirmenin sabit bir listeyi kullanıcıya göstermenin ötesinde, seçimin hesaplamalara ve sonraki ekranlara tutarlı yansımasını gerektirdiğini öğrendim.</w:t>
-      </w:r>
-    </w:p>
+    <w:tbl>
+      <w:tblPr>
+        <w:tblW w:type="auto" w:w="0"/>
+        <w:jc w:val="center"/>
+        <w:tblLayout w:type="fixed"/>
+        <w:tblLook w:firstColumn="1" w:firstRow="1" w:lastColumn="0" w:lastRow="0" w:noHBand="0" w:noVBand="1" w:val="04A0"/>
+        <w:tblBorders>
+          <w:top w:val="nil"/>
+          <w:left w:val="nil"/>
+          <w:bottom w:val="nil"/>
+          <w:right w:val="nil"/>
+          <w:insideH w:val="nil"/>
+          <w:insideV w:val="nil"/>
+        </w:tblBorders>
+        <w:tblCellMar>
+          <w:top w:w="0" w:type="dxa"/>
+          <w:bottom w:w="0" w:type="dxa"/>
+          <w:left w:w="0" w:type="dxa"/>
+          <w:right w:w="90" w:type="dxa"/>
+        </w:tblCellMar>
+      </w:tblPr>
+      <w:tblGrid>
+        <w:gridCol w:w="7030"/>
+        <w:gridCol w:w="2778"/>
+      </w:tblGrid>
+      <w:tr>
+        <w:trPr>
+          <w:cantSplit/>
+        </w:trPr>
+        <w:tc>
+          <w:tcPr>
+            <w:tcW w:type="dxa" w:w="7030"/>
+            <w:vAlign w:val="top"/>
+          </w:tcPr>
+          <w:p>
+            <w:pPr>
+              <w:widowControl/>
+              <w:spacing w:after="260" w:before="0" w:line="293" w:lineRule="auto"/>
+              <w:jc w:val="both"/>
+            </w:pPr>
+            <w:r>
+              <w:rPr>
+                <w:rFonts w:ascii="Arial" w:hAnsi="Arial"/>
+                <w:b w:val="0"/>
+                <w:color w:val="000000"/>
+                <w:sz w:val="24"/>
+                <w:lang w:val="tr-TR"/>
+              </w:rPr>
+              <w:t>Hedefe göre yapılan küçük oran değişikliklerini de inceledim. Kas geliştirme veya yağ kaybı hedefinde, karbonhidrat payı uygun düzeydeyse beş yüzde puanı proteine aktarılıyor. Dengeli örnekte böylece protein 150, karbonhidrat 200 gram olurken toplam enerji korunuyor. Performans hedefinde keto dışındaki uygun şablonlarda yağdan karbonhidrata aktarım yapılıyor. Kullanıcı bu başlangıç değerlerini daha sonra ayarlardan değiştirebiliyor ve serbest açıklama ekleyebiliyor.</w:t>
+            </w:r>
+          </w:p>
+          <w:p>
+            <w:pPr>
+              <w:widowControl/>
+              <w:spacing w:after="260" w:before="0" w:line="293" w:lineRule="auto"/>
+              <w:jc w:val="both"/>
+            </w:pPr>
+            <w:r>
+              <w:rPr>
+                <w:rFonts w:ascii="Arial" w:hAnsi="Arial"/>
+                <w:b w:val="0"/>
+                <w:color w:val="000000"/>
+                <w:sz w:val="24"/>
+                <w:lang w:val="tr-TR"/>
+              </w:rPr>
+              <w:t>personalization_test.dart içindeki senaryo şablonun hedefe uyarlanmasını ve sonradan düzenlenebilmesini kontrol ediyor. Şablon değişikliği, eski günlük önerinin temizlenmesini de tetikliyor. Şablon seçimini makro hedefleri ve öneri bağlamıyla ilişkilendirerek kişiselleştirme akışını tamamladım. Bu çalışma, kullanıcının seçiminin hesaplamalara ve diğer ekranlara tutarlı yansımasını sağlamamı kolaylaştırdı.</w:t>
+            </w:r>
+          </w:p>
+        </w:tc>
+        <w:tc>
+          <w:tcPr>
+            <w:tcW w:type="dxa" w:w="2778"/>
+            <w:vAlign w:val="top"/>
+          </w:tcPr>
+          <w:tbl>
+            <w:tblPr>
+              <w:tblW w:type="auto" w:w="0"/>
+              <w:jc w:val="center"/>
+              <w:tblLayout w:type="fixed"/>
+              <w:tblLook w:firstColumn="1" w:firstRow="1" w:lastColumn="0" w:lastRow="0" w:noHBand="0" w:noVBand="1" w:val="04A0"/>
+              <w:tblBorders>
+                <w:top w:val="single" w:sz="6" w:color="999999"/>
+                <w:left w:val="single" w:sz="6" w:color="999999"/>
+                <w:bottom w:val="single" w:sz="6" w:color="999999"/>
+                <w:right w:val="single" w:sz="6" w:color="999999"/>
+                <w:insideH w:val="single" w:sz="6" w:color="999999"/>
+                <w:insideV w:val="single" w:sz="6" w:color="999999"/>
+              </w:tblBorders>
+              <w:tblCellMar>
+                <w:top w:w="70" w:type="dxa"/>
+                <w:bottom w:w="70" w:type="dxa"/>
+                <w:left w:w="110" w:type="dxa"/>
+                <w:right w:w="110" w:type="dxa"/>
+              </w:tblCellMar>
+            </w:tblPr>
+            <w:tblGrid>
+              <w:gridCol w:w="2381"/>
+            </w:tblGrid>
+            <w:tr>
+              <w:trPr>
+                <w:trHeight w:val="5443" w:hRule="atLeast"/>
+                <w:cantSplit/>
+              </w:trPr>
+              <w:tc>
+                <w:tcPr>
+                  <w:tcW w:type="dxa" w:w="2381"/>
+                  <w:vAlign w:val="center"/>
+                </w:tcPr>
+                <w:p>
+                  <w:pPr>
+                    <w:spacing w:after="80" w:before="80" w:line="259" w:lineRule="auto"/>
+                    <w:jc w:val="center"/>
+                  </w:pPr>
+                  <w:r/>
+                  <w:r>
+                    <w:rPr>
+                      <w:rFonts w:ascii="Arial" w:hAnsi="Arial"/>
+                      <w:b w:val="0"/>
+                      <w:color w:val="000000"/>
+                      <w:sz w:val="20"/>
+                      <w:lang w:val="tr-TR"/>
+                    </w:rPr>
+                    <w:t>EKRAN GÖRÜNTÜSÜ</w:t>
+                    <w:br/>
+                    <w:t>EKLENECEK</w:t>
+                    <w:br/>
+                    <w:br/>
+                    <w:t>Şekil 10</w:t>
+                    <w:br/>
+                    <w:t>24. gün</w:t>
+                  </w:r>
+                </w:p>
+              </w:tc>
+            </w:tr>
+          </w:tbl>
+          <w:p>
+            <w:pPr>
+              <w:spacing w:line="259" w:lineRule="auto" w:before="100" w:after="0"/>
+              <w:jc w:val="center"/>
+            </w:pPr>
+            <w:r>
+              <w:rPr>
+                <w:rFonts w:ascii="Arial" w:hAnsi="Arial"/>
+                <w:b w:val="0"/>
+                <w:color w:val="000000"/>
+                <w:sz w:val="18"/>
+                <w:lang w:val="tr-TR"/>
+              </w:rPr>
+              <w:t>Şekil 10. Diyet şablonları ve seçim</w:t>
+            </w:r>
+          </w:p>
+        </w:tc>
+      </w:tr>
+    </w:tbl>
     <w:p>
       <w:pPr>
         <w:sectPr>
@@ -4050,40 +5267,160 @@
         <w:t>DailyCoachBrief öneriyi dateKey ile birlikte yerelde saklıyor. Aynı gün için geçerli öneri varsa her ekran açılışında yeniden model çağrısı yapılmıyor. Hedef, diyet veya kayıtlı tercih değiştiğinde önbellek hem bellekten hem diskten temizleniyor. Başka güne geçildiğinde önceki günün kartı gösterilmiyor. Günlükteki her besin düzeltmesinin otomatik yeni çağrı üretmediğini, kartın belirli anda hazırlanmış bir özet olduğunu ayırdım.</w:t>
       </w:r>
     </w:p>
-    <w:p>
-      <w:pPr>
-        <w:widowControl/>
-        <w:spacing w:after="260" w:before="0" w:line="293" w:lineRule="auto"/>
-        <w:jc w:val="both"/>
-      </w:pPr>
-      <w:r>
-        <w:rPr>
-          <w:rFonts w:ascii="Arial" w:hAnsi="Arial"/>
-          <w:b w:val="0"/>
-          <w:color w:val="000000"/>
-          <w:sz w:val="24"/>
-          <w:lang w:val="tr-TR"/>
-        </w:rPr>
-        <w:t>İstek devam ederken kullanıcı tarih veya profil değiştirebilir. Bu yüzden istek başlangıcındaki coachContextRevision değeri yanıt geldiğinde tekrar karşılaştırılıyor. Bağlam değişmişse eski yanıt kaydedilmiyor; uygun ekranda güncel bağlamla yenileme yapılabiliyor. Servis kullanılamadığında yerel hedef ilerlemesine dayalı basit öneri hazırlanıyor ve generatedByAi false olarak işaretleniyor. Yerel metni yeni üretilmiş yapay zekâ yanıtı gibi göstermedim.</w:t>
-      </w:r>
-    </w:p>
-    <w:p>
-      <w:pPr>
-        <w:widowControl/>
-        <w:spacing w:after="260" w:before="0" w:line="293" w:lineRule="auto"/>
-        <w:jc w:val="both"/>
-      </w:pPr>
-      <w:r>
-        <w:rPr>
-          <w:rFonts w:ascii="Arial" w:hAnsi="Arial"/>
-          <w:b w:val="0"/>
-          <w:color w:val="000000"/>
-          <w:sz w:val="24"/>
-          <w:lang w:val="tr-TR"/>
-        </w:rPr>
-        <w:t>Önbellek testinde önce öneriyi saklayıp diyet, hedef veya tercih değişikliği uyguladım; ardından yeni denetleyiciyle veriyi tekrar yükleyen senaryoyu değerlendirdim. Eski önerinin null gelmesi, temizliğin yalnızca ekranda yapılmadığını doğruluyor. Tarih testi de kartın yanlış gün altında görünmemesini denetliyor. Gün sonunda önbelleğin yalnızca istek sayısını azaltmak olmadığını öğrendim: hangi bilginin ne zaman geçersiz sayılacağını doğru belirlemek, önerinin anlamını ve güvenilirliğini koruyor.</w:t>
-      </w:r>
-    </w:p>
+    <w:tbl>
+      <w:tblPr>
+        <w:tblW w:type="auto" w:w="0"/>
+        <w:jc w:val="center"/>
+        <w:tblLayout w:type="fixed"/>
+        <w:tblLook w:firstColumn="1" w:firstRow="1" w:lastColumn="0" w:lastRow="0" w:noHBand="0" w:noVBand="1" w:val="04A0"/>
+        <w:tblBorders>
+          <w:top w:val="nil"/>
+          <w:left w:val="nil"/>
+          <w:bottom w:val="nil"/>
+          <w:right w:val="nil"/>
+          <w:insideH w:val="nil"/>
+          <w:insideV w:val="nil"/>
+        </w:tblBorders>
+        <w:tblCellMar>
+          <w:top w:w="0" w:type="dxa"/>
+          <w:bottom w:w="0" w:type="dxa"/>
+          <w:left w:w="0" w:type="dxa"/>
+          <w:right w:w="90" w:type="dxa"/>
+        </w:tblCellMar>
+      </w:tblPr>
+      <w:tblGrid>
+        <w:gridCol w:w="7030"/>
+        <w:gridCol w:w="2778"/>
+      </w:tblGrid>
+      <w:tr>
+        <w:trPr>
+          <w:cantSplit/>
+        </w:trPr>
+        <w:tc>
+          <w:tcPr>
+            <w:tcW w:type="dxa" w:w="7030"/>
+            <w:vAlign w:val="top"/>
+          </w:tcPr>
+          <w:p>
+            <w:pPr>
+              <w:widowControl/>
+              <w:spacing w:after="260" w:before="0" w:line="293" w:lineRule="auto"/>
+              <w:jc w:val="both"/>
+            </w:pPr>
+            <w:r>
+              <w:rPr>
+                <w:rFonts w:ascii="Arial" w:hAnsi="Arial"/>
+                <w:b w:val="0"/>
+                <w:color w:val="000000"/>
+                <w:sz w:val="24"/>
+                <w:lang w:val="tr-TR"/>
+              </w:rPr>
+              <w:t>İstek devam ederken kullanıcı tarih veya profil değiştirebilir. Bu yüzden istek başlangıcındaki coachContextRevision değeri yanıt geldiğinde tekrar karşılaştırılıyor. Bağlam değişmişse eski yanıt kaydedilmiyor; uygun ekranda güncel bağlamla yenileme yapılabiliyor. Servis kullanılamadığında yerel hedef ilerlemesine dayalı basit öneri hazırlanıyor ve generatedByAi false olarak işaretleniyor. Yerel metni yeni üretilmiş yapay zekâ yanıtı gibi göstermedim.</w:t>
+            </w:r>
+          </w:p>
+          <w:p>
+            <w:pPr>
+              <w:widowControl/>
+              <w:spacing w:after="260" w:before="0" w:line="293" w:lineRule="auto"/>
+              <w:jc w:val="both"/>
+            </w:pPr>
+            <w:r>
+              <w:rPr>
+                <w:rFonts w:ascii="Arial" w:hAnsi="Arial"/>
+                <w:b w:val="0"/>
+                <w:color w:val="000000"/>
+                <w:sz w:val="24"/>
+                <w:lang w:val="tr-TR"/>
+              </w:rPr>
+              <w:t>Önbellek testinde önce öneriyi saklayıp diyet, hedef veya tercih değişikliği uyguladım; ardından yeni denetleyiciyle veriyi tekrar yükleyen senaryoyu değerlendirdim. Eski önerinin null gelmesi, temizliğin yalnızca ekranda yapılmadığını doğruluyor. Tarih testi de kartın yanlış gün altında görünmemesini denetliyor. Bu sayede önbelleğin geçerliliğini tarih ve kullanıcı tercihleriyle birlikte yönetme konusunda pratik kazandım.</w:t>
+            </w:r>
+          </w:p>
+        </w:tc>
+        <w:tc>
+          <w:tcPr>
+            <w:tcW w:type="dxa" w:w="2778"/>
+            <w:vAlign w:val="top"/>
+          </w:tcPr>
+          <w:tbl>
+            <w:tblPr>
+              <w:tblW w:type="auto" w:w="0"/>
+              <w:jc w:val="center"/>
+              <w:tblLayout w:type="fixed"/>
+              <w:tblLook w:firstColumn="1" w:firstRow="1" w:lastColumn="0" w:lastRow="0" w:noHBand="0" w:noVBand="1" w:val="04A0"/>
+              <w:tblBorders>
+                <w:top w:val="single" w:sz="6" w:color="999999"/>
+                <w:left w:val="single" w:sz="6" w:color="999999"/>
+                <w:bottom w:val="single" w:sz="6" w:color="999999"/>
+                <w:right w:val="single" w:sz="6" w:color="999999"/>
+                <w:insideH w:val="single" w:sz="6" w:color="999999"/>
+                <w:insideV w:val="single" w:sz="6" w:color="999999"/>
+              </w:tblBorders>
+              <w:tblCellMar>
+                <w:top w:w="70" w:type="dxa"/>
+                <w:bottom w:w="70" w:type="dxa"/>
+                <w:left w:w="110" w:type="dxa"/>
+                <w:right w:w="110" w:type="dxa"/>
+              </w:tblCellMar>
+            </w:tblPr>
+            <w:tblGrid>
+              <w:gridCol w:w="2381"/>
+            </w:tblGrid>
+            <w:tr>
+              <w:trPr>
+                <w:trHeight w:val="5443" w:hRule="atLeast"/>
+                <w:cantSplit/>
+              </w:trPr>
+              <w:tc>
+                <w:tcPr>
+                  <w:tcW w:type="dxa" w:w="2381"/>
+                  <w:vAlign w:val="center"/>
+                </w:tcPr>
+                <w:p>
+                  <w:pPr>
+                    <w:spacing w:after="80" w:before="80" w:line="259" w:lineRule="auto"/>
+                    <w:jc w:val="center"/>
+                  </w:pPr>
+                  <w:r/>
+                  <w:r>
+                    <w:rPr>
+                      <w:rFonts w:ascii="Arial" w:hAnsi="Arial"/>
+                      <w:b w:val="0"/>
+                      <w:color w:val="000000"/>
+                      <w:sz w:val="20"/>
+                      <w:lang w:val="tr-TR"/>
+                    </w:rPr>
+                    <w:t>EKRAN GÖRÜNTÜSÜ</w:t>
+                    <w:br/>
+                    <w:t>EKLENECEK</w:t>
+                    <w:br/>
+                    <w:br/>
+                    <w:t>Şekil 11</w:t>
+                    <w:br/>
+                    <w:t>25. gün</w:t>
+                  </w:r>
+                </w:p>
+              </w:tc>
+            </w:tr>
+          </w:tbl>
+          <w:p>
+            <w:pPr>
+              <w:spacing w:line="259" w:lineRule="auto" w:before="100" w:after="0"/>
+              <w:jc w:val="center"/>
+            </w:pPr>
+            <w:r>
+              <w:rPr>
+                <w:rFonts w:ascii="Arial" w:hAnsi="Arial"/>
+                <w:b w:val="0"/>
+                <w:color w:val="000000"/>
+                <w:sz w:val="18"/>
+                <w:lang w:val="tr-TR"/>
+              </w:rPr>
+              <w:t>Şekil 11. Günlük öneri kartı</w:t>
+            </w:r>
+          </w:p>
+        </w:tc>
+      </w:tr>
+    </w:tbl>
     <w:p>
       <w:pPr>
         <w:sectPr>
@@ -4151,43 +5488,163 @@
           <w:sz w:val="24"/>
           <w:lang w:val="tr-TR"/>
         </w:rPr>
-        <w:t>Görüşme ile kalıcı tercih belleğini ayrı tuttum. Ekrandaki konuşma geçmişi oturumluktur ve isteğe en fazla son altı mesaj bağlam olarak aktarılıyor. CoachMemory ise açık kullanıcı ifadelerinden çıkarılan kısa bilgileri saklıyor. Örneğin “Et yemiyorum” ifadesi bir tercih adayı olabilir; yalnızca belirli bir besin hakkında soru sormak, kullanıcının onu tükettiğini veya ona alerjisi olduğunu kanıtlamaz. Bu örneği gerçek kullanıcı bilgisi değil, ayrımın açıklaması olarak kullandım.</w:t>
+        <w:t>Görüşme ile kalıcı tercih belleğini ayrı tuttum. Ekrandaki konuşma geçmişi oturumluktur ve isteğe en fazla son altı mesaj bağlam olarak aktarılıyor. CoachMemory ise açık kullanıcı ifadelerinden çıkarılan kısa bilgileri saklıyor. Örneğin “Et yemiyorum” ifadesi bir tercih adayı olabilir; yalnızca belirli bir besin hakkında soru sormak, kullanıcının onu tükettiğini veya ona alerjisi olduğunu kanıtlamaz. Tercih adaylarını kullanıcının açık ifadeleriyle ilişkilendirmeye dikkat ettim.</w:t>
       </w:r>
     </w:p>
-    <w:p>
-      <w:pPr>
-        <w:widowControl/>
-        <w:spacing w:after="260" w:before="0" w:line="293" w:lineRule="auto"/>
-        <w:jc w:val="both"/>
-      </w:pPr>
-      <w:r>
-        <w:rPr>
-          <w:rFonts w:ascii="Arial" w:hAnsi="Arial"/>
-          <w:b w:val="0"/>
-          <w:color w:val="000000"/>
-          <w:sz w:val="24"/>
-          <w:lang w:val="tr-TR"/>
-        </w:rPr>
-        <w:t>Servisten dönen memoryUpdates alanını profil yönetimine bağladım. Aynı bilginin tekrarlanmasını sınırlayan denetim bulunuyor ve en fazla 30 tercih saklanıyor. Eklenen bilgiler yanıtta gösteriliyor; ayarlardan tek tek silinebiliyor. Silme, sonraki önerilerde gönderilen bağlamı da değiştiriyor. Yalnızca açık ifadeleri kaydetme kuralının model talimatına dayandığını, dilin anlamını kusursuz doğrulayan ayrı bir güvence olmadığını not ettim.</w:t>
-      </w:r>
-    </w:p>
-    <w:p>
-      <w:pPr>
-        <w:widowControl/>
-        <w:spacing w:after="260" w:before="0" w:line="293" w:lineRule="auto"/>
-        <w:jc w:val="both"/>
-      </w:pPr>
-      <w:r>
-        <w:rPr>
-          <w:rFonts w:ascii="Arial" w:hAnsi="Arial"/>
-          <w:b w:val="0"/>
-          <w:color w:val="000000"/>
-          <w:sz w:val="24"/>
-          <w:lang w:val="tr-TR"/>
-        </w:rPr>
-        <w:t>Sesli görüşmede aynı sınırlı kayıt bileşeninden yararlanılıyor, fakat amaç besini günlüğe eklemek değil koça mesaj göndermektir. Geçici dosya işlem sonunda temizleniyor; yanıtta varsa konuşma metni ve cevaplayan model gösteriliyor. Profil testleri saklama ve silme davranışlarını değerlendirmeye yardımcı oluyor. Gün sonunda kişiselleştirmede çok veri toplamanın değil, kullanıcı tarafından ifade edilen yararlı bilgiyi görünür ve yönetilebilir biçimde saklamanın önemli olduğunu öğrendim.</w:t>
-      </w:r>
-    </w:p>
+    <w:tbl>
+      <w:tblPr>
+        <w:tblW w:type="auto" w:w="0"/>
+        <w:jc w:val="center"/>
+        <w:tblLayout w:type="fixed"/>
+        <w:tblLook w:firstColumn="1" w:firstRow="1" w:lastColumn="0" w:lastRow="0" w:noHBand="0" w:noVBand="1" w:val="04A0"/>
+        <w:tblBorders>
+          <w:top w:val="nil"/>
+          <w:left w:val="nil"/>
+          <w:bottom w:val="nil"/>
+          <w:right w:val="nil"/>
+          <w:insideH w:val="nil"/>
+          <w:insideV w:val="nil"/>
+        </w:tblBorders>
+        <w:tblCellMar>
+          <w:top w:w="0" w:type="dxa"/>
+          <w:bottom w:w="0" w:type="dxa"/>
+          <w:left w:w="0" w:type="dxa"/>
+          <w:right w:w="90" w:type="dxa"/>
+        </w:tblCellMar>
+      </w:tblPr>
+      <w:tblGrid>
+        <w:gridCol w:w="7030"/>
+        <w:gridCol w:w="2778"/>
+      </w:tblGrid>
+      <w:tr>
+        <w:trPr>
+          <w:cantSplit/>
+        </w:trPr>
+        <w:tc>
+          <w:tcPr>
+            <w:tcW w:type="dxa" w:w="7030"/>
+            <w:vAlign w:val="top"/>
+          </w:tcPr>
+          <w:p>
+            <w:pPr>
+              <w:widowControl/>
+              <w:spacing w:after="260" w:before="0" w:line="293" w:lineRule="auto"/>
+              <w:jc w:val="both"/>
+            </w:pPr>
+            <w:r>
+              <w:rPr>
+                <w:rFonts w:ascii="Arial" w:hAnsi="Arial"/>
+                <w:b w:val="0"/>
+                <w:color w:val="000000"/>
+                <w:sz w:val="24"/>
+                <w:lang w:val="tr-TR"/>
+              </w:rPr>
+              <w:t>Servisten dönen memoryUpdates alanını profil yönetimine bağladım. Aynı bilginin tekrarlanmasını sınırlayan denetim bulunuyor ve en fazla 30 tercih saklanıyor. Eklenen bilgiler yanıtta gösteriliyor; ayarlardan tek tek silinebiliyor. Silme, sonraki önerilerde gönderilen bağlamı da değiştiriyor. Model talimatında tercih adaylarının açık kullanıcı ifadelerinden çıkarılması isteniyor; uygulama da bu adayları görünür ve silinebilir biçimde sunuyor.</w:t>
+            </w:r>
+          </w:p>
+          <w:p>
+            <w:pPr>
+              <w:widowControl/>
+              <w:spacing w:after="260" w:before="0" w:line="293" w:lineRule="auto"/>
+              <w:jc w:val="both"/>
+            </w:pPr>
+            <w:r>
+              <w:rPr>
+                <w:rFonts w:ascii="Arial" w:hAnsi="Arial"/>
+                <w:b w:val="0"/>
+                <w:color w:val="000000"/>
+                <w:sz w:val="24"/>
+                <w:lang w:val="tr-TR"/>
+              </w:rPr>
+              <w:t>Sesli görüşmede aynı sınırlı kayıt bileşeninden yararlanılıyor, fakat amaç besini günlüğe eklemek değil koça mesaj göndermektir. Geçici dosya işlem sonunda temizleniyor; yanıtta varsa konuşma metni ve cevaplayan model gösteriliyor. Profil testleri saklama ve silme davranışlarını değerlendirmeye yardımcı oluyor. Bu çalışma, görüşme bağlamı ile kalıcı tercihi ayırma ve kullanıcıya saklanan bilgi üzerinde kontrol sağlama becerimi geliştirdi.</w:t>
+            </w:r>
+          </w:p>
+        </w:tc>
+        <w:tc>
+          <w:tcPr>
+            <w:tcW w:type="dxa" w:w="2778"/>
+            <w:vAlign w:val="top"/>
+          </w:tcPr>
+          <w:tbl>
+            <w:tblPr>
+              <w:tblW w:type="auto" w:w="0"/>
+              <w:jc w:val="center"/>
+              <w:tblLayout w:type="fixed"/>
+              <w:tblLook w:firstColumn="1" w:firstRow="1" w:lastColumn="0" w:lastRow="0" w:noHBand="0" w:noVBand="1" w:val="04A0"/>
+              <w:tblBorders>
+                <w:top w:val="single" w:sz="6" w:color="999999"/>
+                <w:left w:val="single" w:sz="6" w:color="999999"/>
+                <w:bottom w:val="single" w:sz="6" w:color="999999"/>
+                <w:right w:val="single" w:sz="6" w:color="999999"/>
+                <w:insideH w:val="single" w:sz="6" w:color="999999"/>
+                <w:insideV w:val="single" w:sz="6" w:color="999999"/>
+              </w:tblBorders>
+              <w:tblCellMar>
+                <w:top w:w="70" w:type="dxa"/>
+                <w:bottom w:w="70" w:type="dxa"/>
+                <w:left w:w="110" w:type="dxa"/>
+                <w:right w:w="110" w:type="dxa"/>
+              </w:tblCellMar>
+            </w:tblPr>
+            <w:tblGrid>
+              <w:gridCol w:w="2381"/>
+            </w:tblGrid>
+            <w:tr>
+              <w:trPr>
+                <w:trHeight w:val="5443" w:hRule="atLeast"/>
+                <w:cantSplit/>
+              </w:trPr>
+              <w:tc>
+                <w:tcPr>
+                  <w:tcW w:type="dxa" w:w="2381"/>
+                  <w:vAlign w:val="center"/>
+                </w:tcPr>
+                <w:p>
+                  <w:pPr>
+                    <w:spacing w:after="80" w:before="80" w:line="259" w:lineRule="auto"/>
+                    <w:jc w:val="center"/>
+                  </w:pPr>
+                  <w:r/>
+                  <w:r>
+                    <w:rPr>
+                      <w:rFonts w:ascii="Arial" w:hAnsi="Arial"/>
+                      <w:b w:val="0"/>
+                      <w:color w:val="000000"/>
+                      <w:sz w:val="20"/>
+                      <w:lang w:val="tr-TR"/>
+                    </w:rPr>
+                    <w:t>EKRAN GÖRÜNTÜSÜ</w:t>
+                    <w:br/>
+                    <w:t>EKLENECEK</w:t>
+                    <w:br/>
+                    <w:br/>
+                    <w:t>Şekil 12</w:t>
+                    <w:br/>
+                    <w:t>26. gün</w:t>
+                  </w:r>
+                </w:p>
+              </w:tc>
+            </w:tr>
+          </w:tbl>
+          <w:p>
+            <w:pPr>
+              <w:spacing w:line="259" w:lineRule="auto" w:before="100" w:after="0"/>
+              <w:jc w:val="center"/>
+            </w:pPr>
+            <w:r>
+              <w:rPr>
+                <w:rFonts w:ascii="Arial" w:hAnsi="Arial"/>
+                <w:b w:val="0"/>
+                <w:color w:val="000000"/>
+                <w:sz w:val="18"/>
+                <w:lang w:val="tr-TR"/>
+              </w:rPr>
+              <w:t>Şekil 12. Koç görüşmesi ve kayıtlı tercih</w:t>
+            </w:r>
+          </w:p>
+        </w:tc>
+      </w:tr>
+    </w:tbl>
     <w:p>
       <w:pPr>
         <w:sectPr>
@@ -4258,40 +5715,160 @@
         <w:t>Oracle'ı yalnızca kullanıcı ilgili sekmeyi açtığında yükleyen davranışı kullandım. Uygulama açılır açılmaz görünmeyen bu ekran için çağrı yapmak, günlük öneri veya sesli kayıtla aynı istek sırasını gereksiz doldurabiliyordu. İçerik değişikliklerini izleyip görünür ekran açıldığında yenileme yapılmasını sağladım. İstek başlangıcındaki bağlam değişmişse eski yanıtın güncel öneri gibi kullanılmaması için durum denetimlerini takip ettim.</w:t>
       </w:r>
     </w:p>
-    <w:p>
-      <w:pPr>
-        <w:widowControl/>
-        <w:spacing w:after="260" w:before="0" w:line="293" w:lineRule="auto"/>
-        <w:jc w:val="both"/>
-      </w:pPr>
-      <w:r>
-        <w:rPr>
-          <w:rFonts w:ascii="Arial" w:hAnsi="Arial"/>
-          <w:b w:val="0"/>
-          <w:color w:val="000000"/>
-          <w:sz w:val="24"/>
-          <w:lang w:val="tr-TR"/>
-        </w:rPr>
-        <w:t>Önerideki eylem bir besin kimliği veya modelin uydurduğu besin değerleri yerine, İngilizce Core arama sorgusu taşıyor. Kullanıcı eyleme dokununca bu sorguyla FoodSearchScreen açılıyor; gerçek besin ayrıntısı yükleniyor ve porsiyon seçiliyor. Bu bağlantı, öneri üretme ile besin doğrulamasını birbirinden ayırıyor. Model önerisinin makul görünmesi, veri kaynağında doğru ürüne karşılık geldiğini tek başına kanıtlamaz.</w:t>
-      </w:r>
-    </w:p>
-    <w:p>
-      <w:pPr>
-        <w:widowControl/>
-        <w:spacing w:after="260" w:before="0" w:line="293" w:lineRule="auto"/>
-        <w:jc w:val="both"/>
-      </w:pPr>
-      <w:r>
-        <w:rPr>
-          <w:rFonts w:ascii="Arial" w:hAnsi="Arial"/>
-          <w:b w:val="0"/>
-          <w:color w:val="000000"/>
-          <w:sz w:val="24"/>
-          <w:lang w:val="tr-TR"/>
-        </w:rPr>
-        <w:t>Testlerde Oracle'ın görünmeden istek başlatmaması ve kota hatasını bağlantı kesintisinden ayırması ele alınıyor. Bu özellik için matematiksel olarak en iyi beslenmeyi hesapladığı iddiasında bulunmadım; mevcut yapı bağlama dayalı besin fikirleri sunuyor. Alerji ve özel kısıtların doğrulanması da yalnızca öneri metnine bırakılamaz. Gün sonunda yapay zekâ özelliğini kullanılabilir kılan şeyin sadece cevap üretmek olmadığını gördüm; cevabın kontrollü bir kullanıcı işlemine ve doğrulanmış veri kaynağına bağlanması gerekiyor.</w:t>
-      </w:r>
-    </w:p>
+    <w:tbl>
+      <w:tblPr>
+        <w:tblW w:type="auto" w:w="0"/>
+        <w:jc w:val="center"/>
+        <w:tblLayout w:type="fixed"/>
+        <w:tblLook w:firstColumn="1" w:firstRow="1" w:lastColumn="0" w:lastRow="0" w:noHBand="0" w:noVBand="1" w:val="04A0"/>
+        <w:tblBorders>
+          <w:top w:val="nil"/>
+          <w:left w:val="nil"/>
+          <w:bottom w:val="nil"/>
+          <w:right w:val="nil"/>
+          <w:insideH w:val="nil"/>
+          <w:insideV w:val="nil"/>
+        </w:tblBorders>
+        <w:tblCellMar>
+          <w:top w:w="0" w:type="dxa"/>
+          <w:bottom w:w="0" w:type="dxa"/>
+          <w:left w:w="0" w:type="dxa"/>
+          <w:right w:w="90" w:type="dxa"/>
+        </w:tblCellMar>
+      </w:tblPr>
+      <w:tblGrid>
+        <w:gridCol w:w="7030"/>
+        <w:gridCol w:w="2778"/>
+      </w:tblGrid>
+      <w:tr>
+        <w:trPr>
+          <w:cantSplit/>
+        </w:trPr>
+        <w:tc>
+          <w:tcPr>
+            <w:tcW w:type="dxa" w:w="7030"/>
+            <w:vAlign w:val="top"/>
+          </w:tcPr>
+          <w:p>
+            <w:pPr>
+              <w:widowControl/>
+              <w:spacing w:after="260" w:before="0" w:line="293" w:lineRule="auto"/>
+              <w:jc w:val="both"/>
+            </w:pPr>
+            <w:r>
+              <w:rPr>
+                <w:rFonts w:ascii="Arial" w:hAnsi="Arial"/>
+                <w:b w:val="0"/>
+                <w:color w:val="000000"/>
+                <w:sz w:val="24"/>
+                <w:lang w:val="tr-TR"/>
+              </w:rPr>
+              <w:t>Önerideki eylem bir besin kimliği veya modelin uydurduğu besin değerleri yerine, İngilizce Core arama sorgusu taşıyor. Kullanıcı eyleme dokununca bu sorguyla FoodSearchScreen açılıyor; gerçek besin ayrıntısı yükleniyor ve porsiyon seçiliyor. Bu bağlantı, öneri üretme ile besin doğrulamasını birbirinden ayırıyor. Model önerisinin makul görünmesi, veri kaynağında doğru ürüne karşılık geldiğini tek başına kanıtlamaz.</w:t>
+            </w:r>
+          </w:p>
+          <w:p>
+            <w:pPr>
+              <w:widowControl/>
+              <w:spacing w:after="260" w:before="0" w:line="293" w:lineRule="auto"/>
+              <w:jc w:val="both"/>
+            </w:pPr>
+            <w:r>
+              <w:rPr>
+                <w:rFonts w:ascii="Arial" w:hAnsi="Arial"/>
+                <w:b w:val="0"/>
+                <w:color w:val="000000"/>
+                <w:sz w:val="24"/>
+                <w:lang w:val="tr-TR"/>
+              </w:rPr>
+              <w:t>Testlerde Oracle'ın görünmeden istek başlatmaması ve kota hatasını bağlantı kesintisinden ayırması ele alınıyor. Oracle'ın bağlama dayalı besin fikirlerini arama ve porsiyon seçimine bağlayarak öneriden kayda uzanan akışı oluşturdum. Bu sayede model yanıtlarını uygulamanın doğrulanmış besin verisiyle birlikte kullanma konusunda deneyim kazandım.</w:t>
+            </w:r>
+          </w:p>
+        </w:tc>
+        <w:tc>
+          <w:tcPr>
+            <w:tcW w:type="dxa" w:w="2778"/>
+            <w:vAlign w:val="top"/>
+          </w:tcPr>
+          <w:tbl>
+            <w:tblPr>
+              <w:tblW w:type="auto" w:w="0"/>
+              <w:jc w:val="center"/>
+              <w:tblLayout w:type="fixed"/>
+              <w:tblLook w:firstColumn="1" w:firstRow="1" w:lastColumn="0" w:lastRow="0" w:noHBand="0" w:noVBand="1" w:val="04A0"/>
+              <w:tblBorders>
+                <w:top w:val="single" w:sz="6" w:color="999999"/>
+                <w:left w:val="single" w:sz="6" w:color="999999"/>
+                <w:bottom w:val="single" w:sz="6" w:color="999999"/>
+                <w:right w:val="single" w:sz="6" w:color="999999"/>
+                <w:insideH w:val="single" w:sz="6" w:color="999999"/>
+                <w:insideV w:val="single" w:sz="6" w:color="999999"/>
+              </w:tblBorders>
+              <w:tblCellMar>
+                <w:top w:w="70" w:type="dxa"/>
+                <w:bottom w:w="70" w:type="dxa"/>
+                <w:left w:w="110" w:type="dxa"/>
+                <w:right w:w="110" w:type="dxa"/>
+              </w:tblCellMar>
+            </w:tblPr>
+            <w:tblGrid>
+              <w:gridCol w:w="2381"/>
+            </w:tblGrid>
+            <w:tr>
+              <w:trPr>
+                <w:trHeight w:val="5443" w:hRule="atLeast"/>
+                <w:cantSplit/>
+              </w:trPr>
+              <w:tc>
+                <w:tcPr>
+                  <w:tcW w:type="dxa" w:w="2381"/>
+                  <w:vAlign w:val="center"/>
+                </w:tcPr>
+                <w:p>
+                  <w:pPr>
+                    <w:spacing w:after="80" w:before="80" w:line="259" w:lineRule="auto"/>
+                    <w:jc w:val="center"/>
+                  </w:pPr>
+                  <w:r/>
+                  <w:r>
+                    <w:rPr>
+                      <w:rFonts w:ascii="Arial" w:hAnsi="Arial"/>
+                      <w:b w:val="0"/>
+                      <w:color w:val="000000"/>
+                      <w:sz w:val="20"/>
+                      <w:lang w:val="tr-TR"/>
+                    </w:rPr>
+                    <w:t>EKRAN GÖRÜNTÜSÜ</w:t>
+                    <w:br/>
+                    <w:t>EKLENECEK</w:t>
+                    <w:br/>
+                    <w:br/>
+                    <w:t>Şekil 13</w:t>
+                    <w:br/>
+                    <w:t>27. gün</w:t>
+                  </w:r>
+                </w:p>
+              </w:tc>
+            </w:tr>
+          </w:tbl>
+          <w:p>
+            <w:pPr>
+              <w:spacing w:line="259" w:lineRule="auto" w:before="100" w:after="0"/>
+              <w:jc w:val="center"/>
+            </w:pPr>
+            <w:r>
+              <w:rPr>
+                <w:rFonts w:ascii="Arial" w:hAnsi="Arial"/>
+                <w:b w:val="0"/>
+                <w:color w:val="000000"/>
+                <w:sz w:val="18"/>
+                <w:lang w:val="tr-TR"/>
+              </w:rPr>
+              <w:t>Şekil 13. Oracle önerisi ve arama eylemi</w:t>
+            </w:r>
+          </w:p>
+        </w:tc>
+      </w:tr>
+    </w:tbl>
     <w:p>
       <w:pPr>
         <w:sectPr>
@@ -4362,40 +5939,160 @@
         <w:t>Koç açıklamasında hangi günlük özetinin ve tercihlerin hizmete gönderildiğini, kullanılan sağlayıcıya ilişkin veri işleme bilgisini görünür tuttum. Açıklama kapsamı değiştiğinde eski onayın otomatik geçerli sayılmaması için sürüm bilgisini kullandım. Regresyon testinde yalnızca eski coach_enabled alanına sahip profilin yeniden onay gerektirmesi denetleniyor. Kullanıcının ayarlardan koçu kapatabilmesi ve saklanan bilgileri silebilmesi, açıklamanın yanında gerçek kontrol de sunuyor.</w:t>
       </w:r>
     </w:p>
-    <w:p>
-      <w:pPr>
-        <w:widowControl/>
-        <w:spacing w:after="260" w:before="0" w:line="293" w:lineRule="auto"/>
-        <w:jc w:val="both"/>
-      </w:pPr>
-      <w:r>
-        <w:rPr>
-          <w:rFonts w:ascii="Arial" w:hAnsi="Arial"/>
-          <w:b w:val="0"/>
-          <w:color w:val="000000"/>
-          <w:sz w:val="24"/>
-          <w:lang w:val="tr-TR"/>
-        </w:rPr>
-        <w:t>Ayarlar ekranında servis durumu satırı görünür alanın altında kaldığında oluşabilen hatayı ele aldım. İstek başlamış olsa da ListView içindeki FutureBuilder henüz oluşturulmamış olabilir. İstek o anda başarısız olursa hatayı dinleyen bileşen bulunmayabilir. _checkCoreHealth içinde request.ignore() ile hatanın baştan ele alınmasını sağladım; aynı özgün Future döndürüldüğü için satır görünür olduğunda başarısız durum yine gösteriliyor. Bu yöntem hatayı kullanıcıdan saklamak değil, erken gelen hatanın yakalanmadan kalmasını önlemektir.</w:t>
-      </w:r>
-    </w:p>
-    <w:p>
-      <w:pPr>
-        <w:widowControl/>
-        <w:spacing w:after="260" w:before="0" w:line="293" w:lineRule="auto"/>
-        <w:jc w:val="both"/>
-      </w:pPr>
-      <w:r>
-        <w:rPr>
-          <w:rFonts w:ascii="Arial" w:hAnsi="Arial"/>
-          <w:b w:val="0"/>
-          <w:color w:val="000000"/>
-          <w:sz w:val="24"/>
-          <w:lang w:val="tr-TR"/>
-        </w:rPr>
-        <w:t>Testte çevrimdışı servis nesnesiyle ayarlar açılıyor; önce yakalanmamış hata oluşmadığı, ardından aşağı kaydırınca Unavailable yazısının göründüğü kontrol ediliyor. İsteğe bağlı geri bildirim ve eski onayın yenilenmesi de ayrı senaryolardır. Bu çalışma, ekrandaki bir satırın henüz çizilmemiş olmasının ağ isteği açısından önemli olabileceğini gösterdi. Kullanıcının neye izin verdiğini açıklarken, görünmeyen bileşenlere ait asenkron işlemlerin de uygulamanın geri kalanını etkilememesine dikkat etmeyi öğrendim.</w:t>
-      </w:r>
-    </w:p>
+    <w:tbl>
+      <w:tblPr>
+        <w:tblW w:type="auto" w:w="0"/>
+        <w:jc w:val="center"/>
+        <w:tblLayout w:type="fixed"/>
+        <w:tblLook w:firstColumn="1" w:firstRow="1" w:lastColumn="0" w:lastRow="0" w:noHBand="0" w:noVBand="1" w:val="04A0"/>
+        <w:tblBorders>
+          <w:top w:val="nil"/>
+          <w:left w:val="nil"/>
+          <w:bottom w:val="nil"/>
+          <w:right w:val="nil"/>
+          <w:insideH w:val="nil"/>
+          <w:insideV w:val="nil"/>
+        </w:tblBorders>
+        <w:tblCellMar>
+          <w:top w:w="0" w:type="dxa"/>
+          <w:bottom w:w="0" w:type="dxa"/>
+          <w:left w:w="0" w:type="dxa"/>
+          <w:right w:w="90" w:type="dxa"/>
+        </w:tblCellMar>
+      </w:tblPr>
+      <w:tblGrid>
+        <w:gridCol w:w="7030"/>
+        <w:gridCol w:w="2778"/>
+      </w:tblGrid>
+      <w:tr>
+        <w:trPr>
+          <w:cantSplit/>
+        </w:trPr>
+        <w:tc>
+          <w:tcPr>
+            <w:tcW w:type="dxa" w:w="7030"/>
+            <w:vAlign w:val="top"/>
+          </w:tcPr>
+          <w:p>
+            <w:pPr>
+              <w:widowControl/>
+              <w:spacing w:after="260" w:before="0" w:line="293" w:lineRule="auto"/>
+              <w:jc w:val="both"/>
+            </w:pPr>
+            <w:r>
+              <w:rPr>
+                <w:rFonts w:ascii="Arial" w:hAnsi="Arial"/>
+                <w:b w:val="0"/>
+                <w:color w:val="000000"/>
+                <w:sz w:val="24"/>
+                <w:lang w:val="tr-TR"/>
+              </w:rPr>
+              <w:t>Ayarlar ekranında servis durumu satırı görünür alanın altında kaldığında oluşabilen hatayı ele aldım. İstek başlamış olsa da ListView içindeki FutureBuilder henüz oluşturulmamış olabilir. İstek o anda başarısız olursa hatayı dinleyen bileşen bulunmayabilir. _checkCoreHealth içinde request.ignore() ile hatanın baştan ele alınmasını sağladım; aynı özgün Future döndürüldüğü için satır görünür olduğunda başarısız durum yine gösteriliyor. Bu yöntem hatayı kullanıcıdan saklamak değil, erken gelen hatanın yakalanmadan kalmasını önlemektir.</w:t>
+            </w:r>
+          </w:p>
+          <w:p>
+            <w:pPr>
+              <w:widowControl/>
+              <w:spacing w:after="260" w:before="0" w:line="293" w:lineRule="auto"/>
+              <w:jc w:val="both"/>
+            </w:pPr>
+            <w:r>
+              <w:rPr>
+                <w:rFonts w:ascii="Arial" w:hAnsi="Arial"/>
+                <w:b w:val="0"/>
+                <w:color w:val="000000"/>
+                <w:sz w:val="24"/>
+                <w:lang w:val="tr-TR"/>
+              </w:rPr>
+              <w:t>Testte çevrimdışı servis nesnesiyle ayarlar açılıyor; önce yakalanmamış hata oluşmadığı, ardından aşağı kaydırınca Unavailable yazısının göründüğü kontrol ediliyor. İsteğe bağlı geri bildirim ve eski onayın yenilenmesi de ayrı senaryolardır. Bu çalışma, ekrandaki bir satırın henüz çizilmemiş olmasının ağ isteği açısından önemli olabileceğini gösterdi. Kullanıcının neye izin verdiğini açıklarken, görünmeyen bileşenlere ait asenkron işlemlerin de uygulamanın geri kalanını etkilememesine dikkat etmeyi öğrendim.</w:t>
+            </w:r>
+          </w:p>
+        </w:tc>
+        <w:tc>
+          <w:tcPr>
+            <w:tcW w:type="dxa" w:w="2778"/>
+            <w:vAlign w:val="top"/>
+          </w:tcPr>
+          <w:tbl>
+            <w:tblPr>
+              <w:tblW w:type="auto" w:w="0"/>
+              <w:jc w:val="center"/>
+              <w:tblLayout w:type="fixed"/>
+              <w:tblLook w:firstColumn="1" w:firstRow="1" w:lastColumn="0" w:lastRow="0" w:noHBand="0" w:noVBand="1" w:val="04A0"/>
+              <w:tblBorders>
+                <w:top w:val="single" w:sz="6" w:color="999999"/>
+                <w:left w:val="single" w:sz="6" w:color="999999"/>
+                <w:bottom w:val="single" w:sz="6" w:color="999999"/>
+                <w:right w:val="single" w:sz="6" w:color="999999"/>
+                <w:insideH w:val="single" w:sz="6" w:color="999999"/>
+                <w:insideV w:val="single" w:sz="6" w:color="999999"/>
+              </w:tblBorders>
+              <w:tblCellMar>
+                <w:top w:w="70" w:type="dxa"/>
+                <w:bottom w:w="70" w:type="dxa"/>
+                <w:left w:w="110" w:type="dxa"/>
+                <w:right w:w="110" w:type="dxa"/>
+              </w:tblCellMar>
+            </w:tblPr>
+            <w:tblGrid>
+              <w:gridCol w:w="2381"/>
+            </w:tblGrid>
+            <w:tr>
+              <w:trPr>
+                <w:trHeight w:val="5443" w:hRule="atLeast"/>
+                <w:cantSplit/>
+              </w:trPr>
+              <w:tc>
+                <w:tcPr>
+                  <w:tcW w:type="dxa" w:w="2381"/>
+                  <w:vAlign w:val="center"/>
+                </w:tcPr>
+                <w:p>
+                  <w:pPr>
+                    <w:spacing w:after="80" w:before="80" w:line="259" w:lineRule="auto"/>
+                    <w:jc w:val="center"/>
+                  </w:pPr>
+                  <w:r/>
+                  <w:r>
+                    <w:rPr>
+                      <w:rFonts w:ascii="Arial" w:hAnsi="Arial"/>
+                      <w:b w:val="0"/>
+                      <w:color w:val="000000"/>
+                      <w:sz w:val="20"/>
+                      <w:lang w:val="tr-TR"/>
+                    </w:rPr>
+                    <w:t>EKRAN GÖRÜNTÜSÜ</w:t>
+                    <w:br/>
+                    <w:t>EKLENECEK</w:t>
+                    <w:br/>
+                    <w:br/>
+                    <w:t>Şekil 14</w:t>
+                    <w:br/>
+                    <w:t>28. gün</w:t>
+                  </w:r>
+                </w:p>
+              </w:tc>
+            </w:tr>
+          </w:tbl>
+          <w:p>
+            <w:pPr>
+              <w:spacing w:line="259" w:lineRule="auto" w:before="100" w:after="0"/>
+              <w:jc w:val="center"/>
+            </w:pPr>
+            <w:r>
+              <w:rPr>
+                <w:rFonts w:ascii="Arial" w:hAnsi="Arial"/>
+                <w:b w:val="0"/>
+                <w:color w:val="000000"/>
+                <w:sz w:val="18"/>
+                <w:lang w:val="tr-TR"/>
+              </w:rPr>
+              <w:t>Şekil 14. Koç ve geri bildirim tercihleri</w:t>
+            </w:r>
+          </w:p>
+        </w:tc>
+      </w:tr>
+    </w:tbl>
     <w:p>
       <w:pPr>
         <w:sectPr>
@@ -4497,7 +6194,85 @@
           <w:sz w:val="24"/>
           <w:lang w:val="tr-TR"/>
         </w:rPr>
-        <w:t>Doğrulama kaydında 14 Eylül 2026 tarihinde flutter analyze --no-pub temiz sonuç verdi; flutter test --no-pub --reporter expanded ile 44 Flutter testi geçti. Bu sonuçları bütün telefonlarda veya her konuşmada kusursuz çalışma garantisi olarak yorumlamadım. Gerçek mikrofon gürültüsü, başlatıcı davranışı ve sağlayıcı sürekliliği ayrı denemeler gerektiriyor. Gün sonunda test yazmanın yalnızca son aşama olmadığını öğrendim: beklenen davranışı açıkça tanımlamak, uygulamadaki tasarım kararlarını da daha anlaşılır hâle getiriyor.</w:t>
+        <w:t>Son olarak doğrulama çıktısını değerlendirdim: flutter analyze --no-pub temiz sonuç verdi ve flutter test --no-pub --reporter expanded ile 44 Flutter testi geçti. Sonuçları hesaplama, veri saklama ve ekran etkileşimi senaryolarıyla ilişkilendirdim. Testlerin beklenen davranışı açık biçimde tanımlaması, düzeltmelerin etkisini göstermemi ve uygulama kararlarını teknik olarak açıklamamı kolaylaştırdı.</w:t>
+      </w:r>
+    </w:p>
+    <w:tbl>
+      <w:tblPr>
+        <w:tblW w:type="auto" w:w="0"/>
+        <w:jc w:val="center"/>
+        <w:tblLayout w:type="fixed"/>
+        <w:tblLook w:firstColumn="1" w:firstRow="1" w:lastColumn="0" w:lastRow="0" w:noHBand="0" w:noVBand="1" w:val="04A0"/>
+        <w:tblBorders>
+          <w:top w:val="single" w:sz="6" w:color="999999"/>
+          <w:left w:val="single" w:sz="6" w:color="999999"/>
+          <w:bottom w:val="single" w:sz="6" w:color="999999"/>
+          <w:right w:val="single" w:sz="6" w:color="999999"/>
+          <w:insideH w:val="single" w:sz="6" w:color="999999"/>
+          <w:insideV w:val="single" w:sz="6" w:color="999999"/>
+        </w:tblBorders>
+        <w:tblCellMar>
+          <w:top w:w="70" w:type="dxa"/>
+          <w:bottom w:w="70" w:type="dxa"/>
+          <w:left w:w="110" w:type="dxa"/>
+          <w:right w:w="110" w:type="dxa"/>
+        </w:tblCellMar>
+      </w:tblPr>
+      <w:tblGrid>
+        <w:gridCol w:w="9808"/>
+      </w:tblGrid>
+      <w:tr>
+        <w:trPr>
+          <w:trHeight w:val="2154" w:hRule="atLeast"/>
+          <w:cantSplit/>
+        </w:trPr>
+        <w:tc>
+          <w:tcPr>
+            <w:tcW w:type="dxa" w:w="9808"/>
+            <w:vAlign w:val="center"/>
+          </w:tcPr>
+          <w:p>
+            <w:pPr>
+              <w:spacing w:after="80" w:before="80" w:line="259" w:lineRule="auto"/>
+              <w:jc w:val="center"/>
+            </w:pPr>
+            <w:r/>
+            <w:r>
+              <w:rPr>
+                <w:rFonts w:ascii="Arial" w:hAnsi="Arial"/>
+                <w:b w:val="0"/>
+                <w:color w:val="000000"/>
+                <w:sz w:val="20"/>
+                <w:lang w:val="tr-TR"/>
+              </w:rPr>
+              <w:t>EKRAN GÖRÜNTÜSÜ</w:t>
+              <w:br/>
+              <w:t>EKLENECEK</w:t>
+              <w:br/>
+              <w:br/>
+              <w:t>Şekil 15</w:t>
+              <w:br/>
+              <w:t>29. gün</w:t>
+            </w:r>
+          </w:p>
+        </w:tc>
+      </w:tr>
+    </w:tbl>
+    <w:p>
+      <w:pPr>
+        <w:widowControl/>
+        <w:spacing w:after="0" w:before="0" w:line="293" w:lineRule="auto"/>
+        <w:jc w:val="center"/>
+      </w:pPr>
+      <w:r>
+        <w:rPr>
+          <w:rFonts w:ascii="Arial" w:hAnsi="Arial"/>
+          <w:b w:val="0"/>
+          <w:color w:val="000000"/>
+          <w:sz w:val="18"/>
+          <w:lang w:val="tr-TR"/>
+        </w:rPr>
+        <w:t>Şekil 15. Statik analiz ve test sonuçları</w:t>
       </w:r>
     </w:p>
     <w:p>
@@ -4550,7 +6325,7 @@
           <w:sz w:val="24"/>
           <w:lang w:val="tr-TR"/>
         </w:rPr>
-        <w:t>Bugün çalışmanın Android paketleme ve teslim tarafını ele aldım. pubspec.yaml içindeki 1.1.2+5 bilgisinde kullanıcıya gösterilen sürümle derleme numarasını ayırdım. flutter build apk --release komutu kurulum paketini üretir; uygulamaya ait herkese açık kimlik doğrulama yapılandırması derleme sırasında verilir. Gizli sunucu anahtarlarının pakete eklenmemesi gerekiyor. APK'nın üretilmesiyle mağazada yayımlanmasının farklı aşamalar olduğunu da not ettim.</w:t>
+        <w:t>Son çalışma gününde Android paketleme ve teslim sürecini toparladım. pubspec.yaml içindeki 1.1.2+5 bilgisinde kullanıcıya gösterilen sürümle derleme numarasını ayırdım. flutter build apk --release komutu kurulum paketini üretir; uygulamaya ait herkese açık kimlik doğrulama yapılandırması derleme sırasında verilir. Gizli sunucu anahtarlarının pakete eklenmemesi gerekiyor. Derleme ayarları, sürüm bilgisi ve kurulum çıktısı arasındaki ilişkiyi takip ettim.</w:t>
       </w:r>
     </w:p>
     <w:p>
@@ -4567,7 +6342,7 @@
           <w:sz w:val="24"/>
           <w:lang w:val="tr-TR"/>
         </w:rPr>
-        <w:t>Paket çıktısının build/app/outputs/flutter-apk/app-release.apk altında oluştuğunu ve güncellemede adb install -r komutunun mevcut uygulamanın üzerine kurulum için kullanıldığını inceledim. 5 Eylül denetim kaydı bu sürümün kurulum ve cihaz kontrollerini içeriyor; belge hazırlanırken yeni telefon kurulumu yapılmadı. Mevcut beta yerel debug imzasıyla hazırlanıyor. Mağaza dağıtımı için ayrı yayın anahtarı ve dağıtım hazırlığı gerektiğini ayırdım.</w:t>
+        <w:t>Paket çıktısının build/app/outputs/flutter-apk/app-release.apk altında oluştuğunu ve güncellemede adb install -r komutunun mevcut uygulamanın üzerine kurulum için kullanıldığını inceledim. Sürümün kurulum ve cihaz kontrol kayıtlarını paketleme adımlarıyla birlikte değerlendirdim. Android'in uygulama kimliği ve imza üzerinden güncellemeyi tanıması, kurulum sürekliliğini anlamamı sağladı.</w:t>
       </w:r>
     </w:p>
     <w:p>
@@ -4584,7 +6359,7 @@
           <w:sz w:val="24"/>
           <w:lang w:val="tr-TR"/>
         </w:rPr>
-        <w:t>Teslim akışını uygulamanın günlük kullanım sırasına göre toparladım: besin arama, porsiyon seçme, kaydı düzenleme, günlük toplamı görme, sesli kayıt ve araç takımıyla hızlı giriş. Ardından hedef ve diyet seçimiyle günlük öneri, koç görüşmesi ve Oracle bağlantısını ilişkilendirdim. README kullanım ve doğrulama komutlarını, davranış belgesi mimariyi, denetim kaydı test sonuçlarını, BACKLOG ise tamamlanmamış işleri açıklıyor. Böylece sonraki kişi yalnızca kurulum dosyasına bağımlı kalmıyor.</w:t>
+        <w:t>Teslim akışını uygulamanın günlük kullanım sırasına göre toparladım: besin arama, porsiyon seçme, kaydı düzenleme, günlük toplamı görme, sesli kayıt ve araç takımıyla hızlı giriş. Ardından hedef ve diyet seçimiyle günlük öneri, koç görüşmesi ve Oracle bağlantısını ilişkilendirdim.</w:t>
       </w:r>
     </w:p>
     <w:p>
@@ -4601,7 +6376,24 @@
           <w:sz w:val="24"/>
           <w:lang w:val="tr-TR"/>
         </w:rPr>
-        <w:t>Genel değerlendirmede yerel yedekleme, yarım kalan ses işlerinin kalıcı kuyruğu, daha kapsamlı cihaz denemeleri ve kaynak verisiyle puanlanan Oracle gibi geliştirme alanlarını belirttim. Bunları bitmiş özellikler gibi sunmadım. Bu çalışma boyunca arayüz, API, cihaz özellikleri, hesaplama ve testlerin birbirine bağlı olduğunu öğrendim. En önemli kazanımım, bir özelliği yalnızca çalışır göstermekle yetinmeyip hangi veriyle, hangi koşulda ve hata olduğunda nasıl davrandığını açıklayabilecek bir geliştirme yaklaşımı edinmek oldu.</w:t>
+        <w:t>README kullanım ve doğrulama komutlarını, davranış belgesi mimariyi, denetim kaydı test sonuçlarını, BACKLOG ise tamamlanmamış işleri açıklıyor. Böylece sonraki kişi yalnızca kurulum dosyasına bağımlı kalmıyor.</w:t>
+      </w:r>
+    </w:p>
+    <w:p>
+      <w:pPr>
+        <w:widowControl/>
+        <w:spacing w:after="260" w:before="0" w:line="293" w:lineRule="auto"/>
+        <w:jc w:val="both"/>
+      </w:pPr>
+      <w:r>
+        <w:rPr>
+          <w:rFonts w:ascii="Arial" w:hAnsi="Arial"/>
+          <w:b w:val="0"/>
+          <w:color w:val="000000"/>
+          <w:sz w:val="24"/>
+          <w:lang w:val="tr-TR"/>
+        </w:rPr>
+        <w:t>Genel değerlendirmede besin günlüğü, miktar hesaplamaları, sesli kayıt, Android araç takımı ve kişiselleştirilmiş önerilerin ortak veri yapısı üzerinde bir araya geldiğini gördüm. Bu çalışma boyunca arayüz, API, cihaz özellikleri, hesaplama ve testlerin birbirine bağlı olduğunu öğrendim. En önemli kazanımım, bir özelliği yalnızca çalışır göstermekle yetinmeyip hangi veriyle, hangi koşulda ve hata olduğunda nasıl davrandığını açıklayabilecek bir geliştirme yaklaşımı edinmek oldu.</w:t>
       </w:r>
     </w:p>
     <w:sectPr>

</xml_diff>